<commit_message>
docs: add Shopify guide chapter 2 draft
Co-Authored-By: Claude Opus 4.8 <noreply@anthropic.com>
</commit_message>
<xml_diff>
--- a/docs/guides/shopify/Build-Your-First-Shopify-Store-DRAFT.docx
+++ b/docs/guides/shopify/Build-Your-First-Shopify-Store-DRAFT.docx
@@ -1116,7 +1116,7 @@
           <w:iCs/>
           <w:color w:val="9A6A00"/>
         </w:rPr>
-        <w:t xml:space="preserve">Draft status: This file contains the polished table of contents, all front matter, Chapter 1, and the Chapter 1 worksheet. Chapters 2–12 and the remaining worksheets are pending approval to continue.</w:t>
+        <w:t xml:space="preserve">Draft status: This file contains the polished table of contents, all front matter, Chapters 1–2, and their worksheets. Chapters 3–12 and the remaining worksheets are pending approval to continue.</w:t>
       </w:r>
     </w:p>
     <w:p>
@@ -2346,15 +2346,7 @@
         <w:spacing w:after="160" w:before="240"/>
       </w:pPr>
       <w:r>
-        <w:t xml:space="preserve">Internal Reviewer Note (remove before publishing)</w:t>
-      </w:r>
-    </w:p>
-    <w:p>
-      <w:pPr>
-        <w:spacing w:after="140" w:line="276"/>
-      </w:pPr>
-      <w:r>
-        <w:t xml:space="preserve">This note lists what the draft assumes and what it still needs. It is for the internal review process, not for the buyer.</w:t>
+        <w:t xml:space="preserve">Chapter 2 — Define the Customer and Offer</w:t>
       </w:r>
     </w:p>
     <w:p>
@@ -2363,59 +2355,23 @@
         <w:spacing w:after="100" w:before="200"/>
       </w:pPr>
       <w:r>
-        <w:t xml:space="preserve">Assumptions made</w:t>
-      </w:r>
-    </w:p>
-    <w:p>
-      <w:pPr>
-        <w:pStyle w:val="ListParagraph"/>
-        <w:numPr>
-          <w:ilvl w:val="0"/>
-          <w:numId w:val="1"/>
-        </w:numPr>
-        <w:spacing w:after="80" w:line="276"/>
-      </w:pPr>
-      <w:r>
-        <w:t xml:space="preserve">The guide is sold as a digital product (PDF) to individual buyers.</w:t>
-      </w:r>
-    </w:p>
-    <w:p>
-      <w:pPr>
-        <w:pStyle w:val="ListParagraph"/>
-        <w:numPr>
-          <w:ilvl w:val="0"/>
-          <w:numId w:val="1"/>
-        </w:numPr>
-        <w:spacing w:after="80" w:line="276"/>
-      </w:pPr>
-      <w:r>
-        <w:t xml:space="preserve">Lucid Creations is an active Shopify store under Auralis Digital selling print-on-demand products; handmade products and commissions may be added later.</w:t>
-      </w:r>
-    </w:p>
-    <w:p>
-      <w:pPr>
-        <w:pStyle w:val="ListParagraph"/>
-        <w:numPr>
-          <w:ilvl w:val="0"/>
-          <w:numId w:val="1"/>
-        </w:numPr>
-        <w:spacing w:after="80" w:line="276"/>
-      </w:pPr>
-      <w:r>
-        <w:t xml:space="preserve">The reader has a computer and can sign up for Shopify on their own.</w:t>
-      </w:r>
-    </w:p>
-    <w:p>
-      <w:pPr>
-        <w:pStyle w:val="ListParagraph"/>
-        <w:numPr>
-          <w:ilvl w:val="0"/>
-          <w:numId w:val="1"/>
-        </w:numPr>
-        <w:spacing w:after="80" w:line="276"/>
-      </w:pPr>
-      <w:r>
-        <w:t xml:space="preserve">Front matter, the table of contents, Chapter 1, and the Chapter 1 worksheet are the only drafted sections in this pass. Chapters 2–12 and the remaining worksheets are pending approval to continue.</w:t>
+        <w:t xml:space="preserve">What you will complete</w:t>
+      </w:r>
+    </w:p>
+    <w:p>
+      <w:pPr>
+        <w:spacing w:after="140" w:line="276"/>
+      </w:pPr>
+      <w:r>
+        <w:t xml:space="preserve">By the end of this chapter, you will have three things: one clearly defined starting customer, one clear reason that customer may want what you sell, and one simple offer statement you can use to guide later store decisions. This is not a full marketing plan or a detailed customer persona — it is a short, working direction for the first version of your store.</w:t>
+      </w:r>
+    </w:p>
+    <w:p>
+      <w:pPr>
+        <w:spacing w:after="140" w:line="276"/>
+      </w:pPr>
+      <w:r>
+        <w:t xml:space="preserve">If you wrote a rough first-offer statement in Chapter 1, this chapter sharpens it by adding the specific customer and the reason they may want it.</w:t>
       </w:r>
     </w:p>
     <w:p>
@@ -2424,46 +2380,15 @@
         <w:spacing w:after="100" w:before="200"/>
       </w:pPr>
       <w:r>
-        <w:t xml:space="preserve">Missing information</w:t>
-      </w:r>
-    </w:p>
-    <w:p>
-      <w:pPr>
-        <w:pStyle w:val="ListParagraph"/>
-        <w:numPr>
-          <w:ilvl w:val="0"/>
-          <w:numId w:val="1"/>
-        </w:numPr>
-        <w:spacing w:after="80" w:line="276"/>
-      </w:pPr>
-      <w:r>
-        <w:t xml:space="preserve">The last-updated date and copyright year (left as [INSERT DATE] and [INSERT YEAR]).</w:t>
-      </w:r>
-    </w:p>
-    <w:p>
-      <w:pPr>
-        <w:pStyle w:val="ListParagraph"/>
-        <w:numPr>
-          <w:ilvl w:val="0"/>
-          <w:numId w:val="1"/>
-        </w:numPr>
-        <w:spacing w:after="80" w:line="276"/>
-      </w:pPr>
-      <w:r>
-        <w:t xml:space="preserve">The Auralis Digital service link for the final conversion page ([INSERT AURALIS DIGITAL SERVICE LINK]).</w:t>
-      </w:r>
-    </w:p>
-    <w:p>
-      <w:pPr>
-        <w:pStyle w:val="ListParagraph"/>
-        <w:numPr>
-          <w:ilvl w:val="0"/>
-          <w:numId w:val="1"/>
-        </w:numPr>
-        <w:spacing w:after="80" w:line="276"/>
-      </w:pPr>
-      <w:r>
-        <w:t xml:space="preserve">Official Shopify URLs (left as [ADD OFFICIAL SHOPIFY LINK] rather than invented).</w:t>
+        <w:t xml:space="preserve">Why this matters</w:t>
+      </w:r>
+    </w:p>
+    <w:p>
+      <w:pPr>
+        <w:spacing w:after="140" w:line="276"/>
+      </w:pPr>
+      <w:r>
+        <w:t xml:space="preserve">A store that tries to speak to everyone ends up speaking clearly to no one. When you know who your first customer is and why they would buy, every later decision gets easier: your store name, your product descriptions, your collections, and the words on your homepage all point in the same direction. Beginners often skip this step and then struggle to describe their own store. A single clear customer and offer prevents that.</w:t>
       </w:r>
     </w:p>
     <w:p>
@@ -2472,20 +2397,147 @@
         <w:spacing w:after="100" w:before="200"/>
       </w:pPr>
       <w:r>
-        <w:t xml:space="preserve">Lucid Creations examples needed</w:t>
-      </w:r>
-    </w:p>
-    <w:p>
-      <w:pPr>
-        <w:pStyle w:val="ListParagraph"/>
-        <w:numPr>
-          <w:ilvl w:val="0"/>
-          <w:numId w:val="1"/>
-        </w:numPr>
-        <w:spacing w:after="80" w:line="276"/>
-      </w:pPr>
-      <w:r>
-        <w:t xml:space="preserve">Chapter 1: which products Lucid Creations launched with, why they were chosen, and what you would change today (no sales or performance figures).</w:t>
+        <w:t xml:space="preserve">Step-by-step instructions</w:t>
+      </w:r>
+    </w:p>
+    <w:p>
+      <w:pPr>
+        <w:pStyle w:val="ListParagraph"/>
+        <w:numPr>
+          <w:ilvl w:val="0"/>
+          <w:numId w:val="3"/>
+        </w:numPr>
+        <w:spacing w:after="120" w:line="276"/>
+      </w:pPr>
+      <w:r>
+        <w:rPr>
+          <w:b/>
+          <w:bCs/>
+        </w:rPr>
+        <w:t xml:space="preserve">Start with one likely customer.</w:t>
+      </w:r>
+      <w:r>
+        <w:t xml:space="preserve"> Your business may serve several kinds of people over time, but the first version of your store needs one primary buyer to guide decisions. Name a real type of person, not “everyone.” For example: festival and electronic-music fans who like psychedelic artwork; local homeowners who need lawn maintenance; small creators who need help launching a Shopify store; or parents buying personalized gifts. Skip demographics such as age or income unless they genuinely matter to what you sell. Why it matters: one clear customer gives the whole store a direction. Done when: you can name your starting customer in a short phrase.</w:t>
+      </w:r>
+    </w:p>
+    <w:p>
+      <w:pPr>
+        <w:pStyle w:val="ListParagraph"/>
+        <w:numPr>
+          <w:ilvl w:val="0"/>
+          <w:numId w:val="3"/>
+        </w:numPr>
+        <w:spacing w:after="120" w:line="276"/>
+      </w:pPr>
+      <w:r>
+        <w:rPr>
+          <w:b/>
+          <w:bCs/>
+        </w:rPr>
+        <w:t xml:space="preserve">Identify what that customer wants.</w:t>
+      </w:r>
+      <w:r>
+        <w:t xml:space="preserve"> Write down the practical or emotional reason this customer might buy. Common reasons include solving a problem, saving time, expressing an identity or interest, giving a gift, improving convenience, getting access to a skill they do not have, or owning something distinctive. Why it matters: knowing the reason tells you how to describe the product later. Done when: you can state, in plain words, why this customer would buy.</w:t>
+      </w:r>
+    </w:p>
+    <w:p>
+      <w:pPr>
+        <w:pStyle w:val="ListParagraph"/>
+        <w:numPr>
+          <w:ilvl w:val="0"/>
+          <w:numId w:val="3"/>
+        </w:numPr>
+        <w:spacing w:after="120" w:line="276"/>
+      </w:pPr>
+      <w:r>
+        <w:rPr>
+          <w:b/>
+          <w:bCs/>
+        </w:rPr>
+        <w:t xml:space="preserve">Separate the product from the offer.</w:t>
+      </w:r>
+      <w:r>
+        <w:t xml:space="preserve"> The product or service is what you are selling. The offer is that same product or service presented with a clear reason for a specific customer to choose it. For example — Product: a psychedelic tapestry. Offer: bold psychedelic wall art for festival and electronic-music fans who want their room to reflect their style. Why it matters: customers respond to an offer, not a bare product. Done when: you can state your product and your offer as two separate things.</w:t>
+      </w:r>
+    </w:p>
+    <w:p>
+      <w:pPr>
+        <w:pStyle w:val="ListParagraph"/>
+        <w:numPr>
+          <w:ilvl w:val="0"/>
+          <w:numId w:val="3"/>
+        </w:numPr>
+        <w:spacing w:after="120" w:line="276"/>
+      </w:pPr>
+      <w:r>
+        <w:rPr>
+          <w:b/>
+          <w:bCs/>
+        </w:rPr>
+        <w:t xml:space="preserve">Confirm the customer and product fit.</w:t>
+      </w:r>
+      <w:r>
+        <w:t xml:space="preserve"> Check your pairing against four questions: Would this customer recognize that the product is for them? Does the product match something they want, need, value, or identify with? Can you explain the connection in one sentence? Is the customer reasonably reachable — through normal search, communities, local relationships, or future marketing? Why it matters: a product and customer that do not fit will be hard to sell no matter how good the store looks. Done when: you can answer yes to those questions, or you adjust the customer or product until you can.</w:t>
+      </w:r>
+    </w:p>
+    <w:p>
+      <w:pPr>
+        <w:pStyle w:val="ListParagraph"/>
+        <w:numPr>
+          <w:ilvl w:val="0"/>
+          <w:numId w:val="3"/>
+        </w:numPr>
+        <w:spacing w:after="120" w:line="276"/>
+      </w:pPr>
+      <w:r>
+        <w:rPr>
+          <w:b/>
+          <w:bCs/>
+        </w:rPr>
+        <w:t xml:space="preserve">Write the one-sentence offer statement.</w:t>
+      </w:r>
+      <w:r>
+        <w:t xml:space="preserve"> Use this structure: “I sell [product or service] for [specific customer] who want [result, benefit, or experience].” For example: “I sell psychedelic apparel and home décor for festival and electronic-music fans who want their surroundings and clothing to reflect their style.” Small variations are fine, but keep it to one sentence. Why it matters: one sentence forces clarity. Done when: you have a single offer statement written down.</w:t>
+      </w:r>
+    </w:p>
+    <w:p>
+      <w:pPr>
+        <w:pStyle w:val="ListParagraph"/>
+        <w:numPr>
+          <w:ilvl w:val="0"/>
+          <w:numId w:val="3"/>
+        </w:numPr>
+        <w:spacing w:after="120" w:line="276"/>
+      </w:pPr>
+      <w:r>
+        <w:rPr>
+          <w:b/>
+          <w:bCs/>
+        </w:rPr>
+        <w:t xml:space="preserve">Test the statement for clarity.</w:t>
+      </w:r>
+      <w:r>
+        <w:t xml:space="preserve"> Read it back and check: Is the customer clear? Is the product or service clear? Is the reason to buy clear? Would a stranger understand it without extra explanation? Does it avoid vague words such as “quality,” “solutions,” “unique,” or “for everyone,” unless something concrete backs them up? Why it matters: a statement only helps if it is genuinely clear. Done when: your statement passes all of those checks.</w:t>
+      </w:r>
+    </w:p>
+    <w:p>
+      <w:pPr>
+        <w:pStyle w:val="ListParagraph"/>
+        <w:numPr>
+          <w:ilvl w:val="0"/>
+          <w:numId w:val="3"/>
+        </w:numPr>
+        <w:spacing w:after="120" w:line="276"/>
+      </w:pPr>
+      <w:r>
+        <w:rPr>
+          <w:b/>
+          <w:bCs/>
+        </w:rPr>
+        <w:t xml:space="preserve">Lock the starting direction.</w:t>
+      </w:r>
+      <w:r>
+        <w:t xml:space="preserve"> Use this statement as a temporary decision tool for your store name, product descriptions, collections, homepage language, product photography, and future content. Why it matters: a shared direction keeps the whole store consistent. Done when: you have decided to use this statement to guide the next steps — knowing it can change once real customers give you feedback.</w:t>
       </w:r>
     </w:p>
     <w:p>
@@ -2494,20 +2546,36 @@
         <w:spacing w:after="100" w:before="200"/>
       </w:pPr>
       <w:r>
-        <w:t xml:space="preserve">Screenshots needed</w:t>
-      </w:r>
-    </w:p>
-    <w:p>
-      <w:pPr>
-        <w:pStyle w:val="ListParagraph"/>
-        <w:numPr>
-          <w:ilvl w:val="0"/>
-          <w:numId w:val="1"/>
-        </w:numPr>
-        <w:spacing w:after="80" w:line="276"/>
-      </w:pPr>
-      <w:r>
-        <w:t xml:space="preserve">Chapter 1 does not require screenshots. Screenshot placeholders ([INSERT SCREENSHOT]) begin in later chapters (account creation, settings, product pages, checkout, and so on).</w:t>
+        <w:t xml:space="preserve">Real example: Lucid Creations</w:t>
+      </w:r>
+    </w:p>
+    <w:p>
+      <w:pPr>
+        <w:spacing w:after="140" w:line="276"/>
+      </w:pPr>
+      <w:r>
+        <w:t xml:space="preserve">Lucid Creations is a Shopify product store under Auralis Digital. Its audience is broadly aligned with psychedelic art, electronic music, festival culture, sacred geometry, and alternative design, and its products include apparel, blankets, tapestries, wall art, accessories, and related designs. It may later add handmade pieces and commissions.</w:t>
+      </w:r>
+    </w:p>
+    <w:p>
+      <w:pPr>
+        <w:spacing w:after="140" w:line="276"/>
+      </w:pPr>
+      <w:r>
+        <w:t xml:space="preserve">A working example of an offer statement for a store like this might be: “I sell psychedelic apparel and home décor for festival and electronic-music fans who want their surroundings and clothing to reflect their style.” (This is a working example for review, not final approved brand language.)</w:t>
+      </w:r>
+    </w:p>
+    <w:p>
+      <w:pPr>
+        <w:spacing w:after="140" w:line="276"/>
+      </w:pPr>
+      <w:r>
+        <w:rPr>
+          <w:i/>
+          <w:iCs/>
+          <w:color w:val="9A6A00"/>
+        </w:rPr>
+        <w:t xml:space="preserve">[INSERT LUCID CREATIONS CUSTOMER AND OFFER EXAMPLE] — Christopher’s own wording for Lucid’s starting customer and offer, and the reasoning behind it. Do not claim proven demand, repeat customers, or sales results.</w:t>
       </w:r>
     </w:p>
     <w:p>
@@ -2516,33 +2584,37 @@
         <w:spacing w:after="100" w:before="200"/>
       </w:pPr>
       <w:r>
-        <w:t xml:space="preserve">Claims to verify</w:t>
-      </w:r>
-    </w:p>
-    <w:p>
-      <w:pPr>
-        <w:pStyle w:val="ListParagraph"/>
-        <w:numPr>
-          <w:ilvl w:val="0"/>
-          <w:numId w:val="1"/>
-        </w:numPr>
-        <w:spacing w:after="80" w:line="276"/>
-      </w:pPr>
-      <w:r>
-        <w:t xml:space="preserve">Confirm the list of product types Shopify supports matches how you want to present it.</w:t>
-      </w:r>
-    </w:p>
-    <w:p>
-      <w:pPr>
-        <w:pStyle w:val="ListParagraph"/>
-        <w:numPr>
-          <w:ilvl w:val="0"/>
-          <w:numId w:val="1"/>
-        </w:numPr>
-        <w:spacing w:after="80" w:line="276"/>
-      </w:pPr>
-      <w:r>
-        <w:t xml:space="preserve">Verify any Shopify-specific setting names against the current interface before publishing (flagged with [VERIFY CURRENT SHOPIFY SETTING] in later chapters).</w:t>
+        <w:t xml:space="preserve">Common mistake</w:t>
+      </w:r>
+    </w:p>
+    <w:p>
+      <w:pPr>
+        <w:spacing w:after="140" w:line="276"/>
+      </w:pPr>
+      <w:r>
+        <w:rPr>
+          <w:b/>
+          <w:bCs/>
+        </w:rPr>
+        <w:t xml:space="preserve">⚠ Trying to sell to “everyone.” </w:t>
+      </w:r>
+      <w:r>
+        <w:t xml:space="preserve">When the customer is everyone, product descriptions become vague, the store design has no direction, collections feel disconnected, marketing gets harder, and visitors do not immediately see that the store is for them.</w:t>
+      </w:r>
+    </w:p>
+    <w:p>
+      <w:pPr>
+        <w:spacing w:after="140" w:line="276"/>
+      </w:pPr>
+      <w:r>
+        <w:rPr>
+          <w:b/>
+          <w:bCs/>
+        </w:rPr>
+        <w:t xml:space="preserve">Instead: </w:t>
+      </w:r>
+      <w:r>
+        <w:t xml:space="preserve">choose one starting customer so the first version of the store is coherent. This does not permanently exclude anyone else — it simply gives the store a clear starting point.</w:t>
       </w:r>
     </w:p>
     <w:p>
@@ -2551,6 +2623,748 @@
         <w:spacing w:after="100" w:before="200"/>
       </w:pPr>
       <w:r>
+        <w:t xml:space="preserve">Reality check</w:t>
+      </w:r>
+    </w:p>
+    <w:p>
+      <w:pPr>
+        <w:spacing w:after="140" w:line="276"/>
+      </w:pPr>
+      <w:r>
+        <w:t xml:space="preserve">You are not choosing your customer forever. You are choosing who the first version of the store should make immediate sense to.</w:t>
+      </w:r>
+    </w:p>
+    <w:p>
+      <w:pPr>
+        <w:pStyle w:val="Heading2"/>
+        <w:spacing w:after="100" w:before="200"/>
+      </w:pPr>
+      <w:r>
+        <w:t xml:space="preserve">Checklist</w:t>
+      </w:r>
+    </w:p>
+    <w:p>
+      <w:pPr>
+        <w:spacing w:after="70" w:line="276"/>
+        <w:ind w:left="200"/>
+      </w:pPr>
+      <w:r>
+        <w:t xml:space="preserve">☐  I selected one primary starting customer.</w:t>
+      </w:r>
+    </w:p>
+    <w:p>
+      <w:pPr>
+        <w:spacing w:after="70" w:line="276"/>
+        <w:ind w:left="200"/>
+      </w:pPr>
+      <w:r>
+        <w:t xml:space="preserve">☐  I identified why that customer may want what I sell.</w:t>
+      </w:r>
+    </w:p>
+    <w:p>
+      <w:pPr>
+        <w:spacing w:after="70" w:line="276"/>
+        <w:ind w:left="200"/>
+      </w:pPr>
+      <w:r>
+        <w:t xml:space="preserve">☐  I separated the product from the offer.</w:t>
+      </w:r>
+    </w:p>
+    <w:p>
+      <w:pPr>
+        <w:spacing w:after="70" w:line="276"/>
+        <w:ind w:left="200"/>
+      </w:pPr>
+      <w:r>
+        <w:t xml:space="preserve">☐  I wrote one clear offer statement.</w:t>
+      </w:r>
+    </w:p>
+    <w:p>
+      <w:pPr>
+        <w:spacing w:after="70" w:line="276"/>
+        <w:ind w:left="200"/>
+      </w:pPr>
+      <w:r>
+        <w:t xml:space="preserve">☐  A stranger can understand the statement without additional explanation.</w:t>
+      </w:r>
+    </w:p>
+    <w:p>
+      <w:pPr>
+        <w:spacing w:after="70" w:line="276"/>
+        <w:ind w:left="200"/>
+      </w:pPr>
+      <w:r>
+        <w:t xml:space="preserve">☐  I avoided claiming the offer is for everyone.</w:t>
+      </w:r>
+    </w:p>
+    <w:p>
+      <w:pPr>
+        <w:pStyle w:val="Heading2"/>
+        <w:spacing w:after="100" w:before="200"/>
+      </w:pPr>
+      <w:r>
+        <w:t xml:space="preserve">Before you continue</w:t>
+      </w:r>
+    </w:p>
+    <w:p>
+      <w:pPr>
+        <w:spacing w:after="140" w:line="276"/>
+      </w:pPr>
+      <w:r>
+        <w:t xml:space="preserve">Answer these three questions honestly before moving on:</w:t>
+      </w:r>
+    </w:p>
+    <w:p>
+      <w:pPr>
+        <w:spacing w:after="70" w:line="276"/>
+        <w:ind w:left="200"/>
+      </w:pPr>
+      <w:r>
+        <w:t xml:space="preserve">☐  Did I complete this step?</w:t>
+      </w:r>
+    </w:p>
+    <w:p>
+      <w:pPr>
+        <w:spacing w:after="70" w:line="276"/>
+        <w:ind w:left="200"/>
+      </w:pPr>
+      <w:r>
+        <w:t xml:space="preserve">☐  Would my intended customer recognize that this store is for them?</w:t>
+      </w:r>
+    </w:p>
+    <w:p>
+      <w:pPr>
+        <w:spacing w:after="70" w:line="276"/>
+        <w:ind w:left="200"/>
+      </w:pPr>
+      <w:r>
+        <w:t xml:space="preserve">☐  Is my offer clear enough to guide the next store decisions?</w:t>
+      </w:r>
+    </w:p>
+    <w:p>
+      <w:pPr>
+        <w:pStyle w:val="Heading2"/>
+        <w:spacing w:after="100" w:before="200"/>
+      </w:pPr>
+      <w:r>
+        <w:t xml:space="preserve">Tools and official links</w:t>
+      </w:r>
+    </w:p>
+    <w:p>
+      <w:pPr>
+        <w:pStyle w:val="ListParagraph"/>
+        <w:numPr>
+          <w:ilvl w:val="0"/>
+          <w:numId w:val="1"/>
+        </w:numPr>
+        <w:spacing w:after="80" w:line="276"/>
+      </w:pPr>
+      <w:r>
+        <w:t xml:space="preserve">Worksheet: Customer and Offer Statement (below)</w:t>
+      </w:r>
+    </w:p>
+    <w:p>
+      <w:pPr>
+        <w:spacing w:after="140" w:line="276"/>
+      </w:pPr>
+      <w:r>
+        <w:rPr>
+          <w:i/>
+          <w:iCs/>
+          <w:color w:val="9A6A00"/>
+        </w:rPr>
+        <w:t xml:space="preserve">[ADD OFFICIAL SHOPIFY LINK] — include only if an official Shopify resource directly supports identifying a target customer or defining a value proposition.</w:t>
+      </w:r>
+    </w:p>
+    <w:p>
+      <w:r>
+        <w:br w:type="page"/>
+      </w:r>
+    </w:p>
+    <w:p>
+      <w:pPr>
+        <w:pStyle w:val="Heading1"/>
+        <w:spacing w:after="160" w:before="240"/>
+      </w:pPr>
+      <w:r>
+        <w:t xml:space="preserve">Worksheet: Customer and Offer Statement</w:t>
+      </w:r>
+    </w:p>
+    <w:p>
+      <w:pPr>
+        <w:spacing w:after="140" w:line="276"/>
+      </w:pPr>
+      <w:r>
+        <w:t xml:space="preserve">Use this one-page worksheet to define your starting customer and offer. It works printed or completed on a screen.</w:t>
+      </w:r>
+    </w:p>
+    <w:p>
+      <w:pPr>
+        <w:spacing w:after="40"/>
+      </w:pPr>
+      <w:r>
+        <w:rPr>
+          <w:b/>
+          <w:bCs/>
+        </w:rPr>
+        <w:t xml:space="preserve">My starting customer</w:t>
+      </w:r>
+    </w:p>
+    <w:p>
+      <w:pPr>
+        <w:spacing w:after="40" w:line="276"/>
+      </w:pPr>
+      <w:r>
+        <w:t xml:space="preserve">Who are they?</w:t>
+      </w:r>
+    </w:p>
+    <w:p>
+      <w:pPr>
+        <w:pBdr>
+          <w:bottom w:val="single" w:color="999999" w:sz="6" w:space="1"/>
+        </w:pBdr>
+        <w:spacing w:after="220"/>
+      </w:pPr>
+      <w:r>
+        <w:t xml:space="preserve"/>
+      </w:r>
+    </w:p>
+    <w:p>
+      <w:pPr>
+        <w:spacing w:after="40" w:line="276"/>
+      </w:pPr>
+      <w:r>
+        <w:t xml:space="preserve">What are they interested in, trying to do, or trying to solve?</w:t>
+      </w:r>
+    </w:p>
+    <w:p>
+      <w:pPr>
+        <w:pBdr>
+          <w:bottom w:val="single" w:color="999999" w:sz="6" w:space="1"/>
+        </w:pBdr>
+        <w:spacing w:after="220"/>
+      </w:pPr>
+      <w:r>
+        <w:t xml:space="preserve"/>
+      </w:r>
+    </w:p>
+    <w:p>
+      <w:pPr>
+        <w:spacing w:after="40" w:line="276"/>
+      </w:pPr>
+      <w:r>
+        <w:t xml:space="preserve">What makes them a reasonable fit for what I sell?</w:t>
+      </w:r>
+    </w:p>
+    <w:p>
+      <w:pPr>
+        <w:pBdr>
+          <w:bottom w:val="single" w:color="999999" w:sz="6" w:space="1"/>
+        </w:pBdr>
+        <w:spacing w:after="220"/>
+      </w:pPr>
+      <w:r>
+        <w:t xml:space="preserve"/>
+      </w:r>
+    </w:p>
+    <w:p>
+      <w:pPr>
+        <w:spacing w:after="40"/>
+      </w:pPr>
+      <w:r>
+        <w:rPr>
+          <w:b/>
+          <w:bCs/>
+        </w:rPr>
+        <w:t xml:space="preserve">What I sell</w:t>
+      </w:r>
+    </w:p>
+    <w:p>
+      <w:pPr>
+        <w:spacing w:after="40" w:line="276"/>
+      </w:pPr>
+      <w:r>
+        <w:t xml:space="preserve">Product or service:</w:t>
+      </w:r>
+    </w:p>
+    <w:p>
+      <w:pPr>
+        <w:pBdr>
+          <w:bottom w:val="single" w:color="999999" w:sz="6" w:space="1"/>
+        </w:pBdr>
+        <w:spacing w:after="220"/>
+      </w:pPr>
+      <w:r>
+        <w:t xml:space="preserve"/>
+      </w:r>
+    </w:p>
+    <w:p>
+      <w:pPr>
+        <w:spacing w:after="40" w:line="276"/>
+      </w:pPr>
+      <w:r>
+        <w:t xml:space="preserve">One-sentence plain-English description:</w:t>
+      </w:r>
+    </w:p>
+    <w:p>
+      <w:pPr>
+        <w:pBdr>
+          <w:bottom w:val="single" w:color="999999" w:sz="6" w:space="1"/>
+        </w:pBdr>
+        <w:spacing w:after="220"/>
+      </w:pPr>
+      <w:r>
+        <w:t xml:space="preserve"/>
+      </w:r>
+    </w:p>
+    <w:p>
+      <w:pPr>
+        <w:spacing w:after="40"/>
+      </w:pPr>
+      <w:r>
+        <w:rPr>
+          <w:b/>
+          <w:bCs/>
+        </w:rPr>
+        <w:t xml:space="preserve">Why they may want it (up to three reasons)</w:t>
+      </w:r>
+    </w:p>
+    <w:p>
+      <w:pPr>
+        <w:pBdr>
+          <w:bottom w:val="single" w:color="999999" w:sz="6" w:space="1"/>
+        </w:pBdr>
+        <w:spacing w:after="220"/>
+      </w:pPr>
+      <w:r>
+        <w:t xml:space="preserve"/>
+      </w:r>
+    </w:p>
+    <w:p>
+      <w:pPr>
+        <w:pBdr>
+          <w:bottom w:val="single" w:color="999999" w:sz="6" w:space="1"/>
+        </w:pBdr>
+        <w:spacing w:after="220"/>
+      </w:pPr>
+      <w:r>
+        <w:t xml:space="preserve"/>
+      </w:r>
+    </w:p>
+    <w:p>
+      <w:pPr>
+        <w:pBdr>
+          <w:bottom w:val="single" w:color="999999" w:sz="6" w:space="1"/>
+        </w:pBdr>
+        <w:spacing w:after="220"/>
+      </w:pPr>
+      <w:r>
+        <w:t xml:space="preserve"/>
+      </w:r>
+    </w:p>
+    <w:p>
+      <w:pPr>
+        <w:spacing w:after="40"/>
+      </w:pPr>
+      <w:r>
+        <w:rPr>
+          <w:b/>
+          <w:bCs/>
+        </w:rPr>
+        <w:t xml:space="preserve">Product versus offer</w:t>
+      </w:r>
+    </w:p>
+    <w:p>
+      <w:pPr>
+        <w:spacing w:after="40" w:line="276"/>
+      </w:pPr>
+      <w:r>
+        <w:t xml:space="preserve">My product/service:</w:t>
+      </w:r>
+    </w:p>
+    <w:p>
+      <w:pPr>
+        <w:pBdr>
+          <w:bottom w:val="single" w:color="999999" w:sz="6" w:space="1"/>
+        </w:pBdr>
+        <w:spacing w:after="220"/>
+      </w:pPr>
+      <w:r>
+        <w:t xml:space="preserve"/>
+      </w:r>
+    </w:p>
+    <w:p>
+      <w:pPr>
+        <w:spacing w:after="40" w:line="276"/>
+      </w:pPr>
+      <w:r>
+        <w:t xml:space="preserve">My offer:</w:t>
+      </w:r>
+    </w:p>
+    <w:p>
+      <w:pPr>
+        <w:pBdr>
+          <w:bottom w:val="single" w:color="999999" w:sz="6" w:space="1"/>
+        </w:pBdr>
+        <w:spacing w:after="220"/>
+      </w:pPr>
+      <w:r>
+        <w:t xml:space="preserve"/>
+      </w:r>
+    </w:p>
+    <w:p>
+      <w:pPr>
+        <w:spacing w:after="40"/>
+      </w:pPr>
+      <w:r>
+        <w:rPr>
+          <w:b/>
+          <w:bCs/>
+        </w:rPr>
+        <w:t xml:space="preserve">Offer statement builder</w:t>
+      </w:r>
+    </w:p>
+    <w:p>
+      <w:pPr>
+        <w:spacing w:after="140" w:line="276"/>
+      </w:pPr>
+      <w:r>
+        <w:t xml:space="preserve">“I sell ________________ for ________________ who want ________________.”</w:t>
+      </w:r>
+    </w:p>
+    <w:p>
+      <w:pPr>
+        <w:spacing w:after="40"/>
+      </w:pPr>
+      <w:r>
+        <w:rPr>
+          <w:b/>
+          <w:bCs/>
+        </w:rPr>
+        <w:t xml:space="preserve">Clarity test</w:t>
+      </w:r>
+    </w:p>
+    <w:p>
+      <w:pPr>
+        <w:spacing w:after="70" w:line="276"/>
+        <w:ind w:left="200"/>
+      </w:pPr>
+      <w:r>
+        <w:t xml:space="preserve">☐  The product or service is clear.</w:t>
+      </w:r>
+    </w:p>
+    <w:p>
+      <w:pPr>
+        <w:spacing w:after="70" w:line="276"/>
+        <w:ind w:left="200"/>
+      </w:pPr>
+      <w:r>
+        <w:t xml:space="preserve">☐  The customer is specific enough to picture.</w:t>
+      </w:r>
+    </w:p>
+    <w:p>
+      <w:pPr>
+        <w:spacing w:after="70" w:line="276"/>
+        <w:ind w:left="200"/>
+      </w:pPr>
+      <w:r>
+        <w:t xml:space="preserve">☐  The benefit, result, or experience is clear.</w:t>
+      </w:r>
+    </w:p>
+    <w:p>
+      <w:pPr>
+        <w:spacing w:after="70" w:line="276"/>
+        <w:ind w:left="200"/>
+      </w:pPr>
+      <w:r>
+        <w:t xml:space="preserve">☐  The sentence avoids vague filler.</w:t>
+      </w:r>
+    </w:p>
+    <w:p>
+      <w:pPr>
+        <w:spacing w:after="70" w:line="276"/>
+        <w:ind w:left="200"/>
+      </w:pPr>
+      <w:r>
+        <w:t xml:space="preserve">☐  A stranger could understand it quickly.</w:t>
+      </w:r>
+    </w:p>
+    <w:p>
+      <w:pPr>
+        <w:spacing w:after="40"/>
+      </w:pPr>
+      <w:r>
+        <w:rPr>
+          <w:b/>
+          <w:bCs/>
+        </w:rPr>
+        <w:t xml:space="preserve">Final offer statement</w:t>
+      </w:r>
+    </w:p>
+    <w:p>
+      <w:pPr>
+        <w:pBdr>
+          <w:bottom w:val="single" w:color="999999" w:sz="6" w:space="1"/>
+        </w:pBdr>
+        <w:spacing w:after="220"/>
+      </w:pPr>
+      <w:r>
+        <w:t xml:space="preserve"/>
+      </w:r>
+    </w:p>
+    <w:p>
+      <w:pPr>
+        <w:pBdr>
+          <w:bottom w:val="single" w:color="999999" w:sz="6" w:space="1"/>
+        </w:pBdr>
+        <w:spacing w:after="220"/>
+      </w:pPr>
+      <w:r>
+        <w:t xml:space="preserve"/>
+      </w:r>
+    </w:p>
+    <w:p>
+      <w:r>
+        <w:br w:type="page"/>
+      </w:r>
+    </w:p>
+    <w:p>
+      <w:pPr>
+        <w:pStyle w:val="Heading1"/>
+        <w:spacing w:after="160" w:before="240"/>
+      </w:pPr>
+      <w:r>
+        <w:t xml:space="preserve">Internal Reviewer Note (remove before publishing)</w:t>
+      </w:r>
+    </w:p>
+    <w:p>
+      <w:pPr>
+        <w:spacing w:after="140" w:line="276"/>
+      </w:pPr>
+      <w:r>
+        <w:t xml:space="preserve">This note lists what the draft assumes and what it still needs. It is for the internal review process, not for the buyer.</w:t>
+      </w:r>
+    </w:p>
+    <w:p>
+      <w:pPr>
+        <w:pStyle w:val="Heading2"/>
+        <w:spacing w:after="100" w:before="200"/>
+      </w:pPr>
+      <w:r>
+        <w:t xml:space="preserve">Assumptions made</w:t>
+      </w:r>
+    </w:p>
+    <w:p>
+      <w:pPr>
+        <w:pStyle w:val="ListParagraph"/>
+        <w:numPr>
+          <w:ilvl w:val="0"/>
+          <w:numId w:val="1"/>
+        </w:numPr>
+        <w:spacing w:after="80" w:line="276"/>
+      </w:pPr>
+      <w:r>
+        <w:t xml:space="preserve">The guide is sold as a digital product (PDF) to individual buyers.</w:t>
+      </w:r>
+    </w:p>
+    <w:p>
+      <w:pPr>
+        <w:pStyle w:val="ListParagraph"/>
+        <w:numPr>
+          <w:ilvl w:val="0"/>
+          <w:numId w:val="1"/>
+        </w:numPr>
+        <w:spacing w:after="80" w:line="276"/>
+      </w:pPr>
+      <w:r>
+        <w:t xml:space="preserve">Lucid Creations is an active Shopify store under Auralis Digital selling print-on-demand products; handmade products and commissions may be added later.</w:t>
+      </w:r>
+    </w:p>
+    <w:p>
+      <w:pPr>
+        <w:pStyle w:val="ListParagraph"/>
+        <w:numPr>
+          <w:ilvl w:val="0"/>
+          <w:numId w:val="1"/>
+        </w:numPr>
+        <w:spacing w:after="80" w:line="276"/>
+      </w:pPr>
+      <w:r>
+        <w:t xml:space="preserve">The reader has a computer and can sign up for Shopify on their own.</w:t>
+      </w:r>
+    </w:p>
+    <w:p>
+      <w:pPr>
+        <w:pStyle w:val="ListParagraph"/>
+        <w:numPr>
+          <w:ilvl w:val="0"/>
+          <w:numId w:val="1"/>
+        </w:numPr>
+        <w:spacing w:after="80" w:line="276"/>
+      </w:pPr>
+      <w:r>
+        <w:t xml:space="preserve">Front matter, the table of contents, Chapters 1 and 2, and their worksheets are the only drafted sections. Chapters 3–12 and the remaining worksheets are pending approval to continue.</w:t>
+      </w:r>
+    </w:p>
+    <w:p>
+      <w:pPr>
+        <w:pStyle w:val="Heading2"/>
+        <w:spacing w:after="100" w:before="200"/>
+      </w:pPr>
+      <w:r>
+        <w:t xml:space="preserve">Missing information</w:t>
+      </w:r>
+    </w:p>
+    <w:p>
+      <w:pPr>
+        <w:pStyle w:val="ListParagraph"/>
+        <w:numPr>
+          <w:ilvl w:val="0"/>
+          <w:numId w:val="1"/>
+        </w:numPr>
+        <w:spacing w:after="80" w:line="276"/>
+      </w:pPr>
+      <w:r>
+        <w:t xml:space="preserve">The last-updated date and copyright year (left as [INSERT DATE] and [INSERT YEAR]).</w:t>
+      </w:r>
+    </w:p>
+    <w:p>
+      <w:pPr>
+        <w:pStyle w:val="ListParagraph"/>
+        <w:numPr>
+          <w:ilvl w:val="0"/>
+          <w:numId w:val="1"/>
+        </w:numPr>
+        <w:spacing w:after="80" w:line="276"/>
+      </w:pPr>
+      <w:r>
+        <w:t xml:space="preserve">The Auralis Digital service link for the final conversion page ([INSERT AURALIS DIGITAL SERVICE LINK]).</w:t>
+      </w:r>
+    </w:p>
+    <w:p>
+      <w:pPr>
+        <w:pStyle w:val="ListParagraph"/>
+        <w:numPr>
+          <w:ilvl w:val="0"/>
+          <w:numId w:val="1"/>
+        </w:numPr>
+        <w:spacing w:after="80" w:line="276"/>
+      </w:pPr>
+      <w:r>
+        <w:t xml:space="preserve">Official Shopify URLs (left as [ADD OFFICIAL SHOPIFY LINK] rather than invented).</w:t>
+      </w:r>
+    </w:p>
+    <w:p>
+      <w:pPr>
+        <w:pStyle w:val="Heading2"/>
+        <w:spacing w:after="100" w:before="200"/>
+      </w:pPr>
+      <w:r>
+        <w:t xml:space="preserve">Lucid Creations examples needed</w:t>
+      </w:r>
+    </w:p>
+    <w:p>
+      <w:pPr>
+        <w:pStyle w:val="ListParagraph"/>
+        <w:numPr>
+          <w:ilvl w:val="0"/>
+          <w:numId w:val="1"/>
+        </w:numPr>
+        <w:spacing w:after="80" w:line="276"/>
+      </w:pPr>
+      <w:r>
+        <w:t xml:space="preserve">Chapter 1: which products Lucid Creations launched with, why they were chosen, and what you would change today (no sales or performance figures).</w:t>
+      </w:r>
+    </w:p>
+    <w:p>
+      <w:pPr>
+        <w:pStyle w:val="ListParagraph"/>
+        <w:numPr>
+          <w:ilvl w:val="0"/>
+          <w:numId w:val="1"/>
+        </w:numPr>
+        <w:spacing w:after="80" w:line="276"/>
+      </w:pPr>
+      <w:r>
+        <w:t xml:space="preserve">Chapter 2: Christopher’s own wording for Lucid Creations’ starting customer and offer statement (placeholder [INSERT LUCID CREATIONS CUSTOMER AND OFFER EXAMPLE]). The offer statement currently shown in Chapter 2 is a working example for review, not approved brand language.</w:t>
+      </w:r>
+    </w:p>
+    <w:p>
+      <w:pPr>
+        <w:pStyle w:val="Heading2"/>
+        <w:spacing w:after="100" w:before="200"/>
+      </w:pPr>
+      <w:r>
+        <w:t xml:space="preserve">Screenshots needed</w:t>
+      </w:r>
+    </w:p>
+    <w:p>
+      <w:pPr>
+        <w:pStyle w:val="ListParagraph"/>
+        <w:numPr>
+          <w:ilvl w:val="0"/>
+          <w:numId w:val="1"/>
+        </w:numPr>
+        <w:spacing w:after="80" w:line="276"/>
+      </w:pPr>
+      <w:r>
+        <w:t xml:space="preserve">Chapters 1 and 2 do not require screenshots. Screenshot placeholders ([INSERT SCREENSHOT]) begin in later chapters (account creation, settings, product pages, checkout, and so on).</w:t>
+      </w:r>
+    </w:p>
+    <w:p>
+      <w:pPr>
+        <w:pStyle w:val="Heading2"/>
+        <w:spacing w:after="100" w:before="200"/>
+      </w:pPr>
+      <w:r>
+        <w:t xml:space="preserve">Claims to verify</w:t>
+      </w:r>
+    </w:p>
+    <w:p>
+      <w:pPr>
+        <w:pStyle w:val="ListParagraph"/>
+        <w:numPr>
+          <w:ilvl w:val="0"/>
+          <w:numId w:val="1"/>
+        </w:numPr>
+        <w:spacing w:after="80" w:line="276"/>
+      </w:pPr>
+      <w:r>
+        <w:t xml:space="preserve">Confirm the list of product types Shopify supports matches how you want to present it.</w:t>
+      </w:r>
+    </w:p>
+    <w:p>
+      <w:pPr>
+        <w:pStyle w:val="ListParagraph"/>
+        <w:numPr>
+          <w:ilvl w:val="0"/>
+          <w:numId w:val="1"/>
+        </w:numPr>
+        <w:spacing w:after="80" w:line="276"/>
+      </w:pPr>
+      <w:r>
+        <w:t xml:space="preserve">Confirm the Lucid Creations positioning summary in Chapter 2 (psychedelic art, electronic music, festival culture, sacred geometry, alternative design; apparel, blankets, tapestries, wall art, accessories) matches how you want Lucid described.</w:t>
+      </w:r>
+    </w:p>
+    <w:p>
+      <w:pPr>
+        <w:pStyle w:val="ListParagraph"/>
+        <w:numPr>
+          <w:ilvl w:val="0"/>
+          <w:numId w:val="1"/>
+        </w:numPr>
+        <w:spacing w:after="80" w:line="276"/>
+      </w:pPr>
+      <w:r>
+        <w:t xml:space="preserve">Verify any Shopify-specific setting names against the current interface before publishing (flagged with [VERIFY CURRENT SHOPIFY SETTING] in later chapters).</w:t>
+      </w:r>
+    </w:p>
+    <w:p>
+      <w:pPr>
+        <w:pStyle w:val="Heading2"/>
+        <w:spacing w:after="100" w:before="200"/>
+      </w:pPr>
+      <w:r>
         <w:t xml:space="preserve">Scope check</w:t>
       </w:r>
     </w:p>
@@ -2559,7 +3373,7 @@
         <w:spacing w:after="140" w:line="276"/>
       </w:pPr>
       <w:r>
-        <w:t xml:space="preserve">This draft stays within the locked scope: it decides what to sell without drifting into business formation, tax, marketing, or design. Printify is mentioned only as one future fulfillment option and is not taught. No new chapters were added. Recommended status for this pass: review Chapter 1, then approve to continue to Chapter 2.</w:t>
+        <w:t xml:space="preserve">This draft stays within the locked scope. Chapter 1 decides what to sell; Chapter 2 defines one starting customer and a one-sentence offer, without drifting into branding, market research, competitor analysis, surveys, social media, advertising, pricing, or multiple personas. Printify is mentioned only as one future fulfillment option and is not taught. No chapters beyond Chapter 2 were added. Recommended status for this pass: review Chapter 2, then approve to continue to Chapter 3.</w:t>
       </w:r>
     </w:p>
     <w:sectPr>
@@ -2782,6 +3596,18 @@
       </w:pPr>
     </w:lvl>
   </w:abstractNum>
+  <w:abstractNum w:abstractNumId="3" w15:restartNumberingAfterBreak="0">
+    <w:multiLevelType w:val="hybridMultilevel"/>
+    <w:lvl w:ilvl="0" w15:tentative="1">
+      <w:start w:val="1"/>
+      <w:numFmt w:val="decimal"/>
+      <w:lvlText w:val="%1."/>
+      <w:lvlJc w:val="start"/>
+      <w:pPr>
+        <w:ind w:left="460" w:hanging="300"/>
+      </w:pPr>
+    </w:lvl>
+  </w:abstractNum>
   <w:num w:numId="1">
     <w:abstractNumId w:val="1"/>
     <w:lvlOverride w:ilvl="0">
@@ -2790,6 +3616,12 @@
   </w:num>
   <w:num w:numId="2">
     <w:abstractNumId w:val="2"/>
+    <w:lvlOverride w:ilvl="0">
+      <w:startOverride w:val="1"/>
+    </w:lvlOverride>
+  </w:num>
+  <w:num w:numId="3">
+    <w:abstractNumId w:val="3"/>
     <w:lvlOverride w:ilvl="0">
       <w:startOverride w:val="1"/>
     </w:lvlOverride>

</xml_diff>

<commit_message>
docs: add Shopify guide chapter 3 draft
Co-Authored-By: Claude Opus 4.8 <noreply@anthropic.com>
</commit_message>
<xml_diff>
--- a/docs/guides/shopify/Build-Your-First-Shopify-Store-DRAFT.docx
+++ b/docs/guides/shopify/Build-Your-First-Shopify-Store-DRAFT.docx
@@ -1116,7 +1116,7 @@
           <w:iCs/>
           <w:color w:val="9A6A00"/>
         </w:rPr>
-        <w:t xml:space="preserve">Draft status: This file contains the polished table of contents, all front matter, Chapters 1–2, and their worksheets. Chapters 3–12 and the remaining worksheets are pending approval to continue.</w:t>
+        <w:t xml:space="preserve">Draft status: This file contains the polished table of contents, all front matter, Chapters 1–3, and their worksheets. Chapters 4–12 and the remaining worksheets are pending approval to continue.</w:t>
       </w:r>
     </w:p>
     <w:p>
@@ -3134,15 +3134,7 @@
         <w:spacing w:after="160" w:before="240"/>
       </w:pPr>
       <w:r>
-        <w:t xml:space="preserve">Internal Reviewer Note (remove before publishing)</w:t>
-      </w:r>
-    </w:p>
-    <w:p>
-      <w:pPr>
-        <w:spacing w:after="140" w:line="276"/>
-      </w:pPr>
-      <w:r>
-        <w:t xml:space="preserve">This note lists what the draft assumes and what it still needs. It is for the internal review process, not for the buyer.</w:t>
+        <w:t xml:space="preserve">Chapter 3 — Choose the Store Name</w:t>
       </w:r>
     </w:p>
     <w:p>
@@ -3151,59 +3143,15 @@
         <w:spacing w:after="100" w:before="200"/>
       </w:pPr>
       <w:r>
-        <w:t xml:space="preserve">Assumptions made</w:t>
-      </w:r>
-    </w:p>
-    <w:p>
-      <w:pPr>
-        <w:pStyle w:val="ListParagraph"/>
-        <w:numPr>
-          <w:ilvl w:val="0"/>
-          <w:numId w:val="1"/>
-        </w:numPr>
-        <w:spacing w:after="80" w:line="276"/>
-      </w:pPr>
-      <w:r>
-        <w:t xml:space="preserve">The guide is sold as a digital product (PDF) to individual buyers.</w:t>
-      </w:r>
-    </w:p>
-    <w:p>
-      <w:pPr>
-        <w:pStyle w:val="ListParagraph"/>
-        <w:numPr>
-          <w:ilvl w:val="0"/>
-          <w:numId w:val="1"/>
-        </w:numPr>
-        <w:spacing w:after="80" w:line="276"/>
-      </w:pPr>
-      <w:r>
-        <w:t xml:space="preserve">Lucid Creations is an active Shopify store under Auralis Digital selling print-on-demand products; handmade products and commissions may be added later.</w:t>
-      </w:r>
-    </w:p>
-    <w:p>
-      <w:pPr>
-        <w:pStyle w:val="ListParagraph"/>
-        <w:numPr>
-          <w:ilvl w:val="0"/>
-          <w:numId w:val="1"/>
-        </w:numPr>
-        <w:spacing w:after="80" w:line="276"/>
-      </w:pPr>
-      <w:r>
-        <w:t xml:space="preserve">The reader has a computer and can sign up for Shopify on their own.</w:t>
-      </w:r>
-    </w:p>
-    <w:p>
-      <w:pPr>
-        <w:pStyle w:val="ListParagraph"/>
-        <w:numPr>
-          <w:ilvl w:val="0"/>
-          <w:numId w:val="1"/>
-        </w:numPr>
-        <w:spacing w:after="80" w:line="276"/>
-      </w:pPr>
-      <w:r>
-        <w:t xml:space="preserve">Front matter, the table of contents, Chapters 1 and 2, and their worksheets are the only drafted sections. Chapters 3–12 and the remaining worksheets are pending approval to continue.</w:t>
+        <w:t xml:space="preserve">What you will complete</w:t>
+      </w:r>
+    </w:p>
+    <w:p>
+      <w:pPr>
+        <w:spacing w:after="140" w:line="276"/>
+      </w:pPr>
+      <w:r>
+        <w:t xml:space="preserve">By the end of this chapter, you will have one preferred store name, two usable backup names, and a completed basic availability check. You will also understand clearly that choosing a store name is not the same as legally registering a business or clearing a trademark.</w:t>
       </w:r>
     </w:p>
     <w:p>
@@ -3212,46 +3160,15 @@
         <w:spacing w:after="100" w:before="200"/>
       </w:pPr>
       <w:r>
-        <w:t xml:space="preserve">Missing information</w:t>
-      </w:r>
-    </w:p>
-    <w:p>
-      <w:pPr>
-        <w:pStyle w:val="ListParagraph"/>
-        <w:numPr>
-          <w:ilvl w:val="0"/>
-          <w:numId w:val="1"/>
-        </w:numPr>
-        <w:spacing w:after="80" w:line="276"/>
-      </w:pPr>
-      <w:r>
-        <w:t xml:space="preserve">The last-updated date and copyright year (left as [INSERT DATE] and [INSERT YEAR]).</w:t>
-      </w:r>
-    </w:p>
-    <w:p>
-      <w:pPr>
-        <w:pStyle w:val="ListParagraph"/>
-        <w:numPr>
-          <w:ilvl w:val="0"/>
-          <w:numId w:val="1"/>
-        </w:numPr>
-        <w:spacing w:after="80" w:line="276"/>
-      </w:pPr>
-      <w:r>
-        <w:t xml:space="preserve">The Auralis Digital service link for the final conversion page ([INSERT AURALIS DIGITAL SERVICE LINK]).</w:t>
-      </w:r>
-    </w:p>
-    <w:p>
-      <w:pPr>
-        <w:pStyle w:val="ListParagraph"/>
-        <w:numPr>
-          <w:ilvl w:val="0"/>
-          <w:numId w:val="1"/>
-        </w:numPr>
-        <w:spacing w:after="80" w:line="276"/>
-      </w:pPr>
-      <w:r>
-        <w:t xml:space="preserve">Official Shopify URLs (left as [ADD OFFICIAL SHOPIFY LINK] rather than invented).</w:t>
+        <w:t xml:space="preserve">Why this matters</w:t>
+      </w:r>
+    </w:p>
+    <w:p>
+      <w:pPr>
+        <w:spacing w:after="140" w:line="276"/>
+      </w:pPr>
+      <w:r>
+        <w:t xml:space="preserve">Your store name is the first thing most customers see, and it appears everywhere — your storefront, your domain, your email, your social profiles, and your invoices. A name that is clear, usable, and broad enough to grow saves you from confusing customers now and from expensive rebranding later. This chapter helps you make a practical naming decision; it is not a branding, trademark, or legal exercise.</w:t>
       </w:r>
     </w:p>
     <w:p>
@@ -3260,33 +3177,167 @@
         <w:spacing w:after="100" w:before="200"/>
       </w:pPr>
       <w:r>
-        <w:t xml:space="preserve">Lucid Creations examples needed</w:t>
-      </w:r>
-    </w:p>
-    <w:p>
-      <w:pPr>
-        <w:pStyle w:val="ListParagraph"/>
-        <w:numPr>
-          <w:ilvl w:val="0"/>
-          <w:numId w:val="1"/>
-        </w:numPr>
-        <w:spacing w:after="80" w:line="276"/>
-      </w:pPr>
-      <w:r>
-        <w:t xml:space="preserve">Chapter 1: which products Lucid Creations launched with, why they were chosen, and what you would change today (no sales or performance figures).</w:t>
-      </w:r>
-    </w:p>
-    <w:p>
-      <w:pPr>
-        <w:pStyle w:val="ListParagraph"/>
-        <w:numPr>
-          <w:ilvl w:val="0"/>
-          <w:numId w:val="1"/>
-        </w:numPr>
-        <w:spacing w:after="80" w:line="276"/>
-      </w:pPr>
-      <w:r>
-        <w:t xml:space="preserve">Chapter 2: Christopher’s own wording for Lucid Creations’ starting customer and offer statement (placeholder [INSERT LUCID CREATIONS CUSTOMER AND OFFER EXAMPLE]). The offer statement currently shown in Chapter 2 is a working example for review, not approved brand language.</w:t>
+        <w:t xml:space="preserve">Step-by-step instructions</w:t>
+      </w:r>
+    </w:p>
+    <w:p>
+      <w:pPr>
+        <w:pStyle w:val="ListParagraph"/>
+        <w:numPr>
+          <w:ilvl w:val="0"/>
+          <w:numId w:val="4"/>
+        </w:numPr>
+        <w:spacing w:after="120" w:line="276"/>
+      </w:pPr>
+      <w:r>
+        <w:rPr>
+          <w:b/>
+          <w:bCs/>
+        </w:rPr>
+        <w:t xml:space="preserve">Start from your offer.</w:t>
+      </w:r>
+      <w:r>
+        <w:t xml:space="preserve"> Review the customer-and-offer statement you wrote in Chapter 2. Your name should fit what you sell, who it is for, the tone or style of the business, and the chance that your catalog grows later. Why it matters: a name that matches your offer feels right to the customer and guides the rest of the store. Done when: you can say, in a sentence, what your name needs to communicate.</w:t>
+      </w:r>
+    </w:p>
+    <w:p>
+      <w:pPr>
+        <w:pStyle w:val="ListParagraph"/>
+        <w:numPr>
+          <w:ilvl w:val="0"/>
+          <w:numId w:val="4"/>
+        </w:numPr>
+        <w:spacing w:after="120" w:line="276"/>
+      </w:pPr>
+      <w:r>
+        <w:rPr>
+          <w:b/>
+          <w:bCs/>
+        </w:rPr>
+        <w:t xml:space="preserve">Generate a short list.</w:t>
+      </w:r>
+      <w:r>
+        <w:t xml:space="preserve"> Write down five to ten possible names. Try a few directions: descriptive names that say what you sell, suggestive or mood-based names that evoke a feeling, founder or personal names, invented words, or broad umbrella names. There is no single perfect formula — get quantity first, then judge. Why it matters: good names usually come from a pile of options, not the first idea. Done when: you have five to ten candidates written down.</w:t>
+      </w:r>
+    </w:p>
+    <w:p>
+      <w:pPr>
+        <w:pStyle w:val="ListParagraph"/>
+        <w:numPr>
+          <w:ilvl w:val="0"/>
+          <w:numId w:val="4"/>
+        </w:numPr>
+        <w:spacing w:after="120" w:line="276"/>
+      </w:pPr>
+      <w:r>
+        <w:rPr>
+          <w:b/>
+          <w:bCs/>
+        </w:rPr>
+        <w:t xml:space="preserve">Remove weak options.</w:t>
+      </w:r>
+      <w:r>
+        <w:t xml:space="preserve"> Cross off names that are hard to spell, hard to say, too long, easily confused with another word, too narrow for likely future products, generic enough to blend in with competitors, or dependent on odd punctuation or spelling to make sense. Why it matters: a name people cannot spell or remember quietly costs you customers. Done when: only your stronger candidates remain.</w:t>
+      </w:r>
+    </w:p>
+    <w:p>
+      <w:pPr>
+        <w:pStyle w:val="ListParagraph"/>
+        <w:numPr>
+          <w:ilvl w:val="0"/>
+          <w:numId w:val="4"/>
+        </w:numPr>
+        <w:spacing w:after="120" w:line="276"/>
+      </w:pPr>
+      <w:r>
+        <w:rPr>
+          <w:b/>
+          <w:bCs/>
+        </w:rPr>
+        <w:t xml:space="preserve">Check that the name fits future growth.</w:t>
+      </w:r>
+      <w:r>
+        <w:t xml:space="preserve"> For each remaining name ask: Would it still make sense if I add related products? Does it lock me into one product unnecessarily? Would it still work if I later add handmade, digital, or service offers? Is it broad enough to grow without becoming meaningless? A focused product name can be perfectly fine — the goal is to avoid unnecessary limits, not to force a vague corporate name. Why it matters: renaming after launch means redoing your domain, email, and profiles. Done when: your remaining names can survive reasonable growth.</w:t>
+      </w:r>
+    </w:p>
+    <w:p>
+      <w:pPr>
+        <w:pStyle w:val="ListParagraph"/>
+        <w:numPr>
+          <w:ilvl w:val="0"/>
+          <w:numId w:val="4"/>
+        </w:numPr>
+        <w:spacing w:after="120" w:line="276"/>
+      </w:pPr>
+      <w:r>
+        <w:rPr>
+          <w:b/>
+          <w:bCs/>
+        </w:rPr>
+        <w:t xml:space="preserve">Run a basic availability check.</w:t>
+      </w:r>
+      <w:r>
+        <w:t xml:space="preserve"> This is a preliminary check, not legal clearance. Check Shopify store-name availability during account setup; a basic web search; domain availability; major social-platform username availability where relevant; your state business-name search as an informational check; and the USPTO trademark search as an informational check for obviously conflicting names. Do not try to interpret legal or trademark results — just note any conflicts. Why it matters: finding a clash now is far cheaper than after you launch. Done when: you have checked your top candidates and noted any obvious conflicts.</w:t>
+      </w:r>
+    </w:p>
+    <w:p>
+      <w:pPr>
+        <w:pStyle w:val="ListParagraph"/>
+        <w:numPr>
+          <w:ilvl w:val="0"/>
+          <w:numId w:val="4"/>
+        </w:numPr>
+        <w:spacing w:after="120" w:line="276"/>
+      </w:pPr>
+      <w:r>
+        <w:rPr>
+          <w:b/>
+          <w:bCs/>
+        </w:rPr>
+        <w:t xml:space="preserve">Choose one preferred name and two backups.</w:t>
+      </w:r>
+      <w:r>
+        <w:t xml:space="preserve"> Pick your first choice, plus backup 1 and backup 2. Make the backups genuinely usable names — not slight misspellings of your first choice. Why it matters: if your first choice is taken or conflicts, you want real alternatives ready. Done when: you have three names ranked.</w:t>
+      </w:r>
+    </w:p>
+    <w:p>
+      <w:pPr>
+        <w:pStyle w:val="ListParagraph"/>
+        <w:numPr>
+          <w:ilvl w:val="0"/>
+          <w:numId w:val="4"/>
+        </w:numPr>
+        <w:spacing w:after="120" w:line="276"/>
+      </w:pPr>
+      <w:r>
+        <w:rPr>
+          <w:b/>
+          <w:bCs/>
+        </w:rPr>
+        <w:t xml:space="preserve">Write the name exactly as it should appear.</w:t>
+      </w:r>
+      <w:r>
+        <w:t xml:space="preserve"> Lock the capitalization, spacing, punctuation, and singular-or-plural form. Why it matters: consistency across Shopify, your domain, email, social profiles, invoices, and future materials keeps you looking professional and findable. Done when: you have the exact written form of your name. (You will connect the domain and email in later steps — not here.)</w:t>
+      </w:r>
+    </w:p>
+    <w:p>
+      <w:pPr>
+        <w:pStyle w:val="ListParagraph"/>
+        <w:numPr>
+          <w:ilvl w:val="0"/>
+          <w:numId w:val="4"/>
+        </w:numPr>
+        <w:spacing w:after="120" w:line="276"/>
+      </w:pPr>
+      <w:r>
+        <w:rPr>
+          <w:b/>
+          <w:bCs/>
+        </w:rPr>
+        <w:t xml:space="preserve">Record what still needs legal confirmation.</w:t>
+      </w:r>
+      <w:r>
+        <w:t xml:space="preserve"> Choosing a store name is not the same as registering a business or clearing a trademark. This guide helps you make a practical naming decision. Business registration, assumed names, trademarks, and legal clearance are separate steps that may require official searches or professional advice. Why it matters: knowing the boundary protects you from assuming a usable name is a legally cleared one. Done when: you have written down which legal checks, if any, you still intend to do.</w:t>
       </w:r>
     </w:p>
     <w:p>
@@ -3295,20 +3346,28 @@
         <w:spacing w:after="100" w:before="200"/>
       </w:pPr>
       <w:r>
-        <w:t xml:space="preserve">Screenshots needed</w:t>
-      </w:r>
-    </w:p>
-    <w:p>
-      <w:pPr>
-        <w:pStyle w:val="ListParagraph"/>
-        <w:numPr>
-          <w:ilvl w:val="0"/>
-          <w:numId w:val="1"/>
-        </w:numPr>
-        <w:spacing w:after="80" w:line="276"/>
-      </w:pPr>
-      <w:r>
-        <w:t xml:space="preserve">Chapters 1 and 2 do not require screenshots. Screenshot placeholders ([INSERT SCREENSHOT]) begin in later chapters (account creation, settings, product pages, checkout, and so on).</w:t>
+        <w:t xml:space="preserve">Real example: Lucid Creations</w:t>
+      </w:r>
+    </w:p>
+    <w:p>
+      <w:pPr>
+        <w:spacing w:after="140" w:line="276"/>
+      </w:pPr>
+      <w:r>
+        <w:t xml:space="preserve">Lucid Creations is the Shopify product-store branch under Auralis Digital. The name supports art, apparel, home décor, handmade pieces, commissions, and related creative products — it is broader than any single product category, while still communicating a creative, imaginative identity. That breadth means the store can grow without the name working against it.</w:t>
+      </w:r>
+    </w:p>
+    <w:p>
+      <w:pPr>
+        <w:spacing w:after="140" w:line="276"/>
+      </w:pPr>
+      <w:r>
+        <w:rPr>
+          <w:i/>
+          <w:iCs/>
+          <w:color w:val="9A6A00"/>
+        </w:rPr>
+        <w:t xml:space="preserve">[INSERT LUCID CREATIONS NAMING EXAMPLE] — why “Lucid Creations” was chosen, what other names were considered (if any), whether the name ever caused confusion, and what would be done differently today. Do not claim the name is legally protected, trademarked, or commercially proven.</w:t>
       </w:r>
     </w:p>
     <w:p>
@@ -3317,46 +3376,37 @@
         <w:spacing w:after="100" w:before="200"/>
       </w:pPr>
       <w:r>
-        <w:t xml:space="preserve">Claims to verify</w:t>
-      </w:r>
-    </w:p>
-    <w:p>
-      <w:pPr>
-        <w:pStyle w:val="ListParagraph"/>
-        <w:numPr>
-          <w:ilvl w:val="0"/>
-          <w:numId w:val="1"/>
-        </w:numPr>
-        <w:spacing w:after="80" w:line="276"/>
-      </w:pPr>
-      <w:r>
-        <w:t xml:space="preserve">Confirm the list of product types Shopify supports matches how you want to present it.</w:t>
-      </w:r>
-    </w:p>
-    <w:p>
-      <w:pPr>
-        <w:pStyle w:val="ListParagraph"/>
-        <w:numPr>
-          <w:ilvl w:val="0"/>
-          <w:numId w:val="1"/>
-        </w:numPr>
-        <w:spacing w:after="80" w:line="276"/>
-      </w:pPr>
-      <w:r>
-        <w:t xml:space="preserve">Confirm the Lucid Creations positioning summary in Chapter 2 (psychedelic art, electronic music, festival culture, sacred geometry, alternative design; apparel, blankets, tapestries, wall art, accessories) matches how you want Lucid described.</w:t>
-      </w:r>
-    </w:p>
-    <w:p>
-      <w:pPr>
-        <w:pStyle w:val="ListParagraph"/>
-        <w:numPr>
-          <w:ilvl w:val="0"/>
-          <w:numId w:val="1"/>
-        </w:numPr>
-        <w:spacing w:after="80" w:line="276"/>
-      </w:pPr>
-      <w:r>
-        <w:t xml:space="preserve">Verify any Shopify-specific setting names against the current interface before publishing (flagged with [VERIFY CURRENT SHOPIFY SETTING] in later chapters).</w:t>
+        <w:t xml:space="preserve">Common mistake</w:t>
+      </w:r>
+    </w:p>
+    <w:p>
+      <w:pPr>
+        <w:spacing w:after="140" w:line="276"/>
+      </w:pPr>
+      <w:r>
+        <w:rPr>
+          <w:b/>
+          <w:bCs/>
+        </w:rPr>
+        <w:t xml:space="preserve">⚠ Choosing a name that describes only the first product. </w:t>
+      </w:r>
+      <w:r>
+        <w:t xml:space="preserve">A store called “Custom Mushroom Tapestries” may feel perfect at launch, then become a problem if the owner later adds apparel, jewelry, prints, or commissions.</w:t>
+      </w:r>
+    </w:p>
+    <w:p>
+      <w:pPr>
+        <w:spacing w:after="140" w:line="276"/>
+      </w:pPr>
+      <w:r>
+        <w:rPr>
+          <w:b/>
+          <w:bCs/>
+        </w:rPr>
+        <w:t xml:space="preserve">Instead: </w:t>
+      </w:r>
+      <w:r>
+        <w:t xml:space="preserve">be specific where it helps, but avoid unnecessary restriction. A name that boxes you into one product creates avoidable rebranding work down the road.</w:t>
       </w:r>
     </w:p>
     <w:p>
@@ -3365,6 +3415,2145 @@
         <w:spacing w:after="100" w:before="200"/>
       </w:pPr>
       <w:r>
+        <w:t xml:space="preserve">Reality check</w:t>
+      </w:r>
+    </w:p>
+    <w:p>
+      <w:pPr>
+        <w:spacing w:after="140" w:line="276"/>
+      </w:pPr>
+      <w:r>
+        <w:t xml:space="preserve">A good store name does not need to explain the entire business. It needs to be usable, memorable, and broad enough for the direction you realistically expect to take.</w:t>
+      </w:r>
+    </w:p>
+    <w:p>
+      <w:pPr>
+        <w:pStyle w:val="Heading2"/>
+        <w:spacing w:after="100" w:before="200"/>
+      </w:pPr>
+      <w:r>
+        <w:t xml:space="preserve">Checklist</w:t>
+      </w:r>
+    </w:p>
+    <w:p>
+      <w:pPr>
+        <w:spacing w:after="70" w:line="276"/>
+        <w:ind w:left="200"/>
+      </w:pPr>
+      <w:r>
+        <w:t xml:space="preserve">☐  I reviewed my offer statement before naming the store.</w:t>
+      </w:r>
+    </w:p>
+    <w:p>
+      <w:pPr>
+        <w:spacing w:after="70" w:line="276"/>
+        <w:ind w:left="200"/>
+      </w:pPr>
+      <w:r>
+        <w:t xml:space="preserve">☐  I created at least five possible names.</w:t>
+      </w:r>
+    </w:p>
+    <w:p>
+      <w:pPr>
+        <w:spacing w:after="70" w:line="276"/>
+        <w:ind w:left="200"/>
+      </w:pPr>
+      <w:r>
+        <w:t xml:space="preserve">☐  I removed names that are difficult, confusing, or too restrictive.</w:t>
+      </w:r>
+    </w:p>
+    <w:p>
+      <w:pPr>
+        <w:spacing w:after="70" w:line="276"/>
+        <w:ind w:left="200"/>
+      </w:pPr>
+      <w:r>
+        <w:t xml:space="preserve">☐  I completed a basic web, domain, and name-availability check.</w:t>
+      </w:r>
+    </w:p>
+    <w:p>
+      <w:pPr>
+        <w:spacing w:after="70" w:line="276"/>
+        <w:ind w:left="200"/>
+      </w:pPr>
+      <w:r>
+        <w:t xml:space="preserve">☐  I selected one preferred name and two backups.</w:t>
+      </w:r>
+    </w:p>
+    <w:p>
+      <w:pPr>
+        <w:spacing w:after="70" w:line="276"/>
+        <w:ind w:left="200"/>
+      </w:pPr>
+      <w:r>
+        <w:t xml:space="preserve">☐  I wrote the exact capitalization and spelling.</w:t>
+      </w:r>
+    </w:p>
+    <w:p>
+      <w:pPr>
+        <w:spacing w:after="70" w:line="276"/>
+        <w:ind w:left="200"/>
+      </w:pPr>
+      <w:r>
+        <w:t xml:space="preserve">☐  I understand that this is not legal or trademark clearance.</w:t>
+      </w:r>
+    </w:p>
+    <w:p>
+      <w:pPr>
+        <w:pStyle w:val="Heading2"/>
+        <w:spacing w:after="100" w:before="200"/>
+      </w:pPr>
+      <w:r>
+        <w:t xml:space="preserve">Before you continue</w:t>
+      </w:r>
+    </w:p>
+    <w:p>
+      <w:pPr>
+        <w:spacing w:after="140" w:line="276"/>
+      </w:pPr>
+      <w:r>
+        <w:t xml:space="preserve">Answer these three questions honestly before moving on:</w:t>
+      </w:r>
+    </w:p>
+    <w:p>
+      <w:pPr>
+        <w:spacing w:after="70" w:line="276"/>
+        <w:ind w:left="200"/>
+      </w:pPr>
+      <w:r>
+        <w:t xml:space="preserve">☐  Did I complete this step?</w:t>
+      </w:r>
+    </w:p>
+    <w:p>
+      <w:pPr>
+        <w:spacing w:after="70" w:line="276"/>
+        <w:ind w:left="200"/>
+      </w:pPr>
+      <w:r>
+        <w:t xml:space="preserve">☐  Does this name fit what I sell and the customer I chose?</w:t>
+      </w:r>
+    </w:p>
+    <w:p>
+      <w:pPr>
+        <w:spacing w:after="70" w:line="276"/>
+        <w:ind w:left="200"/>
+      </w:pPr>
+      <w:r>
+        <w:t xml:space="preserve">☐  Is the name usable without creating an obvious launch problem?</w:t>
+      </w:r>
+    </w:p>
+    <w:p>
+      <w:pPr>
+        <w:pStyle w:val="Heading2"/>
+        <w:spacing w:after="100" w:before="200"/>
+      </w:pPr>
+      <w:r>
+        <w:t xml:space="preserve">Tools and official links</w:t>
+      </w:r>
+    </w:p>
+    <w:p>
+      <w:pPr>
+        <w:pStyle w:val="ListParagraph"/>
+        <w:numPr>
+          <w:ilvl w:val="0"/>
+          <w:numId w:val="1"/>
+        </w:numPr>
+        <w:spacing w:after="80" w:line="276"/>
+      </w:pPr>
+      <w:r>
+        <w:t xml:space="preserve">Worksheet: Store Name Shortlist (below)</w:t>
+      </w:r>
+    </w:p>
+    <w:p>
+      <w:pPr>
+        <w:spacing w:after="140" w:line="276"/>
+      </w:pPr>
+      <w:r>
+        <w:rPr>
+          <w:i/>
+          <w:iCs/>
+          <w:color w:val="9A6A00"/>
+        </w:rPr>
+        <w:t xml:space="preserve">[ADD OFFICIAL SHOPIFY LINK]</w:t>
+      </w:r>
+    </w:p>
+    <w:p>
+      <w:pPr>
+        <w:spacing w:after="140" w:line="276"/>
+      </w:pPr>
+      <w:r>
+        <w:rPr>
+          <w:i/>
+          <w:iCs/>
+          <w:color w:val="9A6A00"/>
+        </w:rPr>
+        <w:t xml:space="preserve">[ADD OFFICIAL STATE BUSINESS SEARCH LINK]</w:t>
+      </w:r>
+    </w:p>
+    <w:p>
+      <w:pPr>
+        <w:spacing w:after="140" w:line="276"/>
+      </w:pPr>
+      <w:r>
+        <w:rPr>
+          <w:i/>
+          <w:iCs/>
+          <w:color w:val="9A6A00"/>
+        </w:rPr>
+        <w:t xml:space="preserve">[ADD OFFICIAL USPTO SEARCH LINK]</w:t>
+      </w:r>
+    </w:p>
+    <w:p>
+      <w:pPr>
+        <w:spacing w:after="140" w:line="276"/>
+      </w:pPr>
+      <w:r>
+        <w:rPr>
+          <w:i/>
+          <w:iCs/>
+          <w:color w:val="9A6A00"/>
+        </w:rPr>
+        <w:t xml:space="preserve">[ADD OFFICIAL DOMAIN SEARCH LINK]</w:t>
+      </w:r>
+    </w:p>
+    <w:p>
+      <w:r>
+        <w:br w:type="page"/>
+      </w:r>
+    </w:p>
+    <w:p>
+      <w:pPr>
+        <w:pStyle w:val="Heading1"/>
+        <w:spacing w:after="160" w:before="240"/>
+      </w:pPr>
+      <w:r>
+        <w:t xml:space="preserve">Worksheet: Store Name Shortlist</w:t>
+      </w:r>
+    </w:p>
+    <w:p>
+      <w:pPr>
+        <w:spacing w:after="140" w:line="276"/>
+      </w:pPr>
+      <w:r>
+        <w:t xml:space="preserve">Use this one-page worksheet to choose your store name. It works printed or completed on a screen.</w:t>
+      </w:r>
+    </w:p>
+    <w:p>
+      <w:pPr>
+        <w:spacing w:after="40"/>
+      </w:pPr>
+      <w:r>
+        <w:rPr>
+          <w:b/>
+          <w:bCs/>
+        </w:rPr>
+        <w:t xml:space="preserve">My offer statement (from Chapter 2)</w:t>
+      </w:r>
+    </w:p>
+    <w:p>
+      <w:pPr>
+        <w:pBdr>
+          <w:bottom w:val="single" w:color="999999" w:sz="6" w:space="1"/>
+        </w:pBdr>
+        <w:spacing w:after="220"/>
+      </w:pPr>
+      <w:r>
+        <w:t xml:space="preserve"/>
+      </w:r>
+    </w:p>
+    <w:p>
+      <w:pPr>
+        <w:spacing w:after="40"/>
+      </w:pPr>
+      <w:r>
+        <w:rPr>
+          <w:b/>
+          <w:bCs/>
+        </w:rPr>
+        <w:t xml:space="preserve">Name ideas</w:t>
+      </w:r>
+    </w:p>
+    <w:tbl>
+      <w:tblPr>
+        <w:tblW w:type="dxa" w:w="9360"/>
+        <w:tblBorders>
+          <w:top w:val="single" w:color="auto" w:sz="4"/>
+          <w:left w:val="single" w:color="auto" w:sz="4"/>
+          <w:bottom w:val="single" w:color="auto" w:sz="4"/>
+          <w:right w:val="single" w:color="auto" w:sz="4"/>
+          <w:insideH w:val="single" w:color="auto" w:sz="4"/>
+          <w:insideV w:val="single" w:color="auto" w:sz="4"/>
+        </w:tblBorders>
+      </w:tblPr>
+      <w:tblGrid>
+        <w:gridCol w:w="1860"/>
+        <w:gridCol w:w="1250"/>
+        <w:gridCol w:w="1250"/>
+        <w:gridCol w:w="1250"/>
+        <w:gridCol w:w="1250"/>
+        <w:gridCol w:w="1250"/>
+        <w:gridCol w:w="1250"/>
+      </w:tblGrid>
+      <w:tr>
+        <w:trPr>
+          <w:tblHeader/>
+        </w:trPr>
+        <w:tc>
+          <w:tcPr>
+            <w:tcW w:type="dxa" w:w="1860"/>
+            <w:shd w:fill="EEEEEE" w:color="auto" w:val="clear"/>
+            <w:tcMar>
+              <w:top w:type="dxa" w:w="60"/>
+              <w:left w:type="dxa" w:w="70"/>
+              <w:bottom w:type="dxa" w:w="60"/>
+              <w:right w:type="dxa" w:w="70"/>
+            </w:tcMar>
+          </w:tcPr>
+          <w:p>
+            <w:r>
+              <w:rPr>
+                <w:b/>
+                <w:bCs/>
+                <w:sz w:val="15"/>
+                <w:szCs w:val="15"/>
+              </w:rPr>
+              <w:t xml:space="preserve">Name</w:t>
+            </w:r>
+          </w:p>
+        </w:tc>
+        <w:tc>
+          <w:tcPr>
+            <w:tcW w:type="dxa" w:w="1250"/>
+            <w:shd w:fill="EEEEEE" w:color="auto" w:val="clear"/>
+            <w:tcMar>
+              <w:top w:type="dxa" w:w="60"/>
+              <w:left w:type="dxa" w:w="70"/>
+              <w:bottom w:type="dxa" w:w="60"/>
+              <w:right w:type="dxa" w:w="70"/>
+            </w:tcMar>
+          </w:tcPr>
+          <w:p>
+            <w:r>
+              <w:rPr>
+                <w:b/>
+                <w:bCs/>
+                <w:sz w:val="15"/>
+                <w:szCs w:val="15"/>
+              </w:rPr>
+              <w:t xml:space="preserve">Easy to spell?</w:t>
+            </w:r>
+          </w:p>
+        </w:tc>
+        <w:tc>
+          <w:tcPr>
+            <w:tcW w:type="dxa" w:w="1250"/>
+            <w:shd w:fill="EEEEEE" w:color="auto" w:val="clear"/>
+            <w:tcMar>
+              <w:top w:type="dxa" w:w="60"/>
+              <w:left w:type="dxa" w:w="70"/>
+              <w:bottom w:type="dxa" w:w="60"/>
+              <w:right w:type="dxa" w:w="70"/>
+            </w:tcMar>
+          </w:tcPr>
+          <w:p>
+            <w:r>
+              <w:rPr>
+                <w:b/>
+                <w:bCs/>
+                <w:sz w:val="15"/>
+                <w:szCs w:val="15"/>
+              </w:rPr>
+              <w:t xml:space="preserve">Easy to say?</w:t>
+            </w:r>
+          </w:p>
+        </w:tc>
+        <w:tc>
+          <w:tcPr>
+            <w:tcW w:type="dxa" w:w="1250"/>
+            <w:shd w:fill="EEEEEE" w:color="auto" w:val="clear"/>
+            <w:tcMar>
+              <w:top w:type="dxa" w:w="60"/>
+              <w:left w:type="dxa" w:w="70"/>
+              <w:bottom w:type="dxa" w:w="60"/>
+              <w:right w:type="dxa" w:w="70"/>
+            </w:tcMar>
+          </w:tcPr>
+          <w:p>
+            <w:r>
+              <w:rPr>
+                <w:b/>
+                <w:bCs/>
+                <w:sz w:val="15"/>
+                <w:szCs w:val="15"/>
+              </w:rPr>
+              <w:t xml:space="preserve">Fits the offer?</w:t>
+            </w:r>
+          </w:p>
+        </w:tc>
+        <w:tc>
+          <w:tcPr>
+            <w:tcW w:type="dxa" w:w="1250"/>
+            <w:shd w:fill="EEEEEE" w:color="auto" w:val="clear"/>
+            <w:tcMar>
+              <w:top w:type="dxa" w:w="60"/>
+              <w:left w:type="dxa" w:w="70"/>
+              <w:bottom w:type="dxa" w:w="60"/>
+              <w:right w:type="dxa" w:w="70"/>
+            </w:tcMar>
+          </w:tcPr>
+          <w:p>
+            <w:r>
+              <w:rPr>
+                <w:b/>
+                <w:bCs/>
+                <w:sz w:val="15"/>
+                <w:szCs w:val="15"/>
+              </w:rPr>
+              <w:t xml:space="preserve">Broad enough to grow?</w:t>
+            </w:r>
+          </w:p>
+        </w:tc>
+        <w:tc>
+          <w:tcPr>
+            <w:tcW w:type="dxa" w:w="1250"/>
+            <w:shd w:fill="EEEEEE" w:color="auto" w:val="clear"/>
+            <w:tcMar>
+              <w:top w:type="dxa" w:w="60"/>
+              <w:left w:type="dxa" w:w="70"/>
+              <w:bottom w:type="dxa" w:w="60"/>
+              <w:right w:type="dxa" w:w="70"/>
+            </w:tcMar>
+          </w:tcPr>
+          <w:p>
+            <w:r>
+              <w:rPr>
+                <w:b/>
+                <w:bCs/>
+                <w:sz w:val="15"/>
+                <w:szCs w:val="15"/>
+              </w:rPr>
+              <w:t xml:space="preserve">Availability checked?</w:t>
+            </w:r>
+          </w:p>
+        </w:tc>
+        <w:tc>
+          <w:tcPr>
+            <w:tcW w:type="dxa" w:w="1250"/>
+            <w:shd w:fill="EEEEEE" w:color="auto" w:val="clear"/>
+            <w:tcMar>
+              <w:top w:type="dxa" w:w="60"/>
+              <w:left w:type="dxa" w:w="70"/>
+              <w:bottom w:type="dxa" w:w="60"/>
+              <w:right w:type="dxa" w:w="70"/>
+            </w:tcMar>
+          </w:tcPr>
+          <w:p>
+            <w:r>
+              <w:rPr>
+                <w:b/>
+                <w:bCs/>
+                <w:sz w:val="15"/>
+                <w:szCs w:val="15"/>
+              </w:rPr>
+              <w:t xml:space="preserve">Keep or remove?</w:t>
+            </w:r>
+          </w:p>
+        </w:tc>
+      </w:tr>
+      <w:tr>
+        <w:tc>
+          <w:tcPr>
+            <w:tcW w:type="dxa" w:w="1860"/>
+            <w:tcMar>
+              <w:top w:type="dxa" w:w="150"/>
+              <w:left w:type="dxa" w:w="70"/>
+              <w:bottom w:type="dxa" w:w="150"/>
+              <w:right w:type="dxa" w:w="70"/>
+            </w:tcMar>
+          </w:tcPr>
+          <w:p>
+            <w:r>
+              <w:t xml:space="preserve"/>
+            </w:r>
+          </w:p>
+        </w:tc>
+        <w:tc>
+          <w:tcPr>
+            <w:tcW w:type="dxa" w:w="1250"/>
+            <w:tcMar>
+              <w:top w:type="dxa" w:w="150"/>
+              <w:left w:type="dxa" w:w="70"/>
+              <w:bottom w:type="dxa" w:w="150"/>
+              <w:right w:type="dxa" w:w="70"/>
+            </w:tcMar>
+          </w:tcPr>
+          <w:p>
+            <w:r>
+              <w:t xml:space="preserve"/>
+            </w:r>
+          </w:p>
+        </w:tc>
+        <w:tc>
+          <w:tcPr>
+            <w:tcW w:type="dxa" w:w="1250"/>
+            <w:tcMar>
+              <w:top w:type="dxa" w:w="150"/>
+              <w:left w:type="dxa" w:w="70"/>
+              <w:bottom w:type="dxa" w:w="150"/>
+              <w:right w:type="dxa" w:w="70"/>
+            </w:tcMar>
+          </w:tcPr>
+          <w:p>
+            <w:r>
+              <w:t xml:space="preserve"/>
+            </w:r>
+          </w:p>
+        </w:tc>
+        <w:tc>
+          <w:tcPr>
+            <w:tcW w:type="dxa" w:w="1250"/>
+            <w:tcMar>
+              <w:top w:type="dxa" w:w="150"/>
+              <w:left w:type="dxa" w:w="70"/>
+              <w:bottom w:type="dxa" w:w="150"/>
+              <w:right w:type="dxa" w:w="70"/>
+            </w:tcMar>
+          </w:tcPr>
+          <w:p>
+            <w:r>
+              <w:t xml:space="preserve"/>
+            </w:r>
+          </w:p>
+        </w:tc>
+        <w:tc>
+          <w:tcPr>
+            <w:tcW w:type="dxa" w:w="1250"/>
+            <w:tcMar>
+              <w:top w:type="dxa" w:w="150"/>
+              <w:left w:type="dxa" w:w="70"/>
+              <w:bottom w:type="dxa" w:w="150"/>
+              <w:right w:type="dxa" w:w="70"/>
+            </w:tcMar>
+          </w:tcPr>
+          <w:p>
+            <w:r>
+              <w:t xml:space="preserve"/>
+            </w:r>
+          </w:p>
+        </w:tc>
+        <w:tc>
+          <w:tcPr>
+            <w:tcW w:type="dxa" w:w="1250"/>
+            <w:tcMar>
+              <w:top w:type="dxa" w:w="150"/>
+              <w:left w:type="dxa" w:w="70"/>
+              <w:bottom w:type="dxa" w:w="150"/>
+              <w:right w:type="dxa" w:w="70"/>
+            </w:tcMar>
+          </w:tcPr>
+          <w:p>
+            <w:r>
+              <w:t xml:space="preserve"/>
+            </w:r>
+          </w:p>
+        </w:tc>
+        <w:tc>
+          <w:tcPr>
+            <w:tcW w:type="dxa" w:w="1250"/>
+            <w:tcMar>
+              <w:top w:type="dxa" w:w="150"/>
+              <w:left w:type="dxa" w:w="70"/>
+              <w:bottom w:type="dxa" w:w="150"/>
+              <w:right w:type="dxa" w:w="70"/>
+            </w:tcMar>
+          </w:tcPr>
+          <w:p>
+            <w:r>
+              <w:t xml:space="preserve"/>
+            </w:r>
+          </w:p>
+        </w:tc>
+      </w:tr>
+      <w:tr>
+        <w:tc>
+          <w:tcPr>
+            <w:tcW w:type="dxa" w:w="1860"/>
+            <w:tcMar>
+              <w:top w:type="dxa" w:w="150"/>
+              <w:left w:type="dxa" w:w="70"/>
+              <w:bottom w:type="dxa" w:w="150"/>
+              <w:right w:type="dxa" w:w="70"/>
+            </w:tcMar>
+          </w:tcPr>
+          <w:p>
+            <w:r>
+              <w:t xml:space="preserve"/>
+            </w:r>
+          </w:p>
+        </w:tc>
+        <w:tc>
+          <w:tcPr>
+            <w:tcW w:type="dxa" w:w="1250"/>
+            <w:tcMar>
+              <w:top w:type="dxa" w:w="150"/>
+              <w:left w:type="dxa" w:w="70"/>
+              <w:bottom w:type="dxa" w:w="150"/>
+              <w:right w:type="dxa" w:w="70"/>
+            </w:tcMar>
+          </w:tcPr>
+          <w:p>
+            <w:r>
+              <w:t xml:space="preserve"/>
+            </w:r>
+          </w:p>
+        </w:tc>
+        <w:tc>
+          <w:tcPr>
+            <w:tcW w:type="dxa" w:w="1250"/>
+            <w:tcMar>
+              <w:top w:type="dxa" w:w="150"/>
+              <w:left w:type="dxa" w:w="70"/>
+              <w:bottom w:type="dxa" w:w="150"/>
+              <w:right w:type="dxa" w:w="70"/>
+            </w:tcMar>
+          </w:tcPr>
+          <w:p>
+            <w:r>
+              <w:t xml:space="preserve"/>
+            </w:r>
+          </w:p>
+        </w:tc>
+        <w:tc>
+          <w:tcPr>
+            <w:tcW w:type="dxa" w:w="1250"/>
+            <w:tcMar>
+              <w:top w:type="dxa" w:w="150"/>
+              <w:left w:type="dxa" w:w="70"/>
+              <w:bottom w:type="dxa" w:w="150"/>
+              <w:right w:type="dxa" w:w="70"/>
+            </w:tcMar>
+          </w:tcPr>
+          <w:p>
+            <w:r>
+              <w:t xml:space="preserve"/>
+            </w:r>
+          </w:p>
+        </w:tc>
+        <w:tc>
+          <w:tcPr>
+            <w:tcW w:type="dxa" w:w="1250"/>
+            <w:tcMar>
+              <w:top w:type="dxa" w:w="150"/>
+              <w:left w:type="dxa" w:w="70"/>
+              <w:bottom w:type="dxa" w:w="150"/>
+              <w:right w:type="dxa" w:w="70"/>
+            </w:tcMar>
+          </w:tcPr>
+          <w:p>
+            <w:r>
+              <w:t xml:space="preserve"/>
+            </w:r>
+          </w:p>
+        </w:tc>
+        <w:tc>
+          <w:tcPr>
+            <w:tcW w:type="dxa" w:w="1250"/>
+            <w:tcMar>
+              <w:top w:type="dxa" w:w="150"/>
+              <w:left w:type="dxa" w:w="70"/>
+              <w:bottom w:type="dxa" w:w="150"/>
+              <w:right w:type="dxa" w:w="70"/>
+            </w:tcMar>
+          </w:tcPr>
+          <w:p>
+            <w:r>
+              <w:t xml:space="preserve"/>
+            </w:r>
+          </w:p>
+        </w:tc>
+        <w:tc>
+          <w:tcPr>
+            <w:tcW w:type="dxa" w:w="1250"/>
+            <w:tcMar>
+              <w:top w:type="dxa" w:w="150"/>
+              <w:left w:type="dxa" w:w="70"/>
+              <w:bottom w:type="dxa" w:w="150"/>
+              <w:right w:type="dxa" w:w="70"/>
+            </w:tcMar>
+          </w:tcPr>
+          <w:p>
+            <w:r>
+              <w:t xml:space="preserve"/>
+            </w:r>
+          </w:p>
+        </w:tc>
+      </w:tr>
+      <w:tr>
+        <w:tc>
+          <w:tcPr>
+            <w:tcW w:type="dxa" w:w="1860"/>
+            <w:tcMar>
+              <w:top w:type="dxa" w:w="150"/>
+              <w:left w:type="dxa" w:w="70"/>
+              <w:bottom w:type="dxa" w:w="150"/>
+              <w:right w:type="dxa" w:w="70"/>
+            </w:tcMar>
+          </w:tcPr>
+          <w:p>
+            <w:r>
+              <w:t xml:space="preserve"/>
+            </w:r>
+          </w:p>
+        </w:tc>
+        <w:tc>
+          <w:tcPr>
+            <w:tcW w:type="dxa" w:w="1250"/>
+            <w:tcMar>
+              <w:top w:type="dxa" w:w="150"/>
+              <w:left w:type="dxa" w:w="70"/>
+              <w:bottom w:type="dxa" w:w="150"/>
+              <w:right w:type="dxa" w:w="70"/>
+            </w:tcMar>
+          </w:tcPr>
+          <w:p>
+            <w:r>
+              <w:t xml:space="preserve"/>
+            </w:r>
+          </w:p>
+        </w:tc>
+        <w:tc>
+          <w:tcPr>
+            <w:tcW w:type="dxa" w:w="1250"/>
+            <w:tcMar>
+              <w:top w:type="dxa" w:w="150"/>
+              <w:left w:type="dxa" w:w="70"/>
+              <w:bottom w:type="dxa" w:w="150"/>
+              <w:right w:type="dxa" w:w="70"/>
+            </w:tcMar>
+          </w:tcPr>
+          <w:p>
+            <w:r>
+              <w:t xml:space="preserve"/>
+            </w:r>
+          </w:p>
+        </w:tc>
+        <w:tc>
+          <w:tcPr>
+            <w:tcW w:type="dxa" w:w="1250"/>
+            <w:tcMar>
+              <w:top w:type="dxa" w:w="150"/>
+              <w:left w:type="dxa" w:w="70"/>
+              <w:bottom w:type="dxa" w:w="150"/>
+              <w:right w:type="dxa" w:w="70"/>
+            </w:tcMar>
+          </w:tcPr>
+          <w:p>
+            <w:r>
+              <w:t xml:space="preserve"/>
+            </w:r>
+          </w:p>
+        </w:tc>
+        <w:tc>
+          <w:tcPr>
+            <w:tcW w:type="dxa" w:w="1250"/>
+            <w:tcMar>
+              <w:top w:type="dxa" w:w="150"/>
+              <w:left w:type="dxa" w:w="70"/>
+              <w:bottom w:type="dxa" w:w="150"/>
+              <w:right w:type="dxa" w:w="70"/>
+            </w:tcMar>
+          </w:tcPr>
+          <w:p>
+            <w:r>
+              <w:t xml:space="preserve"/>
+            </w:r>
+          </w:p>
+        </w:tc>
+        <w:tc>
+          <w:tcPr>
+            <w:tcW w:type="dxa" w:w="1250"/>
+            <w:tcMar>
+              <w:top w:type="dxa" w:w="150"/>
+              <w:left w:type="dxa" w:w="70"/>
+              <w:bottom w:type="dxa" w:w="150"/>
+              <w:right w:type="dxa" w:w="70"/>
+            </w:tcMar>
+          </w:tcPr>
+          <w:p>
+            <w:r>
+              <w:t xml:space="preserve"/>
+            </w:r>
+          </w:p>
+        </w:tc>
+        <w:tc>
+          <w:tcPr>
+            <w:tcW w:type="dxa" w:w="1250"/>
+            <w:tcMar>
+              <w:top w:type="dxa" w:w="150"/>
+              <w:left w:type="dxa" w:w="70"/>
+              <w:bottom w:type="dxa" w:w="150"/>
+              <w:right w:type="dxa" w:w="70"/>
+            </w:tcMar>
+          </w:tcPr>
+          <w:p>
+            <w:r>
+              <w:t xml:space="preserve"/>
+            </w:r>
+          </w:p>
+        </w:tc>
+      </w:tr>
+      <w:tr>
+        <w:tc>
+          <w:tcPr>
+            <w:tcW w:type="dxa" w:w="1860"/>
+            <w:tcMar>
+              <w:top w:type="dxa" w:w="150"/>
+              <w:left w:type="dxa" w:w="70"/>
+              <w:bottom w:type="dxa" w:w="150"/>
+              <w:right w:type="dxa" w:w="70"/>
+            </w:tcMar>
+          </w:tcPr>
+          <w:p>
+            <w:r>
+              <w:t xml:space="preserve"/>
+            </w:r>
+          </w:p>
+        </w:tc>
+        <w:tc>
+          <w:tcPr>
+            <w:tcW w:type="dxa" w:w="1250"/>
+            <w:tcMar>
+              <w:top w:type="dxa" w:w="150"/>
+              <w:left w:type="dxa" w:w="70"/>
+              <w:bottom w:type="dxa" w:w="150"/>
+              <w:right w:type="dxa" w:w="70"/>
+            </w:tcMar>
+          </w:tcPr>
+          <w:p>
+            <w:r>
+              <w:t xml:space="preserve"/>
+            </w:r>
+          </w:p>
+        </w:tc>
+        <w:tc>
+          <w:tcPr>
+            <w:tcW w:type="dxa" w:w="1250"/>
+            <w:tcMar>
+              <w:top w:type="dxa" w:w="150"/>
+              <w:left w:type="dxa" w:w="70"/>
+              <w:bottom w:type="dxa" w:w="150"/>
+              <w:right w:type="dxa" w:w="70"/>
+            </w:tcMar>
+          </w:tcPr>
+          <w:p>
+            <w:r>
+              <w:t xml:space="preserve"/>
+            </w:r>
+          </w:p>
+        </w:tc>
+        <w:tc>
+          <w:tcPr>
+            <w:tcW w:type="dxa" w:w="1250"/>
+            <w:tcMar>
+              <w:top w:type="dxa" w:w="150"/>
+              <w:left w:type="dxa" w:w="70"/>
+              <w:bottom w:type="dxa" w:w="150"/>
+              <w:right w:type="dxa" w:w="70"/>
+            </w:tcMar>
+          </w:tcPr>
+          <w:p>
+            <w:r>
+              <w:t xml:space="preserve"/>
+            </w:r>
+          </w:p>
+        </w:tc>
+        <w:tc>
+          <w:tcPr>
+            <w:tcW w:type="dxa" w:w="1250"/>
+            <w:tcMar>
+              <w:top w:type="dxa" w:w="150"/>
+              <w:left w:type="dxa" w:w="70"/>
+              <w:bottom w:type="dxa" w:w="150"/>
+              <w:right w:type="dxa" w:w="70"/>
+            </w:tcMar>
+          </w:tcPr>
+          <w:p>
+            <w:r>
+              <w:t xml:space="preserve"/>
+            </w:r>
+          </w:p>
+        </w:tc>
+        <w:tc>
+          <w:tcPr>
+            <w:tcW w:type="dxa" w:w="1250"/>
+            <w:tcMar>
+              <w:top w:type="dxa" w:w="150"/>
+              <w:left w:type="dxa" w:w="70"/>
+              <w:bottom w:type="dxa" w:w="150"/>
+              <w:right w:type="dxa" w:w="70"/>
+            </w:tcMar>
+          </w:tcPr>
+          <w:p>
+            <w:r>
+              <w:t xml:space="preserve"/>
+            </w:r>
+          </w:p>
+        </w:tc>
+        <w:tc>
+          <w:tcPr>
+            <w:tcW w:type="dxa" w:w="1250"/>
+            <w:tcMar>
+              <w:top w:type="dxa" w:w="150"/>
+              <w:left w:type="dxa" w:w="70"/>
+              <w:bottom w:type="dxa" w:w="150"/>
+              <w:right w:type="dxa" w:w="70"/>
+            </w:tcMar>
+          </w:tcPr>
+          <w:p>
+            <w:r>
+              <w:t xml:space="preserve"/>
+            </w:r>
+          </w:p>
+        </w:tc>
+      </w:tr>
+      <w:tr>
+        <w:tc>
+          <w:tcPr>
+            <w:tcW w:type="dxa" w:w="1860"/>
+            <w:tcMar>
+              <w:top w:type="dxa" w:w="150"/>
+              <w:left w:type="dxa" w:w="70"/>
+              <w:bottom w:type="dxa" w:w="150"/>
+              <w:right w:type="dxa" w:w="70"/>
+            </w:tcMar>
+          </w:tcPr>
+          <w:p>
+            <w:r>
+              <w:t xml:space="preserve"/>
+            </w:r>
+          </w:p>
+        </w:tc>
+        <w:tc>
+          <w:tcPr>
+            <w:tcW w:type="dxa" w:w="1250"/>
+            <w:tcMar>
+              <w:top w:type="dxa" w:w="150"/>
+              <w:left w:type="dxa" w:w="70"/>
+              <w:bottom w:type="dxa" w:w="150"/>
+              <w:right w:type="dxa" w:w="70"/>
+            </w:tcMar>
+          </w:tcPr>
+          <w:p>
+            <w:r>
+              <w:t xml:space="preserve"/>
+            </w:r>
+          </w:p>
+        </w:tc>
+        <w:tc>
+          <w:tcPr>
+            <w:tcW w:type="dxa" w:w="1250"/>
+            <w:tcMar>
+              <w:top w:type="dxa" w:w="150"/>
+              <w:left w:type="dxa" w:w="70"/>
+              <w:bottom w:type="dxa" w:w="150"/>
+              <w:right w:type="dxa" w:w="70"/>
+            </w:tcMar>
+          </w:tcPr>
+          <w:p>
+            <w:r>
+              <w:t xml:space="preserve"/>
+            </w:r>
+          </w:p>
+        </w:tc>
+        <w:tc>
+          <w:tcPr>
+            <w:tcW w:type="dxa" w:w="1250"/>
+            <w:tcMar>
+              <w:top w:type="dxa" w:w="150"/>
+              <w:left w:type="dxa" w:w="70"/>
+              <w:bottom w:type="dxa" w:w="150"/>
+              <w:right w:type="dxa" w:w="70"/>
+            </w:tcMar>
+          </w:tcPr>
+          <w:p>
+            <w:r>
+              <w:t xml:space="preserve"/>
+            </w:r>
+          </w:p>
+        </w:tc>
+        <w:tc>
+          <w:tcPr>
+            <w:tcW w:type="dxa" w:w="1250"/>
+            <w:tcMar>
+              <w:top w:type="dxa" w:w="150"/>
+              <w:left w:type="dxa" w:w="70"/>
+              <w:bottom w:type="dxa" w:w="150"/>
+              <w:right w:type="dxa" w:w="70"/>
+            </w:tcMar>
+          </w:tcPr>
+          <w:p>
+            <w:r>
+              <w:t xml:space="preserve"/>
+            </w:r>
+          </w:p>
+        </w:tc>
+        <w:tc>
+          <w:tcPr>
+            <w:tcW w:type="dxa" w:w="1250"/>
+            <w:tcMar>
+              <w:top w:type="dxa" w:w="150"/>
+              <w:left w:type="dxa" w:w="70"/>
+              <w:bottom w:type="dxa" w:w="150"/>
+              <w:right w:type="dxa" w:w="70"/>
+            </w:tcMar>
+          </w:tcPr>
+          <w:p>
+            <w:r>
+              <w:t xml:space="preserve"/>
+            </w:r>
+          </w:p>
+        </w:tc>
+        <w:tc>
+          <w:tcPr>
+            <w:tcW w:type="dxa" w:w="1250"/>
+            <w:tcMar>
+              <w:top w:type="dxa" w:w="150"/>
+              <w:left w:type="dxa" w:w="70"/>
+              <w:bottom w:type="dxa" w:w="150"/>
+              <w:right w:type="dxa" w:w="70"/>
+            </w:tcMar>
+          </w:tcPr>
+          <w:p>
+            <w:r>
+              <w:t xml:space="preserve"/>
+            </w:r>
+          </w:p>
+        </w:tc>
+      </w:tr>
+      <w:tr>
+        <w:tc>
+          <w:tcPr>
+            <w:tcW w:type="dxa" w:w="1860"/>
+            <w:tcMar>
+              <w:top w:type="dxa" w:w="150"/>
+              <w:left w:type="dxa" w:w="70"/>
+              <w:bottom w:type="dxa" w:w="150"/>
+              <w:right w:type="dxa" w:w="70"/>
+            </w:tcMar>
+          </w:tcPr>
+          <w:p>
+            <w:r>
+              <w:t xml:space="preserve"/>
+            </w:r>
+          </w:p>
+        </w:tc>
+        <w:tc>
+          <w:tcPr>
+            <w:tcW w:type="dxa" w:w="1250"/>
+            <w:tcMar>
+              <w:top w:type="dxa" w:w="150"/>
+              <w:left w:type="dxa" w:w="70"/>
+              <w:bottom w:type="dxa" w:w="150"/>
+              <w:right w:type="dxa" w:w="70"/>
+            </w:tcMar>
+          </w:tcPr>
+          <w:p>
+            <w:r>
+              <w:t xml:space="preserve"/>
+            </w:r>
+          </w:p>
+        </w:tc>
+        <w:tc>
+          <w:tcPr>
+            <w:tcW w:type="dxa" w:w="1250"/>
+            <w:tcMar>
+              <w:top w:type="dxa" w:w="150"/>
+              <w:left w:type="dxa" w:w="70"/>
+              <w:bottom w:type="dxa" w:w="150"/>
+              <w:right w:type="dxa" w:w="70"/>
+            </w:tcMar>
+          </w:tcPr>
+          <w:p>
+            <w:r>
+              <w:t xml:space="preserve"/>
+            </w:r>
+          </w:p>
+        </w:tc>
+        <w:tc>
+          <w:tcPr>
+            <w:tcW w:type="dxa" w:w="1250"/>
+            <w:tcMar>
+              <w:top w:type="dxa" w:w="150"/>
+              <w:left w:type="dxa" w:w="70"/>
+              <w:bottom w:type="dxa" w:w="150"/>
+              <w:right w:type="dxa" w:w="70"/>
+            </w:tcMar>
+          </w:tcPr>
+          <w:p>
+            <w:r>
+              <w:t xml:space="preserve"/>
+            </w:r>
+          </w:p>
+        </w:tc>
+        <w:tc>
+          <w:tcPr>
+            <w:tcW w:type="dxa" w:w="1250"/>
+            <w:tcMar>
+              <w:top w:type="dxa" w:w="150"/>
+              <w:left w:type="dxa" w:w="70"/>
+              <w:bottom w:type="dxa" w:w="150"/>
+              <w:right w:type="dxa" w:w="70"/>
+            </w:tcMar>
+          </w:tcPr>
+          <w:p>
+            <w:r>
+              <w:t xml:space="preserve"/>
+            </w:r>
+          </w:p>
+        </w:tc>
+        <w:tc>
+          <w:tcPr>
+            <w:tcW w:type="dxa" w:w="1250"/>
+            <w:tcMar>
+              <w:top w:type="dxa" w:w="150"/>
+              <w:left w:type="dxa" w:w="70"/>
+              <w:bottom w:type="dxa" w:w="150"/>
+              <w:right w:type="dxa" w:w="70"/>
+            </w:tcMar>
+          </w:tcPr>
+          <w:p>
+            <w:r>
+              <w:t xml:space="preserve"/>
+            </w:r>
+          </w:p>
+        </w:tc>
+        <w:tc>
+          <w:tcPr>
+            <w:tcW w:type="dxa" w:w="1250"/>
+            <w:tcMar>
+              <w:top w:type="dxa" w:w="150"/>
+              <w:left w:type="dxa" w:w="70"/>
+              <w:bottom w:type="dxa" w:w="150"/>
+              <w:right w:type="dxa" w:w="70"/>
+            </w:tcMar>
+          </w:tcPr>
+          <w:p>
+            <w:r>
+              <w:t xml:space="preserve"/>
+            </w:r>
+          </w:p>
+        </w:tc>
+      </w:tr>
+      <w:tr>
+        <w:tc>
+          <w:tcPr>
+            <w:tcW w:type="dxa" w:w="1860"/>
+            <w:tcMar>
+              <w:top w:type="dxa" w:w="150"/>
+              <w:left w:type="dxa" w:w="70"/>
+              <w:bottom w:type="dxa" w:w="150"/>
+              <w:right w:type="dxa" w:w="70"/>
+            </w:tcMar>
+          </w:tcPr>
+          <w:p>
+            <w:r>
+              <w:t xml:space="preserve"/>
+            </w:r>
+          </w:p>
+        </w:tc>
+        <w:tc>
+          <w:tcPr>
+            <w:tcW w:type="dxa" w:w="1250"/>
+            <w:tcMar>
+              <w:top w:type="dxa" w:w="150"/>
+              <w:left w:type="dxa" w:w="70"/>
+              <w:bottom w:type="dxa" w:w="150"/>
+              <w:right w:type="dxa" w:w="70"/>
+            </w:tcMar>
+          </w:tcPr>
+          <w:p>
+            <w:r>
+              <w:t xml:space="preserve"/>
+            </w:r>
+          </w:p>
+        </w:tc>
+        <w:tc>
+          <w:tcPr>
+            <w:tcW w:type="dxa" w:w="1250"/>
+            <w:tcMar>
+              <w:top w:type="dxa" w:w="150"/>
+              <w:left w:type="dxa" w:w="70"/>
+              <w:bottom w:type="dxa" w:w="150"/>
+              <w:right w:type="dxa" w:w="70"/>
+            </w:tcMar>
+          </w:tcPr>
+          <w:p>
+            <w:r>
+              <w:t xml:space="preserve"/>
+            </w:r>
+          </w:p>
+        </w:tc>
+        <w:tc>
+          <w:tcPr>
+            <w:tcW w:type="dxa" w:w="1250"/>
+            <w:tcMar>
+              <w:top w:type="dxa" w:w="150"/>
+              <w:left w:type="dxa" w:w="70"/>
+              <w:bottom w:type="dxa" w:w="150"/>
+              <w:right w:type="dxa" w:w="70"/>
+            </w:tcMar>
+          </w:tcPr>
+          <w:p>
+            <w:r>
+              <w:t xml:space="preserve"/>
+            </w:r>
+          </w:p>
+        </w:tc>
+        <w:tc>
+          <w:tcPr>
+            <w:tcW w:type="dxa" w:w="1250"/>
+            <w:tcMar>
+              <w:top w:type="dxa" w:w="150"/>
+              <w:left w:type="dxa" w:w="70"/>
+              <w:bottom w:type="dxa" w:w="150"/>
+              <w:right w:type="dxa" w:w="70"/>
+            </w:tcMar>
+          </w:tcPr>
+          <w:p>
+            <w:r>
+              <w:t xml:space="preserve"/>
+            </w:r>
+          </w:p>
+        </w:tc>
+        <w:tc>
+          <w:tcPr>
+            <w:tcW w:type="dxa" w:w="1250"/>
+            <w:tcMar>
+              <w:top w:type="dxa" w:w="150"/>
+              <w:left w:type="dxa" w:w="70"/>
+              <w:bottom w:type="dxa" w:w="150"/>
+              <w:right w:type="dxa" w:w="70"/>
+            </w:tcMar>
+          </w:tcPr>
+          <w:p>
+            <w:r>
+              <w:t xml:space="preserve"/>
+            </w:r>
+          </w:p>
+        </w:tc>
+        <w:tc>
+          <w:tcPr>
+            <w:tcW w:type="dxa" w:w="1250"/>
+            <w:tcMar>
+              <w:top w:type="dxa" w:w="150"/>
+              <w:left w:type="dxa" w:w="70"/>
+              <w:bottom w:type="dxa" w:w="150"/>
+              <w:right w:type="dxa" w:w="70"/>
+            </w:tcMar>
+          </w:tcPr>
+          <w:p>
+            <w:r>
+              <w:t xml:space="preserve"/>
+            </w:r>
+          </w:p>
+        </w:tc>
+      </w:tr>
+      <w:tr>
+        <w:tc>
+          <w:tcPr>
+            <w:tcW w:type="dxa" w:w="1860"/>
+            <w:tcMar>
+              <w:top w:type="dxa" w:w="150"/>
+              <w:left w:type="dxa" w:w="70"/>
+              <w:bottom w:type="dxa" w:w="150"/>
+              <w:right w:type="dxa" w:w="70"/>
+            </w:tcMar>
+          </w:tcPr>
+          <w:p>
+            <w:r>
+              <w:t xml:space="preserve"/>
+            </w:r>
+          </w:p>
+        </w:tc>
+        <w:tc>
+          <w:tcPr>
+            <w:tcW w:type="dxa" w:w="1250"/>
+            <w:tcMar>
+              <w:top w:type="dxa" w:w="150"/>
+              <w:left w:type="dxa" w:w="70"/>
+              <w:bottom w:type="dxa" w:w="150"/>
+              <w:right w:type="dxa" w:w="70"/>
+            </w:tcMar>
+          </w:tcPr>
+          <w:p>
+            <w:r>
+              <w:t xml:space="preserve"/>
+            </w:r>
+          </w:p>
+        </w:tc>
+        <w:tc>
+          <w:tcPr>
+            <w:tcW w:type="dxa" w:w="1250"/>
+            <w:tcMar>
+              <w:top w:type="dxa" w:w="150"/>
+              <w:left w:type="dxa" w:w="70"/>
+              <w:bottom w:type="dxa" w:w="150"/>
+              <w:right w:type="dxa" w:w="70"/>
+            </w:tcMar>
+          </w:tcPr>
+          <w:p>
+            <w:r>
+              <w:t xml:space="preserve"/>
+            </w:r>
+          </w:p>
+        </w:tc>
+        <w:tc>
+          <w:tcPr>
+            <w:tcW w:type="dxa" w:w="1250"/>
+            <w:tcMar>
+              <w:top w:type="dxa" w:w="150"/>
+              <w:left w:type="dxa" w:w="70"/>
+              <w:bottom w:type="dxa" w:w="150"/>
+              <w:right w:type="dxa" w:w="70"/>
+            </w:tcMar>
+          </w:tcPr>
+          <w:p>
+            <w:r>
+              <w:t xml:space="preserve"/>
+            </w:r>
+          </w:p>
+        </w:tc>
+        <w:tc>
+          <w:tcPr>
+            <w:tcW w:type="dxa" w:w="1250"/>
+            <w:tcMar>
+              <w:top w:type="dxa" w:w="150"/>
+              <w:left w:type="dxa" w:w="70"/>
+              <w:bottom w:type="dxa" w:w="150"/>
+              <w:right w:type="dxa" w:w="70"/>
+            </w:tcMar>
+          </w:tcPr>
+          <w:p>
+            <w:r>
+              <w:t xml:space="preserve"/>
+            </w:r>
+          </w:p>
+        </w:tc>
+        <w:tc>
+          <w:tcPr>
+            <w:tcW w:type="dxa" w:w="1250"/>
+            <w:tcMar>
+              <w:top w:type="dxa" w:w="150"/>
+              <w:left w:type="dxa" w:w="70"/>
+              <w:bottom w:type="dxa" w:w="150"/>
+              <w:right w:type="dxa" w:w="70"/>
+            </w:tcMar>
+          </w:tcPr>
+          <w:p>
+            <w:r>
+              <w:t xml:space="preserve"/>
+            </w:r>
+          </w:p>
+        </w:tc>
+        <w:tc>
+          <w:tcPr>
+            <w:tcW w:type="dxa" w:w="1250"/>
+            <w:tcMar>
+              <w:top w:type="dxa" w:w="150"/>
+              <w:left w:type="dxa" w:w="70"/>
+              <w:bottom w:type="dxa" w:w="150"/>
+              <w:right w:type="dxa" w:w="70"/>
+            </w:tcMar>
+          </w:tcPr>
+          <w:p>
+            <w:r>
+              <w:t xml:space="preserve"/>
+            </w:r>
+          </w:p>
+        </w:tc>
+      </w:tr>
+      <w:tr>
+        <w:tc>
+          <w:tcPr>
+            <w:tcW w:type="dxa" w:w="1860"/>
+            <w:tcMar>
+              <w:top w:type="dxa" w:w="150"/>
+              <w:left w:type="dxa" w:w="70"/>
+              <w:bottom w:type="dxa" w:w="150"/>
+              <w:right w:type="dxa" w:w="70"/>
+            </w:tcMar>
+          </w:tcPr>
+          <w:p>
+            <w:r>
+              <w:t xml:space="preserve"/>
+            </w:r>
+          </w:p>
+        </w:tc>
+        <w:tc>
+          <w:tcPr>
+            <w:tcW w:type="dxa" w:w="1250"/>
+            <w:tcMar>
+              <w:top w:type="dxa" w:w="150"/>
+              <w:left w:type="dxa" w:w="70"/>
+              <w:bottom w:type="dxa" w:w="150"/>
+              <w:right w:type="dxa" w:w="70"/>
+            </w:tcMar>
+          </w:tcPr>
+          <w:p>
+            <w:r>
+              <w:t xml:space="preserve"/>
+            </w:r>
+          </w:p>
+        </w:tc>
+        <w:tc>
+          <w:tcPr>
+            <w:tcW w:type="dxa" w:w="1250"/>
+            <w:tcMar>
+              <w:top w:type="dxa" w:w="150"/>
+              <w:left w:type="dxa" w:w="70"/>
+              <w:bottom w:type="dxa" w:w="150"/>
+              <w:right w:type="dxa" w:w="70"/>
+            </w:tcMar>
+          </w:tcPr>
+          <w:p>
+            <w:r>
+              <w:t xml:space="preserve"/>
+            </w:r>
+          </w:p>
+        </w:tc>
+        <w:tc>
+          <w:tcPr>
+            <w:tcW w:type="dxa" w:w="1250"/>
+            <w:tcMar>
+              <w:top w:type="dxa" w:w="150"/>
+              <w:left w:type="dxa" w:w="70"/>
+              <w:bottom w:type="dxa" w:w="150"/>
+              <w:right w:type="dxa" w:w="70"/>
+            </w:tcMar>
+          </w:tcPr>
+          <w:p>
+            <w:r>
+              <w:t xml:space="preserve"/>
+            </w:r>
+          </w:p>
+        </w:tc>
+        <w:tc>
+          <w:tcPr>
+            <w:tcW w:type="dxa" w:w="1250"/>
+            <w:tcMar>
+              <w:top w:type="dxa" w:w="150"/>
+              <w:left w:type="dxa" w:w="70"/>
+              <w:bottom w:type="dxa" w:w="150"/>
+              <w:right w:type="dxa" w:w="70"/>
+            </w:tcMar>
+          </w:tcPr>
+          <w:p>
+            <w:r>
+              <w:t xml:space="preserve"/>
+            </w:r>
+          </w:p>
+        </w:tc>
+        <w:tc>
+          <w:tcPr>
+            <w:tcW w:type="dxa" w:w="1250"/>
+            <w:tcMar>
+              <w:top w:type="dxa" w:w="150"/>
+              <w:left w:type="dxa" w:w="70"/>
+              <w:bottom w:type="dxa" w:w="150"/>
+              <w:right w:type="dxa" w:w="70"/>
+            </w:tcMar>
+          </w:tcPr>
+          <w:p>
+            <w:r>
+              <w:t xml:space="preserve"/>
+            </w:r>
+          </w:p>
+        </w:tc>
+        <w:tc>
+          <w:tcPr>
+            <w:tcW w:type="dxa" w:w="1250"/>
+            <w:tcMar>
+              <w:top w:type="dxa" w:w="150"/>
+              <w:left w:type="dxa" w:w="70"/>
+              <w:bottom w:type="dxa" w:w="150"/>
+              <w:right w:type="dxa" w:w="70"/>
+            </w:tcMar>
+          </w:tcPr>
+          <w:p>
+            <w:r>
+              <w:t xml:space="preserve"/>
+            </w:r>
+          </w:p>
+        </w:tc>
+      </w:tr>
+      <w:tr>
+        <w:tc>
+          <w:tcPr>
+            <w:tcW w:type="dxa" w:w="1860"/>
+            <w:tcMar>
+              <w:top w:type="dxa" w:w="150"/>
+              <w:left w:type="dxa" w:w="70"/>
+              <w:bottom w:type="dxa" w:w="150"/>
+              <w:right w:type="dxa" w:w="70"/>
+            </w:tcMar>
+          </w:tcPr>
+          <w:p>
+            <w:r>
+              <w:t xml:space="preserve"/>
+            </w:r>
+          </w:p>
+        </w:tc>
+        <w:tc>
+          <w:tcPr>
+            <w:tcW w:type="dxa" w:w="1250"/>
+            <w:tcMar>
+              <w:top w:type="dxa" w:w="150"/>
+              <w:left w:type="dxa" w:w="70"/>
+              <w:bottom w:type="dxa" w:w="150"/>
+              <w:right w:type="dxa" w:w="70"/>
+            </w:tcMar>
+          </w:tcPr>
+          <w:p>
+            <w:r>
+              <w:t xml:space="preserve"/>
+            </w:r>
+          </w:p>
+        </w:tc>
+        <w:tc>
+          <w:tcPr>
+            <w:tcW w:type="dxa" w:w="1250"/>
+            <w:tcMar>
+              <w:top w:type="dxa" w:w="150"/>
+              <w:left w:type="dxa" w:w="70"/>
+              <w:bottom w:type="dxa" w:w="150"/>
+              <w:right w:type="dxa" w:w="70"/>
+            </w:tcMar>
+          </w:tcPr>
+          <w:p>
+            <w:r>
+              <w:t xml:space="preserve"/>
+            </w:r>
+          </w:p>
+        </w:tc>
+        <w:tc>
+          <w:tcPr>
+            <w:tcW w:type="dxa" w:w="1250"/>
+            <w:tcMar>
+              <w:top w:type="dxa" w:w="150"/>
+              <w:left w:type="dxa" w:w="70"/>
+              <w:bottom w:type="dxa" w:w="150"/>
+              <w:right w:type="dxa" w:w="70"/>
+            </w:tcMar>
+          </w:tcPr>
+          <w:p>
+            <w:r>
+              <w:t xml:space="preserve"/>
+            </w:r>
+          </w:p>
+        </w:tc>
+        <w:tc>
+          <w:tcPr>
+            <w:tcW w:type="dxa" w:w="1250"/>
+            <w:tcMar>
+              <w:top w:type="dxa" w:w="150"/>
+              <w:left w:type="dxa" w:w="70"/>
+              <w:bottom w:type="dxa" w:w="150"/>
+              <w:right w:type="dxa" w:w="70"/>
+            </w:tcMar>
+          </w:tcPr>
+          <w:p>
+            <w:r>
+              <w:t xml:space="preserve"/>
+            </w:r>
+          </w:p>
+        </w:tc>
+        <w:tc>
+          <w:tcPr>
+            <w:tcW w:type="dxa" w:w="1250"/>
+            <w:tcMar>
+              <w:top w:type="dxa" w:w="150"/>
+              <w:left w:type="dxa" w:w="70"/>
+              <w:bottom w:type="dxa" w:w="150"/>
+              <w:right w:type="dxa" w:w="70"/>
+            </w:tcMar>
+          </w:tcPr>
+          <w:p>
+            <w:r>
+              <w:t xml:space="preserve"/>
+            </w:r>
+          </w:p>
+        </w:tc>
+        <w:tc>
+          <w:tcPr>
+            <w:tcW w:type="dxa" w:w="1250"/>
+            <w:tcMar>
+              <w:top w:type="dxa" w:w="150"/>
+              <w:left w:type="dxa" w:w="70"/>
+              <w:bottom w:type="dxa" w:w="150"/>
+              <w:right w:type="dxa" w:w="70"/>
+            </w:tcMar>
+          </w:tcPr>
+          <w:p>
+            <w:r>
+              <w:t xml:space="preserve"/>
+            </w:r>
+          </w:p>
+        </w:tc>
+      </w:tr>
+    </w:tbl>
+    <w:p>
+      <w:pPr>
+        <w:spacing w:after="60" w:line="276"/>
+      </w:pPr>
+      <w:r>
+        <w:t xml:space="preserve"/>
+      </w:r>
+    </w:p>
+    <w:p>
+      <w:pPr>
+        <w:spacing w:after="40"/>
+      </w:pPr>
+      <w:r>
+        <w:rPr>
+          <w:b/>
+          <w:bCs/>
+        </w:rPr>
+        <w:t xml:space="preserve">Final three</w:t>
+      </w:r>
+    </w:p>
+    <w:p>
+      <w:pPr>
+        <w:spacing w:after="40" w:line="276"/>
+      </w:pPr>
+      <w:r>
+        <w:t xml:space="preserve">Preferred name:</w:t>
+      </w:r>
+    </w:p>
+    <w:p>
+      <w:pPr>
+        <w:pBdr>
+          <w:bottom w:val="single" w:color="999999" w:sz="6" w:space="1"/>
+        </w:pBdr>
+        <w:spacing w:after="220"/>
+      </w:pPr>
+      <w:r>
+        <w:t xml:space="preserve"/>
+      </w:r>
+    </w:p>
+    <w:p>
+      <w:pPr>
+        <w:spacing w:after="40" w:line="276"/>
+      </w:pPr>
+      <w:r>
+        <w:t xml:space="preserve">Backup name 1:</w:t>
+      </w:r>
+    </w:p>
+    <w:p>
+      <w:pPr>
+        <w:pBdr>
+          <w:bottom w:val="single" w:color="999999" w:sz="6" w:space="1"/>
+        </w:pBdr>
+        <w:spacing w:after="220"/>
+      </w:pPr>
+      <w:r>
+        <w:t xml:space="preserve"/>
+      </w:r>
+    </w:p>
+    <w:p>
+      <w:pPr>
+        <w:spacing w:after="40" w:line="276"/>
+      </w:pPr>
+      <w:r>
+        <w:t xml:space="preserve">Backup name 2:</w:t>
+      </w:r>
+    </w:p>
+    <w:p>
+      <w:pPr>
+        <w:pBdr>
+          <w:bottom w:val="single" w:color="999999" w:sz="6" w:space="1"/>
+        </w:pBdr>
+        <w:spacing w:after="220"/>
+      </w:pPr>
+      <w:r>
+        <w:t xml:space="preserve"/>
+      </w:r>
+    </w:p>
+    <w:p>
+      <w:pPr>
+        <w:spacing w:after="40"/>
+      </w:pPr>
+      <w:r>
+        <w:rPr>
+          <w:b/>
+          <w:bCs/>
+        </w:rPr>
+        <w:t xml:space="preserve">Exact presentation</w:t>
+      </w:r>
+    </w:p>
+    <w:p>
+      <w:pPr>
+        <w:spacing w:after="40" w:line="276"/>
+      </w:pPr>
+      <w:r>
+        <w:t xml:space="preserve">Exact capitalization:</w:t>
+      </w:r>
+    </w:p>
+    <w:p>
+      <w:pPr>
+        <w:pBdr>
+          <w:bottom w:val="single" w:color="999999" w:sz="6" w:space="1"/>
+        </w:pBdr>
+        <w:spacing w:after="220"/>
+      </w:pPr>
+      <w:r>
+        <w:t xml:space="preserve"/>
+      </w:r>
+    </w:p>
+    <w:p>
+      <w:pPr>
+        <w:spacing w:after="40" w:line="276"/>
+      </w:pPr>
+      <w:r>
+        <w:t xml:space="preserve">Exact spacing:</w:t>
+      </w:r>
+    </w:p>
+    <w:p>
+      <w:pPr>
+        <w:pBdr>
+          <w:bottom w:val="single" w:color="999999" w:sz="6" w:space="1"/>
+        </w:pBdr>
+        <w:spacing w:after="220"/>
+      </w:pPr>
+      <w:r>
+        <w:t xml:space="preserve"/>
+      </w:r>
+    </w:p>
+    <w:p>
+      <w:pPr>
+        <w:spacing w:after="40" w:line="276"/>
+      </w:pPr>
+      <w:r>
+        <w:t xml:space="preserve">Exact punctuation:</w:t>
+      </w:r>
+    </w:p>
+    <w:p>
+      <w:pPr>
+        <w:pBdr>
+          <w:bottom w:val="single" w:color="999999" w:sz="6" w:space="1"/>
+        </w:pBdr>
+        <w:spacing w:after="220"/>
+      </w:pPr>
+      <w:r>
+        <w:t xml:space="preserve"/>
+      </w:r>
+    </w:p>
+    <w:p>
+      <w:pPr>
+        <w:spacing w:after="40" w:line="276"/>
+      </w:pPr>
+      <w:r>
+        <w:t xml:space="preserve">Domain idea:</w:t>
+      </w:r>
+    </w:p>
+    <w:p>
+      <w:pPr>
+        <w:pBdr>
+          <w:bottom w:val="single" w:color="999999" w:sz="6" w:space="1"/>
+        </w:pBdr>
+        <w:spacing w:after="220"/>
+      </w:pPr>
+      <w:r>
+        <w:t xml:space="preserve"/>
+      </w:r>
+    </w:p>
+    <w:p>
+      <w:pPr>
+        <w:spacing w:after="40" w:line="276"/>
+      </w:pPr>
+      <w:r>
+        <w:t xml:space="preserve">Social username idea:</w:t>
+      </w:r>
+    </w:p>
+    <w:p>
+      <w:pPr>
+        <w:pBdr>
+          <w:bottom w:val="single" w:color="999999" w:sz="6" w:space="1"/>
+        </w:pBdr>
+        <w:spacing w:after="220"/>
+      </w:pPr>
+      <w:r>
+        <w:t xml:space="preserve"/>
+      </w:r>
+    </w:p>
+    <w:p>
+      <w:pPr>
+        <w:spacing w:after="40"/>
+      </w:pPr>
+      <w:r>
+        <w:rPr>
+          <w:b/>
+          <w:bCs/>
+        </w:rPr>
+        <w:t xml:space="preserve">Final check</w:t>
+      </w:r>
+    </w:p>
+    <w:p>
+      <w:pPr>
+        <w:spacing w:after="70" w:line="276"/>
+        <w:ind w:left="200"/>
+      </w:pPr>
+      <w:r>
+        <w:t xml:space="preserve">☐  The name is understandable.</w:t>
+      </w:r>
+    </w:p>
+    <w:p>
+      <w:pPr>
+        <w:spacing w:after="70" w:line="276"/>
+        <w:ind w:left="200"/>
+      </w:pPr>
+      <w:r>
+        <w:t xml:space="preserve">☐  The name is not unnecessarily restrictive.</w:t>
+      </w:r>
+    </w:p>
+    <w:p>
+      <w:pPr>
+        <w:spacing w:after="70" w:line="276"/>
+        <w:ind w:left="200"/>
+      </w:pPr>
+      <w:r>
+        <w:t xml:space="preserve">☐  The name is reasonably memorable.</w:t>
+      </w:r>
+    </w:p>
+    <w:p>
+      <w:pPr>
+        <w:spacing w:after="70" w:line="276"/>
+        <w:ind w:left="200"/>
+      </w:pPr>
+      <w:r>
+        <w:t xml:space="preserve">☐  I completed a preliminary availability check.</w:t>
+      </w:r>
+    </w:p>
+    <w:p>
+      <w:pPr>
+        <w:spacing w:after="70" w:line="276"/>
+        <w:ind w:left="200"/>
+      </w:pPr>
+      <w:r>
+        <w:t xml:space="preserve">☐  I understand that legal registration and trademark clearance are separate.</w:t>
+      </w:r>
+    </w:p>
+    <w:p>
+      <w:pPr>
+        <w:spacing w:after="40"/>
+      </w:pPr>
+      <w:r>
+        <w:rPr>
+          <w:b/>
+          <w:bCs/>
+        </w:rPr>
+        <w:t xml:space="preserve">Final store-name decision</w:t>
+      </w:r>
+    </w:p>
+    <w:p>
+      <w:pPr>
+        <w:spacing w:after="40" w:line="276"/>
+      </w:pPr>
+      <w:r>
+        <w:t xml:space="preserve">My store name will be:</w:t>
+      </w:r>
+    </w:p>
+    <w:p>
+      <w:pPr>
+        <w:pBdr>
+          <w:bottom w:val="single" w:color="999999" w:sz="6" w:space="1"/>
+        </w:pBdr>
+        <w:spacing w:after="220"/>
+      </w:pPr>
+      <w:r>
+        <w:t xml:space="preserve"/>
+      </w:r>
+    </w:p>
+    <w:p>
+      <w:r>
+        <w:br w:type="page"/>
+      </w:r>
+    </w:p>
+    <w:p>
+      <w:pPr>
+        <w:pStyle w:val="Heading1"/>
+        <w:spacing w:after="160" w:before="240"/>
+      </w:pPr>
+      <w:r>
+        <w:t xml:space="preserve">Internal Reviewer Note (remove before publishing)</w:t>
+      </w:r>
+    </w:p>
+    <w:p>
+      <w:pPr>
+        <w:spacing w:after="140" w:line="276"/>
+      </w:pPr>
+      <w:r>
+        <w:t xml:space="preserve">This note lists what the draft assumes and what it still needs. It is for the internal review process, not for the buyer.</w:t>
+      </w:r>
+    </w:p>
+    <w:p>
+      <w:pPr>
+        <w:pStyle w:val="Heading2"/>
+        <w:spacing w:after="100" w:before="200"/>
+      </w:pPr>
+      <w:r>
+        <w:t xml:space="preserve">Assumptions made</w:t>
+      </w:r>
+    </w:p>
+    <w:p>
+      <w:pPr>
+        <w:pStyle w:val="ListParagraph"/>
+        <w:numPr>
+          <w:ilvl w:val="0"/>
+          <w:numId w:val="1"/>
+        </w:numPr>
+        <w:spacing w:after="80" w:line="276"/>
+      </w:pPr>
+      <w:r>
+        <w:t xml:space="preserve">The guide is sold as a digital product (PDF) to individual buyers.</w:t>
+      </w:r>
+    </w:p>
+    <w:p>
+      <w:pPr>
+        <w:pStyle w:val="ListParagraph"/>
+        <w:numPr>
+          <w:ilvl w:val="0"/>
+          <w:numId w:val="1"/>
+        </w:numPr>
+        <w:spacing w:after="80" w:line="276"/>
+      </w:pPr>
+      <w:r>
+        <w:t xml:space="preserve">Lucid Creations is an active Shopify store under Auralis Digital selling print-on-demand products; handmade products and commissions may be added later.</w:t>
+      </w:r>
+    </w:p>
+    <w:p>
+      <w:pPr>
+        <w:pStyle w:val="ListParagraph"/>
+        <w:numPr>
+          <w:ilvl w:val="0"/>
+          <w:numId w:val="1"/>
+        </w:numPr>
+        <w:spacing w:after="80" w:line="276"/>
+      </w:pPr>
+      <w:r>
+        <w:t xml:space="preserve">The reader has a computer and can sign up for Shopify on their own.</w:t>
+      </w:r>
+    </w:p>
+    <w:p>
+      <w:pPr>
+        <w:pStyle w:val="ListParagraph"/>
+        <w:numPr>
+          <w:ilvl w:val="0"/>
+          <w:numId w:val="1"/>
+        </w:numPr>
+        <w:spacing w:after="80" w:line="276"/>
+      </w:pPr>
+      <w:r>
+        <w:t xml:space="preserve">Front matter, the table of contents, Chapters 1 through 3, and their worksheets are the only drafted sections. Chapters 4–12 and the remaining worksheets are pending approval to continue.</w:t>
+      </w:r>
+    </w:p>
+    <w:p>
+      <w:pPr>
+        <w:pStyle w:val="Heading2"/>
+        <w:spacing w:after="100" w:before="200"/>
+      </w:pPr>
+      <w:r>
+        <w:t xml:space="preserve">Missing information</w:t>
+      </w:r>
+    </w:p>
+    <w:p>
+      <w:pPr>
+        <w:pStyle w:val="ListParagraph"/>
+        <w:numPr>
+          <w:ilvl w:val="0"/>
+          <w:numId w:val="1"/>
+        </w:numPr>
+        <w:spacing w:after="80" w:line="276"/>
+      </w:pPr>
+      <w:r>
+        <w:t xml:space="preserve">The last-updated date and copyright year (left as [INSERT DATE] and [INSERT YEAR]).</w:t>
+      </w:r>
+    </w:p>
+    <w:p>
+      <w:pPr>
+        <w:pStyle w:val="ListParagraph"/>
+        <w:numPr>
+          <w:ilvl w:val="0"/>
+          <w:numId w:val="1"/>
+        </w:numPr>
+        <w:spacing w:after="80" w:line="276"/>
+      </w:pPr>
+      <w:r>
+        <w:t xml:space="preserve">The Auralis Digital service link for the final conversion page ([INSERT AURALIS DIGITAL SERVICE LINK]).</w:t>
+      </w:r>
+    </w:p>
+    <w:p>
+      <w:pPr>
+        <w:pStyle w:val="ListParagraph"/>
+        <w:numPr>
+          <w:ilvl w:val="0"/>
+          <w:numId w:val="1"/>
+        </w:numPr>
+        <w:spacing w:after="80" w:line="276"/>
+      </w:pPr>
+      <w:r>
+        <w:t xml:space="preserve">Official Shopify URLs (left as [ADD OFFICIAL SHOPIFY LINK] rather than invented).</w:t>
+      </w:r>
+    </w:p>
+    <w:p>
+      <w:pPr>
+        <w:pStyle w:val="ListParagraph"/>
+        <w:numPr>
+          <w:ilvl w:val="0"/>
+          <w:numId w:val="1"/>
+        </w:numPr>
+        <w:spacing w:after="80" w:line="276"/>
+      </w:pPr>
+      <w:r>
+        <w:t xml:space="preserve">Official search links for Chapter 3, left as placeholders rather than invented: [ADD OFFICIAL STATE BUSINESS SEARCH LINK], [ADD OFFICIAL USPTO SEARCH LINK], [ADD OFFICIAL DOMAIN SEARCH LINK].</w:t>
+      </w:r>
+    </w:p>
+    <w:p>
+      <w:pPr>
+        <w:pStyle w:val="Heading2"/>
+        <w:spacing w:after="100" w:before="200"/>
+      </w:pPr>
+      <w:r>
+        <w:t xml:space="preserve">Lucid Creations examples needed</w:t>
+      </w:r>
+    </w:p>
+    <w:p>
+      <w:pPr>
+        <w:pStyle w:val="ListParagraph"/>
+        <w:numPr>
+          <w:ilvl w:val="0"/>
+          <w:numId w:val="1"/>
+        </w:numPr>
+        <w:spacing w:after="80" w:line="276"/>
+      </w:pPr>
+      <w:r>
+        <w:t xml:space="preserve">Chapter 1: which products Lucid Creations launched with, why they were chosen, and what you would change today (no sales or performance figures).</w:t>
+      </w:r>
+    </w:p>
+    <w:p>
+      <w:pPr>
+        <w:pStyle w:val="ListParagraph"/>
+        <w:numPr>
+          <w:ilvl w:val="0"/>
+          <w:numId w:val="1"/>
+        </w:numPr>
+        <w:spacing w:after="80" w:line="276"/>
+      </w:pPr>
+      <w:r>
+        <w:t xml:space="preserve">Chapter 2: Christopher’s own wording for Lucid Creations’ starting customer and offer statement (placeholder [INSERT LUCID CREATIONS CUSTOMER AND OFFER EXAMPLE]). The offer statement currently shown in Chapter 2 is a working example for review, not approved brand language.</w:t>
+      </w:r>
+    </w:p>
+    <w:p>
+      <w:pPr>
+        <w:pStyle w:val="ListParagraph"/>
+        <w:numPr>
+          <w:ilvl w:val="0"/>
+          <w:numId w:val="1"/>
+        </w:numPr>
+        <w:spacing w:after="80" w:line="276"/>
+      </w:pPr>
+      <w:r>
+        <w:t xml:space="preserve">Chapter 3: why “Lucid Creations” was chosen, other names considered, whether the name ever caused confusion, and what would be done differently today (placeholder [INSERT LUCID CREATIONS NAMING EXAMPLE]). Do not claim the name is trademarked or legally protected.</w:t>
+      </w:r>
+    </w:p>
+    <w:p>
+      <w:pPr>
+        <w:pStyle w:val="Heading2"/>
+        <w:spacing w:after="100" w:before="200"/>
+      </w:pPr>
+      <w:r>
+        <w:t xml:space="preserve">Screenshots needed</w:t>
+      </w:r>
+    </w:p>
+    <w:p>
+      <w:pPr>
+        <w:pStyle w:val="ListParagraph"/>
+        <w:numPr>
+          <w:ilvl w:val="0"/>
+          <w:numId w:val="1"/>
+        </w:numPr>
+        <w:spacing w:after="80" w:line="276"/>
+      </w:pPr>
+      <w:r>
+        <w:t xml:space="preserve">Chapters 1 through 3 do not require screenshots. Screenshot placeholders ([INSERT SCREENSHOT]) begin in later chapters (account creation, settings, product pages, checkout, and so on).</w:t>
+      </w:r>
+    </w:p>
+    <w:p>
+      <w:pPr>
+        <w:pStyle w:val="Heading2"/>
+        <w:spacing w:after="100" w:before="200"/>
+      </w:pPr>
+      <w:r>
+        <w:t xml:space="preserve">Claims and links to verify</w:t>
+      </w:r>
+    </w:p>
+    <w:p>
+      <w:pPr>
+        <w:pStyle w:val="ListParagraph"/>
+        <w:numPr>
+          <w:ilvl w:val="0"/>
+          <w:numId w:val="1"/>
+        </w:numPr>
+        <w:spacing w:after="80" w:line="276"/>
+      </w:pPr>
+      <w:r>
+        <w:t xml:space="preserve">Confirm the list of product types Shopify supports matches how you want to present it.</w:t>
+      </w:r>
+    </w:p>
+    <w:p>
+      <w:pPr>
+        <w:pStyle w:val="ListParagraph"/>
+        <w:numPr>
+          <w:ilvl w:val="0"/>
+          <w:numId w:val="1"/>
+        </w:numPr>
+        <w:spacing w:after="80" w:line="276"/>
+      </w:pPr>
+      <w:r>
+        <w:t xml:space="preserve">Confirm the Lucid Creations positioning summary in Chapter 2 (psychedelic art, electronic music, festival culture, sacred geometry, alternative design; apparel, blankets, tapestries, wall art, accessories) matches how you want Lucid described.</w:t>
+      </w:r>
+    </w:p>
+    <w:p>
+      <w:pPr>
+        <w:pStyle w:val="ListParagraph"/>
+        <w:numPr>
+          <w:ilvl w:val="0"/>
+          <w:numId w:val="1"/>
+        </w:numPr>
+        <w:spacing w:after="80" w:line="276"/>
+      </w:pPr>
+      <w:r>
+        <w:t xml:space="preserve">Verify any Shopify-specific setting names against the current interface before publishing (flagged with [VERIFY CURRENT SHOPIFY SETTING] in later chapters).</w:t>
+      </w:r>
+    </w:p>
+    <w:p>
+      <w:pPr>
+        <w:pStyle w:val="ListParagraph"/>
+        <w:numPr>
+          <w:ilvl w:val="0"/>
+          <w:numId w:val="1"/>
+        </w:numPr>
+        <w:spacing w:after="80" w:line="276"/>
+      </w:pPr>
+      <w:r>
+        <w:t xml:space="preserve">Before publishing, replace the Chapter 3 official-search placeholders with verified current URLs (Shopify, state business search, USPTO trademark search, domain search). Do not hard-code any of these links until confirmed.</w:t>
+      </w:r>
+    </w:p>
+    <w:p>
+      <w:pPr>
+        <w:pStyle w:val="Heading2"/>
+        <w:spacing w:after="100" w:before="200"/>
+      </w:pPr>
+      <w:r>
         <w:t xml:space="preserve">Scope check</w:t>
       </w:r>
     </w:p>
@@ -3373,7 +5562,7 @@
         <w:spacing w:after="140" w:line="276"/>
       </w:pPr>
       <w:r>
-        <w:t xml:space="preserve">This draft stays within the locked scope. Chapter 1 decides what to sell; Chapter 2 defines one starting customer and a one-sentence offer, without drifting into branding, market research, competitor analysis, surveys, social media, advertising, pricing, or multiple personas. Printify is mentioned only as one future fulfillment option and is not taught. No chapters beyond Chapter 2 were added. Recommended status for this pass: review Chapter 2, then approve to continue to Chapter 3.</w:t>
+        <w:t xml:space="preserve">This draft stays within the locked scope. Chapter 1 decides what to sell; Chapter 2 defines one starting customer and a one-sentence offer; Chapter 3 chooses a usable store name with a preliminary availability check — without drifting into branding, logos, trademark applications, LLC or assumed-name filings, EIN, domain DNS or connection, email setup, or SEO. Printify is mentioned only as one future fulfillment option and is not taught. No chapters beyond Chapter 3 were added. Recommended status for this pass: review Chapter 3, then approve to continue to Chapter 4.</w:t>
       </w:r>
     </w:p>
     <w:sectPr>
@@ -3608,6 +5797,18 @@
       </w:pPr>
     </w:lvl>
   </w:abstractNum>
+  <w:abstractNum w:abstractNumId="4" w15:restartNumberingAfterBreak="0">
+    <w:multiLevelType w:val="hybridMultilevel"/>
+    <w:lvl w:ilvl="0" w15:tentative="1">
+      <w:start w:val="1"/>
+      <w:numFmt w:val="decimal"/>
+      <w:lvlText w:val="%1."/>
+      <w:lvlJc w:val="start"/>
+      <w:pPr>
+        <w:ind w:left="460" w:hanging="300"/>
+      </w:pPr>
+    </w:lvl>
+  </w:abstractNum>
   <w:num w:numId="1">
     <w:abstractNumId w:val="1"/>
     <w:lvlOverride w:ilvl="0">
@@ -3622,6 +5823,12 @@
   </w:num>
   <w:num w:numId="3">
     <w:abstractNumId w:val="3"/>
+    <w:lvlOverride w:ilvl="0">
+      <w:startOverride w:val="1"/>
+    </w:lvlOverride>
+  </w:num>
+  <w:num w:numId="4">
+    <w:abstractNumId w:val="4"/>
     <w:lvlOverride w:ilvl="0">
       <w:startOverride w:val="1"/>
     </w:lvlOverride>

</xml_diff>

<commit_message>
docs: add Shopify guide chapter 4 draft
Co-Authored-By: Claude Opus 4.8 <noreply@anthropic.com>
</commit_message>
<xml_diff>
--- a/docs/guides/shopify/Build-Your-First-Shopify-Store-DRAFT.docx
+++ b/docs/guides/shopify/Build-Your-First-Shopify-Store-DRAFT.docx
@@ -1116,7 +1116,7 @@
           <w:iCs/>
           <w:color w:val="9A6A00"/>
         </w:rPr>
-        <w:t xml:space="preserve">Draft status: This file contains the polished table of contents, all front matter, Chapters 1–3, and their worksheets. Chapters 4–12 and the remaining worksheets are pending approval to continue.</w:t>
+        <w:t xml:space="preserve">Draft status: This file contains the polished table of contents, all front matter, Chapters 1–4, and their worksheets. Chapters 5–12 and the remaining worksheets are pending approval to continue.</w:t>
       </w:r>
     </w:p>
     <w:p>
@@ -5284,15 +5284,7 @@
         <w:spacing w:after="160" w:before="240"/>
       </w:pPr>
       <w:r>
-        <w:t xml:space="preserve">Internal Reviewer Note (remove before publishing)</w:t>
-      </w:r>
-    </w:p>
-    <w:p>
-      <w:pPr>
-        <w:spacing w:after="140" w:line="276"/>
-      </w:pPr>
-      <w:r>
-        <w:t xml:space="preserve">This note lists what the draft assumes and what it still needs. It is for the internal review process, not for the buyer.</w:t>
+        <w:t xml:space="preserve">Chapter 4 — Open and Configure Shopify</w:t>
       </w:r>
     </w:p>
     <w:p>
@@ -5301,59 +5293,15 @@
         <w:spacing w:after="100" w:before="200"/>
       </w:pPr>
       <w:r>
-        <w:t xml:space="preserve">Assumptions made</w:t>
-      </w:r>
-    </w:p>
-    <w:p>
-      <w:pPr>
-        <w:pStyle w:val="ListParagraph"/>
-        <w:numPr>
-          <w:ilvl w:val="0"/>
-          <w:numId w:val="1"/>
-        </w:numPr>
-        <w:spacing w:after="80" w:line="276"/>
-      </w:pPr>
-      <w:r>
-        <w:t xml:space="preserve">The guide is sold as a digital product (PDF) to individual buyers.</w:t>
-      </w:r>
-    </w:p>
-    <w:p>
-      <w:pPr>
-        <w:pStyle w:val="ListParagraph"/>
-        <w:numPr>
-          <w:ilvl w:val="0"/>
-          <w:numId w:val="1"/>
-        </w:numPr>
-        <w:spacing w:after="80" w:line="276"/>
-      </w:pPr>
-      <w:r>
-        <w:t xml:space="preserve">Lucid Creations is an active Shopify store under Auralis Digital selling print-on-demand products; handmade products and commissions may be added later.</w:t>
-      </w:r>
-    </w:p>
-    <w:p>
-      <w:pPr>
-        <w:pStyle w:val="ListParagraph"/>
-        <w:numPr>
-          <w:ilvl w:val="0"/>
-          <w:numId w:val="1"/>
-        </w:numPr>
-        <w:spacing w:after="80" w:line="276"/>
-      </w:pPr>
-      <w:r>
-        <w:t xml:space="preserve">The reader has a computer and can sign up for Shopify on their own.</w:t>
-      </w:r>
-    </w:p>
-    <w:p>
-      <w:pPr>
-        <w:pStyle w:val="ListParagraph"/>
-        <w:numPr>
-          <w:ilvl w:val="0"/>
-          <w:numId w:val="1"/>
-        </w:numPr>
-        <w:spacing w:after="80" w:line="276"/>
-      </w:pPr>
-      <w:r>
-        <w:t xml:space="preserve">Front matter, the table of contents, Chapters 1 through 3, and their worksheets are the only drafted sections. Chapters 4–12 and the remaining worksheets are pending approval to continue.</w:t>
+        <w:t xml:space="preserve">What you will complete</w:t>
+      </w:r>
+    </w:p>
+    <w:p>
+      <w:pPr>
+        <w:spacing w:after="140" w:line="276"/>
+      </w:pPr>
+      <w:r>
+        <w:t xml:space="preserve">By the end of this chapter, you will have a Shopify account and store created, confirmed access to the Shopify admin, your core store defaults reviewed and set, account security turned on, a written record of the settings you chose, and a list of the settings that belong to later chapters. This chapter builds the store's foundation — not its storefront.</w:t>
       </w:r>
     </w:p>
     <w:p>
@@ -5362,59 +5310,15 @@
         <w:spacing w:after="100" w:before="200"/>
       </w:pPr>
       <w:r>
-        <w:t xml:space="preserve">Missing information</w:t>
-      </w:r>
-    </w:p>
-    <w:p>
-      <w:pPr>
-        <w:pStyle w:val="ListParagraph"/>
-        <w:numPr>
-          <w:ilvl w:val="0"/>
-          <w:numId w:val="1"/>
-        </w:numPr>
-        <w:spacing w:after="80" w:line="276"/>
-      </w:pPr>
-      <w:r>
-        <w:t xml:space="preserve">The last-updated date and copyright year (left as [INSERT DATE] and [INSERT YEAR]).</w:t>
-      </w:r>
-    </w:p>
-    <w:p>
-      <w:pPr>
-        <w:pStyle w:val="ListParagraph"/>
-        <w:numPr>
-          <w:ilvl w:val="0"/>
-          <w:numId w:val="1"/>
-        </w:numPr>
-        <w:spacing w:after="80" w:line="276"/>
-      </w:pPr>
-      <w:r>
-        <w:t xml:space="preserve">The Auralis Digital service link for the final conversion page ([INSERT AURALIS DIGITAL SERVICE LINK]).</w:t>
-      </w:r>
-    </w:p>
-    <w:p>
-      <w:pPr>
-        <w:pStyle w:val="ListParagraph"/>
-        <w:numPr>
-          <w:ilvl w:val="0"/>
-          <w:numId w:val="1"/>
-        </w:numPr>
-        <w:spacing w:after="80" w:line="276"/>
-      </w:pPr>
-      <w:r>
-        <w:t xml:space="preserve">Official Shopify URLs (left as [ADD OFFICIAL SHOPIFY LINK] rather than invented).</w:t>
-      </w:r>
-    </w:p>
-    <w:p>
-      <w:pPr>
-        <w:pStyle w:val="ListParagraph"/>
-        <w:numPr>
-          <w:ilvl w:val="0"/>
-          <w:numId w:val="1"/>
-        </w:numPr>
-        <w:spacing w:after="80" w:line="276"/>
-      </w:pPr>
-      <w:r>
-        <w:t xml:space="preserve">Official search links for Chapter 3, left as placeholders rather than invented: [ADD OFFICIAL STATE BUSINESS SEARCH LINK], [ADD OFFICIAL USPTO SEARCH LINK], [ADD OFFICIAL DOMAIN SEARCH LINK].</w:t>
+        <w:t xml:space="preserve">Why this matters</w:t>
+      </w:r>
+    </w:p>
+    <w:p>
+      <w:pPr>
+        <w:spacing w:after="140" w:line="276"/>
+      </w:pPr>
+      <w:r>
+        <w:t xml:space="preserve">The settings you choose now — currency, time zone, units, and account security — quietly affect everything that follows: how orders are timestamped, how money is counted, how products are measured, and how safe your store is. Getting the foundation right and secure before you add products saves you from confusing, hard-to-undo problems later. Creating the account is quick; configuring it correctly is the real work of this chapter.</w:t>
       </w:r>
     </w:p>
     <w:p>
@@ -5423,46 +5327,377 @@
         <w:spacing w:after="100" w:before="200"/>
       </w:pPr>
       <w:r>
-        <w:t xml:space="preserve">Lucid Creations examples needed</w:t>
-      </w:r>
-    </w:p>
-    <w:p>
-      <w:pPr>
-        <w:pStyle w:val="ListParagraph"/>
-        <w:numPr>
-          <w:ilvl w:val="0"/>
-          <w:numId w:val="1"/>
-        </w:numPr>
-        <w:spacing w:after="80" w:line="276"/>
-      </w:pPr>
-      <w:r>
-        <w:t xml:space="preserve">Chapter 1: which products Lucid Creations launched with, why they were chosen, and what you would change today (no sales or performance figures).</w:t>
-      </w:r>
-    </w:p>
-    <w:p>
-      <w:pPr>
-        <w:pStyle w:val="ListParagraph"/>
-        <w:numPr>
-          <w:ilvl w:val="0"/>
-          <w:numId w:val="1"/>
-        </w:numPr>
-        <w:spacing w:after="80" w:line="276"/>
-      </w:pPr>
-      <w:r>
-        <w:t xml:space="preserve">Chapter 2: Christopher’s own wording for Lucid Creations’ starting customer and offer statement (placeholder [INSERT LUCID CREATIONS CUSTOMER AND OFFER EXAMPLE]). The offer statement currently shown in Chapter 2 is a working example for review, not approved brand language.</w:t>
-      </w:r>
-    </w:p>
-    <w:p>
-      <w:pPr>
-        <w:pStyle w:val="ListParagraph"/>
-        <w:numPr>
-          <w:ilvl w:val="0"/>
-          <w:numId w:val="1"/>
-        </w:numPr>
-        <w:spacing w:after="80" w:line="276"/>
-      </w:pPr>
-      <w:r>
-        <w:t xml:space="preserve">Chapter 3: why “Lucid Creations” was chosen, other names considered, whether the name ever caused confusion, and what would be done differently today (placeholder [INSERT LUCID CREATIONS NAMING EXAMPLE]). Do not claim the name is trademarked or legally protected.</w:t>
+        <w:t xml:space="preserve">Step-by-step instructions</w:t>
+      </w:r>
+    </w:p>
+    <w:p>
+      <w:pPr>
+        <w:pStyle w:val="ListParagraph"/>
+        <w:numPr>
+          <w:ilvl w:val="0"/>
+          <w:numId w:val="5"/>
+        </w:numPr>
+        <w:spacing w:after="120" w:line="276"/>
+      </w:pPr>
+      <w:r>
+        <w:rPr>
+          <w:b/>
+          <w:bCs/>
+        </w:rPr>
+        <w:t xml:space="preserve">Prepare the required information.</w:t>
+      </w:r>
+      <w:r>
+        <w:t xml:space="preserve"> Before you open Shopify, have ready: your preferred store name and two backups from Chapter 3; an email address you control; a secure password (a password manager helps); a phone or authentication device; your operating country; your expected store currency; your local time zone; your preferred measurement and weight units; and a payment method for Shopify billing if it is required when you select a plan. You do not yet need an LLC, an EIN, a connected domain, finished product images, final policies, a logo, or a complete catalog — those come later. Being ready to create a store is not the same as being ready to launch one. Why it matters: having these on hand lets you finish setup in one sitting without guessing. Done when: you have this information gathered.</w:t>
+      </w:r>
+    </w:p>
+    <w:p>
+      <w:pPr>
+        <w:pStyle w:val="ListParagraph"/>
+        <w:numPr>
+          <w:ilvl w:val="0"/>
+          <w:numId w:val="5"/>
+        </w:numPr>
+        <w:spacing w:after="120" w:line="276"/>
+      </w:pPr>
+      <w:r>
+        <w:rPr>
+          <w:b/>
+          <w:bCs/>
+        </w:rPr>
+        <w:t xml:space="preserve">Create the Shopify account and store.</w:t>
+      </w:r>
+      <w:r>
+        <w:t xml:space="preserve"> Go to Shopify through an official source, start account creation, and either sign in with an existing Shopify account or create a new one. Create the new store, enter your preferred store name, and use a backup if the first name is unavailable. Complete or skip the optional onboarding questions where Shopify allows, and continue until you reach the Shopify admin. Do not create multiple trial stores. Why it matters: this creates the store you will configure. Done when: you have reached the Shopify admin for your new store.</w:t>
+      </w:r>
+    </w:p>
+    <w:p>
+      <w:pPr>
+        <w:spacing w:after="140" w:line="276"/>
+      </w:pPr>
+      <w:r>
+        <w:rPr>
+          <w:i/>
+          <w:iCs/>
+          <w:color w:val="9A6A00"/>
+        </w:rPr>
+        <w:t xml:space="preserve">[ADD OFFICIAL SHOPIFY ACCOUNT-CREATION LINK] · [VERIFY CURRENT SHOPIFY SETTING]</w:t>
+      </w:r>
+    </w:p>
+    <w:p>
+      <w:pPr>
+        <w:spacing w:after="140" w:line="276"/>
+      </w:pPr>
+      <w:r>
+        <w:rPr>
+          <w:i/>
+          <w:iCs/>
+          <w:color w:val="9A6A00"/>
+        </w:rPr>
+        <w:t xml:space="preserve">[INSERT SCREENSHOT — Shopify account creation or initial admin screen] (Locate: where account creation begins or where the admin first appears. Hide: any email address, personal name, and store URL. Capture on the day you publish. Note: Shopify’s onboarding may change.)</w:t>
+      </w:r>
+    </w:p>
+    <w:p>
+      <w:pPr>
+        <w:pStyle w:val="ListParagraph"/>
+        <w:numPr>
+          <w:ilvl w:val="0"/>
+          <w:numId w:val="5"/>
+        </w:numPr>
+        <w:spacing w:after="120" w:line="276"/>
+      </w:pPr>
+      <w:r>
+        <w:rPr>
+          <w:b/>
+          <w:bCs/>
+        </w:rPr>
+        <w:t xml:space="preserve">Identify the Shopify admin.</w:t>
+      </w:r>
+      <w:r>
+        <w:t xml:space="preserve"> The Shopify admin is the private management area where you control the store. Get oriented with its major areas conceptually — a home or setup overview, Orders, Products, Customers, Content, Analytics or reporting, Marketing, Discounts, sales channels, Apps, and Settings. Exact labels may change, and you do not need to learn each section now. Why it matters: you need to be able to find your way back to Settings for the rest of this chapter. Done when: you can log in, open the correct store, and find Settings.</w:t>
+      </w:r>
+    </w:p>
+    <w:p>
+      <w:pPr>
+        <w:spacing w:after="140" w:line="276"/>
+      </w:pPr>
+      <w:r>
+        <w:rPr>
+          <w:i/>
+          <w:iCs/>
+          <w:color w:val="9A6A00"/>
+        </w:rPr>
+        <w:t xml:space="preserve">[INSERT SCREENSHOT — Shopify admin navigation with sensitive information removed] (Locate: the main admin navigation. Hide: the store name and URL, any order or customer data, and the account email. Capture on publication day. Note: the layout may change.)</w:t>
+      </w:r>
+    </w:p>
+    <w:p>
+      <w:pPr>
+        <w:pStyle w:val="ListParagraph"/>
+        <w:numPr>
+          <w:ilvl w:val="0"/>
+          <w:numId w:val="5"/>
+        </w:numPr>
+        <w:spacing w:after="120" w:line="276"/>
+      </w:pPr>
+      <w:r>
+        <w:rPr>
+          <w:b/>
+          <w:bCs/>
+        </w:rPr>
+        <w:t xml:space="preserve">Review the store identity and ownership details.</w:t>
+      </w:r>
+      <w:r>
+        <w:t xml:space="preserve"> Review the store’s foundational details — currently available fields such as store name, store contact email, the account or ownership email, a legal business name (if applicable), business address, country or region, a phone number (if requested), and the automatically assigned myshopify.com address. Understand that the Shopify account email, the store contact email, the customer-facing sender email, and legal business details can serve different purposes. Chapter 5 handles customer-facing business and contact information more fully. A temporary myshopify.com address is not the same as a connected custom domain, which comes later. Avoid exposing unnecessary personal information publicly. Why it matters: these fields identify and route communication for your store, and mixing them up causes confusion later. Done when: you have reviewed these details and know which ones you will refine in Chapter 5.</w:t>
+      </w:r>
+    </w:p>
+    <w:p>
+      <w:pPr>
+        <w:spacing w:after="140" w:line="276"/>
+      </w:pPr>
+      <w:r>
+        <w:rPr>
+          <w:i/>
+          <w:iCs/>
+          <w:color w:val="9A6A00"/>
+        </w:rPr>
+        <w:t xml:space="preserve">[VERIFY CURRENT SHOPIFY SETTING] (beside exact field names and paths)</w:t>
+      </w:r>
+    </w:p>
+    <w:p>
+      <w:pPr>
+        <w:pStyle w:val="ListParagraph"/>
+        <w:numPr>
+          <w:ilvl w:val="0"/>
+          <w:numId w:val="5"/>
+        </w:numPr>
+        <w:spacing w:after="120" w:line="276"/>
+      </w:pPr>
+      <w:r>
+        <w:rPr>
+          <w:b/>
+          <w:bCs/>
+        </w:rPr>
+        <w:t xml:space="preserve">Set the time zone.</w:t>
+      </w:r>
+      <w:r>
+        <w:t xml:space="preserve"> Choose the time zone in which your business normally operates. In the current Shopify admin this lives under Settings → General (verified against Shopify’s Help Center — see the internal reviewer note for the date; use [VERIFY CURRENT SHOPIFY SETTING] if your admin differs). Your time zone affects order timestamps, reports, scheduled actions, recordkeeping, and how you interpret store activity. Why it matters: a wrong time zone quietly skews every timestamp and report. Done when: the store shows your correct local time zone.</w:t>
+      </w:r>
+    </w:p>
+    <w:p>
+      <w:pPr>
+        <w:spacing w:after="140" w:line="276"/>
+      </w:pPr>
+      <w:r>
+        <w:rPr>
+          <w:i/>
+          <w:iCs/>
+          <w:color w:val="9A6A00"/>
+        </w:rPr>
+        <w:t xml:space="preserve">[INSERT SCREENSHOT — Settings area used for core store defaults] (Locate: the Settings → General area where store defaults are set. Hide: store name and URL, and any contact details. Capture on publication day. Note: the location and labels may change.)</w:t>
+      </w:r>
+    </w:p>
+    <w:p>
+      <w:pPr>
+        <w:pStyle w:val="ListParagraph"/>
+        <w:numPr>
+          <w:ilvl w:val="0"/>
+          <w:numId w:val="5"/>
+        </w:numPr>
+        <w:spacing w:after="120" w:line="276"/>
+      </w:pPr>
+      <w:r>
+        <w:rPr>
+          <w:b/>
+          <w:bCs/>
+        </w:rPr>
+        <w:t xml:space="preserve">Set the store currency.</w:t>
+      </w:r>
+      <w:r>
+        <w:t xml:space="preserve"> Your store currency is the primary currency the store uses; it should match the business’s intended selling and accounting context. In the current admin it is set under Settings → General [VERIFY CURRENT SHOPIFY SETTING]. Changing it later can affect products, reports, payments, and market configuration, so choose carefully before you load the full catalog. This chapter does not cover international markets, currency conversion, multi-currency selling, foreign exchange, Shopify Payments configuration, or tax accounting — payment-provider details come in Chapter 6. Why it matters: currency is hard to change cleanly once products and orders exist. Done when: your store currency is set to your intended primary currency.</w:t>
+      </w:r>
+    </w:p>
+    <w:p>
+      <w:pPr>
+        <w:pStyle w:val="ListParagraph"/>
+        <w:numPr>
+          <w:ilvl w:val="0"/>
+          <w:numId w:val="5"/>
+        </w:numPr>
+        <w:spacing w:after="120" w:line="276"/>
+      </w:pPr>
+      <w:r>
+        <w:rPr>
+          <w:b/>
+          <w:bCs/>
+        </w:rPr>
+        <w:t xml:space="preserve">Set measurement and weight units.</w:t>
+      </w:r>
+      <w:r>
+        <w:t xml:space="preserve"> Select the units you will actually use for products and shipping — metric versus imperial measurements, and your default weight unit. In the current admin these are under Settings → General [VERIFY CURRENT SHOPIFY SETTING]. Consistent units reduce product and shipping mistakes. This chapter does not configure shipping rates. Why it matters: mismatched units cause product-entry and shipping errors later. Done when: the selected units match how you will measure and enter products.</w:t>
+      </w:r>
+    </w:p>
+    <w:p>
+      <w:pPr>
+        <w:spacing w:after="140" w:line="276"/>
+      </w:pPr>
+      <w:r>
+        <w:rPr>
+          <w:i/>
+          <w:iCs/>
+          <w:color w:val="9A6A00"/>
+        </w:rPr>
+        <w:t xml:space="preserve">[INSERT SCREENSHOT — time-zone, currency, and measurement settings] (Locate: the fields where time zone, currency, and units are set. Hide: store name and URL. Capture on publication day. Note: field locations may change.)</w:t>
+      </w:r>
+    </w:p>
+    <w:p>
+      <w:pPr>
+        <w:pStyle w:val="ListParagraph"/>
+        <w:numPr>
+          <w:ilvl w:val="0"/>
+          <w:numId w:val="5"/>
+        </w:numPr>
+        <w:spacing w:after="120" w:line="276"/>
+      </w:pPr>
+      <w:r>
+        <w:rPr>
+          <w:b/>
+          <w:bCs/>
+        </w:rPr>
+        <w:t xml:space="preserve">Review language and regional preferences.</w:t>
+      </w:r>
+      <w:r>
+        <w:t xml:space="preserve"> Review the account, admin, store, language, and regional preferences relevant to your setup. Keep these separate in your mind: the language used in the Shopify admin; the customer-facing storefront language; the store’s country or region; currency; and time zone. This chapter does not cover translation, international markets, or localization. Why it matters: confusing admin language with storefront language leads to setup mistakes. Done when: you have reviewed these preferences and confirmed they match your setup.</w:t>
+      </w:r>
+    </w:p>
+    <w:p>
+      <w:pPr>
+        <w:spacing w:after="140" w:line="276"/>
+      </w:pPr>
+      <w:r>
+        <w:rPr>
+          <w:i/>
+          <w:iCs/>
+          <w:color w:val="9A6A00"/>
+        </w:rPr>
+        <w:t xml:space="preserve">[VERIFY CURRENT SHOPIFY SETTING] (labels and locations may change)</w:t>
+      </w:r>
+    </w:p>
+    <w:p>
+      <w:pPr>
+        <w:pStyle w:val="ListParagraph"/>
+        <w:numPr>
+          <w:ilvl w:val="0"/>
+          <w:numId w:val="5"/>
+        </w:numPr>
+        <w:spacing w:after="120" w:line="276"/>
+      </w:pPr>
+      <w:r>
+        <w:rPr>
+          <w:b/>
+          <w:bCs/>
+        </w:rPr>
+        <w:t xml:space="preserve">Secure the account.</w:t>
+      </w:r>
+      <w:r>
+        <w:t xml:space="preserve"> Use a unique password; activate two-step authentication or another supported secure sign-in method; save your recovery codes somewhere secure; do not share the owner login; give future users their own access rather than sharing credentials; and confirm you can access the account email. Shopify states that two-step authentication is required to use Shopify Payments, so securing the account now also unblocks payments later — verify current requirements against Shopify’s official documentation. Why it matters: your store holds customer data and money, so account security is not optional. Done when: a secure sign-in method is active and recovery information is stored safely. This guide does not go deep on staff permissions.</w:t>
+      </w:r>
+    </w:p>
+    <w:p>
+      <w:pPr>
+        <w:spacing w:after="140" w:line="276"/>
+      </w:pPr>
+      <w:r>
+        <w:rPr>
+          <w:i/>
+          <w:iCs/>
+          <w:color w:val="9A6A00"/>
+        </w:rPr>
+        <w:t xml:space="preserve">[ADD OFFICIAL SHOPIFY SECURITY LINK] · [VERIFY CURRENT SHOPIFY SETTING]</w:t>
+      </w:r>
+    </w:p>
+    <w:p>
+      <w:pPr>
+        <w:spacing w:after="140" w:line="276"/>
+      </w:pPr>
+      <w:r>
+        <w:rPr>
+          <w:i/>
+          <w:iCs/>
+          <w:color w:val="9A6A00"/>
+        </w:rPr>
+        <w:t xml:space="preserve">[INSERT SCREENSHOT — account security page with all private details removed] (Locate: where two-step authentication is enabled. Hide: recovery codes, QR codes, phone numbers, email addresses, and any authentication secrets. Capture on publication day. Note: the interface may change.)</w:t>
+      </w:r>
+    </w:p>
+    <w:p>
+      <w:pPr>
+        <w:pStyle w:val="ListParagraph"/>
+        <w:numPr>
+          <w:ilvl w:val="0"/>
+          <w:numId w:val="5"/>
+        </w:numPr>
+        <w:spacing w:after="120" w:line="276"/>
+      </w:pPr>
+      <w:r>
+        <w:rPr>
+          <w:b/>
+          <w:bCs/>
+        </w:rPr>
+        <w:t xml:space="preserve">Review the Shopify plan and billing boundary.</w:t>
+      </w:r>
+      <w:r>
+        <w:t xml:space="preserve"> A store may begin in a trial or setup state depending on Shopify’s current offer, and continued operation generally requires selecting an eligible plan. Review current official pricing and plan features directly through Shopify. App fees and transaction-related costs are separate considerations, the cheapest plan is not automatically the right one, and you should avoid paying for advanced features you do not currently need. Why it matters: choosing a plan blindly leads to overpaying or hitting limits mid-build. Done when: you understand your current plan or trial status and what continuing will cost.</w:t>
+      </w:r>
+    </w:p>
+    <w:p>
+      <w:pPr>
+        <w:spacing w:after="140" w:line="276"/>
+      </w:pPr>
+      <w:r>
+        <w:rPr>
+          <w:i/>
+          <w:iCs/>
+          <w:color w:val="9A6A00"/>
+        </w:rPr>
+        <w:t xml:space="preserve">[ADD OFFICIAL SHOPIFY PRICING LINK] · [VERIFY CURRENT SHOPIFY PLAN DETAILS]</w:t>
+      </w:r>
+    </w:p>
+    <w:p>
+      <w:pPr>
+        <w:pStyle w:val="ListParagraph"/>
+        <w:numPr>
+          <w:ilvl w:val="0"/>
+          <w:numId w:val="5"/>
+        </w:numPr>
+        <w:spacing w:after="120" w:line="276"/>
+      </w:pPr>
+      <w:r>
+        <w:rPr>
+          <w:b/>
+          <w:bCs/>
+        </w:rPr>
+        <w:t xml:space="preserve">Avoid unnecessary apps.</w:t>
+      </w:r>
+      <w:r>
+        <w:t xml:space="preserve"> Beginners often install too many apps before understanding the store. Do not install an app just because it is recommended during onboarding. For each app, confirm the problem it solves, check whether Shopify already provides that function, and review recurring cost, permissions, compatibility, and what happens if you uninstall it. Keep the starting store as close to native Shopify as practical. Not all apps are bad — but each one should earn its place. Why it matters: extra apps add cost, complexity, and security surface before you even have products. Done when: either no additional apps are installed, or each installed app has a documented, necessary purpose.</w:t>
+      </w:r>
+    </w:p>
+    <w:p>
+      <w:pPr>
+        <w:pStyle w:val="ListParagraph"/>
+        <w:numPr>
+          <w:ilvl w:val="0"/>
+          <w:numId w:val="5"/>
+        </w:numPr>
+        <w:spacing w:after="120" w:line="276"/>
+      </w:pPr>
+      <w:r>
+        <w:rPr>
+          <w:b/>
+          <w:bCs/>
+        </w:rPr>
+        <w:t xml:space="preserve">Record unfinished setup items without completing them.</w:t>
+      </w:r>
+      <w:r>
+        <w:t xml:space="preserve"> Make a “later chapters” list. Record — but do not complete here: customer-facing contact information (Chapter 5); payments and checkout (Chapter 6); fulfillment and delivery (Chapter 7); products (Chapter 8); collections and navigation (Chapter 9); policies (Chapter 10); testing (Chapter 11); and domain connection and launch actions (Chapter 12, where applicable). Shopify may display setup recommendations for these, but this guide completes them in a controlled order. Why it matters: doing setup tasks out of order creates conflicts and rework. Done when: your later-tasks list is written and you have resisted completing them early.</w:t>
       </w:r>
     </w:p>
     <w:p>
@@ -5471,20 +5706,28 @@
         <w:spacing w:after="100" w:before="200"/>
       </w:pPr>
       <w:r>
-        <w:t xml:space="preserve">Screenshots needed</w:t>
-      </w:r>
-    </w:p>
-    <w:p>
-      <w:pPr>
-        <w:pStyle w:val="ListParagraph"/>
-        <w:numPr>
-          <w:ilvl w:val="0"/>
-          <w:numId w:val="1"/>
-        </w:numPr>
-        <w:spacing w:after="80" w:line="276"/>
-      </w:pPr>
-      <w:r>
-        <w:t xml:space="preserve">Chapters 1 through 3 do not require screenshots. Screenshot placeholders ([INSERT SCREENSHOT]) begin in later chapters (account creation, settings, product pages, checkout, and so on).</w:t>
+        <w:t xml:space="preserve">Real example: Lucid Creations</w:t>
+      </w:r>
+    </w:p>
+    <w:p>
+      <w:pPr>
+        <w:spacing w:after="140" w:line="276"/>
+      </w:pPr>
+      <w:r>
+        <w:t xml:space="preserve">Lucid Creations operates as a Shopify product store under Auralis Digital. Its setup supports print-on-demand products and may later support handmade items and commissions. Its configuration should use the business’s actual operating time zone, currency, and measurement conventions, and its owner should keep secure control of the account and avoid unnecessary apps.</w:t>
+      </w:r>
+    </w:p>
+    <w:p>
+      <w:pPr>
+        <w:spacing w:after="140" w:line="276"/>
+      </w:pPr>
+      <w:r>
+        <w:rPr>
+          <w:i/>
+          <w:iCs/>
+          <w:color w:val="9A6A00"/>
+        </w:rPr>
+        <w:t xml:space="preserve">[INSERT LUCID CREATIONS INITIAL SHOPIFY SETUP EXAMPLE] — which settings were selected; which setup decisions caused confusion; which apps, if any, were installed too early; what would be configured differently today; and which private details (account email, exact address, internal URLs, security method) must be excluded from the published guide. Do not invent the plan, billing cost, trial terms, currency, time zone, address, security method, app list, account email, or any internal Shopify URL.</w:t>
       </w:r>
     </w:p>
     <w:p>
@@ -5493,59 +5736,37 @@
         <w:spacing w:after="100" w:before="200"/>
       </w:pPr>
       <w:r>
-        <w:t xml:space="preserve">Claims and links to verify</w:t>
-      </w:r>
-    </w:p>
-    <w:p>
-      <w:pPr>
-        <w:pStyle w:val="ListParagraph"/>
-        <w:numPr>
-          <w:ilvl w:val="0"/>
-          <w:numId w:val="1"/>
-        </w:numPr>
-        <w:spacing w:after="80" w:line="276"/>
-      </w:pPr>
-      <w:r>
-        <w:t xml:space="preserve">Confirm the list of product types Shopify supports matches how you want to present it.</w:t>
-      </w:r>
-    </w:p>
-    <w:p>
-      <w:pPr>
-        <w:pStyle w:val="ListParagraph"/>
-        <w:numPr>
-          <w:ilvl w:val="0"/>
-          <w:numId w:val="1"/>
-        </w:numPr>
-        <w:spacing w:after="80" w:line="276"/>
-      </w:pPr>
-      <w:r>
-        <w:t xml:space="preserve">Confirm the Lucid Creations positioning summary in Chapter 2 (psychedelic art, electronic music, festival culture, sacred geometry, alternative design; apparel, blankets, tapestries, wall art, accessories) matches how you want Lucid described.</w:t>
-      </w:r>
-    </w:p>
-    <w:p>
-      <w:pPr>
-        <w:pStyle w:val="ListParagraph"/>
-        <w:numPr>
-          <w:ilvl w:val="0"/>
-          <w:numId w:val="1"/>
-        </w:numPr>
-        <w:spacing w:after="80" w:line="276"/>
-      </w:pPr>
-      <w:r>
-        <w:t xml:space="preserve">Verify any Shopify-specific setting names against the current interface before publishing (flagged with [VERIFY CURRENT SHOPIFY SETTING] in later chapters).</w:t>
-      </w:r>
-    </w:p>
-    <w:p>
-      <w:pPr>
-        <w:pStyle w:val="ListParagraph"/>
-        <w:numPr>
-          <w:ilvl w:val="0"/>
-          <w:numId w:val="1"/>
-        </w:numPr>
-        <w:spacing w:after="80" w:line="276"/>
-      </w:pPr>
-      <w:r>
-        <w:t xml:space="preserve">Before publishing, replace the Chapter 3 official-search placeholders with verified current URLs (Shopify, state business search, USPTO trademark search, domain search). Do not hard-code any of these links until confirmed.</w:t>
+        <w:t xml:space="preserve">Common mistake</w:t>
+      </w:r>
+    </w:p>
+    <w:p>
+      <w:pPr>
+        <w:spacing w:after="140" w:line="276"/>
+      </w:pPr>
+      <w:r>
+        <w:rPr>
+          <w:b/>
+          <w:bCs/>
+        </w:rPr>
+        <w:t xml:space="preserve">⚠ Trying to complete every Shopify setup prompt immediately. </w:t>
+      </w:r>
+      <w:r>
+        <w:t xml:space="preserve">Shopify may present many setup tasks, recommendations, sales channels, apps, and features at once. Completing everything without understanding the order can create conflicting settings, unnecessary subscriptions, duplicate tools, security gaps, and confusion about what is actually launch-critical.</w:t>
+      </w:r>
+    </w:p>
+    <w:p>
+      <w:pPr>
+        <w:spacing w:after="140" w:line="276"/>
+      </w:pPr>
+      <w:r>
+        <w:rPr>
+          <w:b/>
+          <w:bCs/>
+        </w:rPr>
+        <w:t xml:space="preserve">Instead: </w:t>
+      </w:r>
+      <w:r>
+        <w:t xml:space="preserve">set the foundation first. Record the later tasks and complete them in the relevant chapter.</w:t>
       </w:r>
     </w:p>
     <w:p>
@@ -5554,6 +5775,2947 @@
         <w:spacing w:after="100" w:before="200"/>
       </w:pPr>
       <w:r>
+        <w:t xml:space="preserve">Reality check</w:t>
+      </w:r>
+    </w:p>
+    <w:p>
+      <w:pPr>
+        <w:spacing w:after="140" w:line="276"/>
+      </w:pPr>
+      <w:r>
+        <w:t xml:space="preserve">Creating the Shopify account is not the same as finishing the store. At the end of this chapter, the foundation should be correct even though the storefront is still incomplete.</w:t>
+      </w:r>
+    </w:p>
+    <w:p>
+      <w:pPr>
+        <w:pStyle w:val="Heading2"/>
+        <w:spacing w:after="100" w:before="200"/>
+      </w:pPr>
+      <w:r>
+        <w:t xml:space="preserve">Checklist</w:t>
+      </w:r>
+    </w:p>
+    <w:p>
+      <w:pPr>
+        <w:spacing w:after="70" w:line="276"/>
+        <w:ind w:left="200"/>
+      </w:pPr>
+      <w:r>
+        <w:t xml:space="preserve">☐  I created the Shopify account and store.</w:t>
+      </w:r>
+    </w:p>
+    <w:p>
+      <w:pPr>
+        <w:spacing w:after="70" w:line="276"/>
+        <w:ind w:left="200"/>
+      </w:pPr>
+      <w:r>
+        <w:t xml:space="preserve">☐  I can log in and reach the correct Shopify admin.</w:t>
+      </w:r>
+    </w:p>
+    <w:p>
+      <w:pPr>
+        <w:spacing w:after="70" w:line="276"/>
+        <w:ind w:left="200"/>
+      </w:pPr>
+      <w:r>
+        <w:t xml:space="preserve">☐  I reviewed the store identity and ownership details.</w:t>
+      </w:r>
+    </w:p>
+    <w:p>
+      <w:pPr>
+        <w:spacing w:after="70" w:line="276"/>
+        <w:ind w:left="200"/>
+      </w:pPr>
+      <w:r>
+        <w:t xml:space="preserve">☐  I selected the correct operating time zone.</w:t>
+      </w:r>
+    </w:p>
+    <w:p>
+      <w:pPr>
+        <w:spacing w:after="70" w:line="276"/>
+        <w:ind w:left="200"/>
+      </w:pPr>
+      <w:r>
+        <w:t xml:space="preserve">☐  I selected the intended store currency.</w:t>
+      </w:r>
+    </w:p>
+    <w:p>
+      <w:pPr>
+        <w:spacing w:after="70" w:line="276"/>
+        <w:ind w:left="200"/>
+      </w:pPr>
+      <w:r>
+        <w:t xml:space="preserve">☐  I selected the correct measurement and weight units.</w:t>
+      </w:r>
+    </w:p>
+    <w:p>
+      <w:pPr>
+        <w:spacing w:after="70" w:line="276"/>
+        <w:ind w:left="200"/>
+      </w:pPr>
+      <w:r>
+        <w:t xml:space="preserve">☐  I reviewed language and regional preferences.</w:t>
+      </w:r>
+    </w:p>
+    <w:p>
+      <w:pPr>
+        <w:spacing w:after="70" w:line="276"/>
+        <w:ind w:left="200"/>
+      </w:pPr>
+      <w:r>
+        <w:t xml:space="preserve">☐  I activated a secure sign-in method.</w:t>
+      </w:r>
+    </w:p>
+    <w:p>
+      <w:pPr>
+        <w:spacing w:after="70" w:line="276"/>
+        <w:ind w:left="200"/>
+      </w:pPr>
+      <w:r>
+        <w:t xml:space="preserve">☐  I securely stored recovery information.</w:t>
+      </w:r>
+    </w:p>
+    <w:p>
+      <w:pPr>
+        <w:spacing w:after="70" w:line="276"/>
+        <w:ind w:left="200"/>
+      </w:pPr>
+      <w:r>
+        <w:t xml:space="preserve">☐  I reviewed current plan and billing information through Shopify.</w:t>
+      </w:r>
+    </w:p>
+    <w:p>
+      <w:pPr>
+        <w:spacing w:after="70" w:line="276"/>
+        <w:ind w:left="200"/>
+      </w:pPr>
+      <w:r>
+        <w:t xml:space="preserve">☐  I avoided unnecessary apps.</w:t>
+      </w:r>
+    </w:p>
+    <w:p>
+      <w:pPr>
+        <w:spacing w:after="70" w:line="276"/>
+        <w:ind w:left="200"/>
+      </w:pPr>
+      <w:r>
+        <w:t xml:space="preserve">☐  I recorded unfinished setup items for later chapters.</w:t>
+      </w:r>
+    </w:p>
+    <w:p>
+      <w:pPr>
+        <w:pStyle w:val="Heading2"/>
+        <w:spacing w:after="100" w:before="200"/>
+      </w:pPr>
+      <w:r>
+        <w:t xml:space="preserve">Before you continue</w:t>
+      </w:r>
+    </w:p>
+    <w:p>
+      <w:pPr>
+        <w:spacing w:after="140" w:line="276"/>
+      </w:pPr>
+      <w:r>
+        <w:t xml:space="preserve">Answer these three questions honestly before moving on:</w:t>
+      </w:r>
+    </w:p>
+    <w:p>
+      <w:pPr>
+        <w:spacing w:after="70" w:line="276"/>
+        <w:ind w:left="200"/>
+      </w:pPr>
+      <w:r>
+        <w:t xml:space="preserve">☐  Did I complete this step?</w:t>
+      </w:r>
+    </w:p>
+    <w:p>
+      <w:pPr>
+        <w:spacing w:after="70" w:line="276"/>
+        <w:ind w:left="200"/>
+      </w:pPr>
+      <w:r>
+        <w:t xml:space="preserve">☐  Are the store defaults correct for how I will operate?</w:t>
+      </w:r>
+    </w:p>
+    <w:p>
+      <w:pPr>
+        <w:spacing w:after="70" w:line="276"/>
+        <w:ind w:left="200"/>
+      </w:pPr>
+      <w:r>
+        <w:t xml:space="preserve">☐  Is any account, security, or billing issue preventing me from continuing?</w:t>
+      </w:r>
+    </w:p>
+    <w:p>
+      <w:pPr>
+        <w:pStyle w:val="Heading2"/>
+        <w:spacing w:after="100" w:before="200"/>
+      </w:pPr>
+      <w:r>
+        <w:t xml:space="preserve">Tools and official links</w:t>
+      </w:r>
+    </w:p>
+    <w:p>
+      <w:pPr>
+        <w:pStyle w:val="ListParagraph"/>
+        <w:numPr>
+          <w:ilvl w:val="0"/>
+          <w:numId w:val="1"/>
+        </w:numPr>
+        <w:spacing w:after="80" w:line="276"/>
+      </w:pPr>
+      <w:r>
+        <w:t xml:space="preserve">Worksheet: Initial Shopify Settings (below)</w:t>
+      </w:r>
+    </w:p>
+    <w:p>
+      <w:pPr>
+        <w:spacing w:after="140" w:line="276"/>
+      </w:pPr>
+      <w:r>
+        <w:rPr>
+          <w:i/>
+          <w:iCs/>
+          <w:color w:val="9A6A00"/>
+        </w:rPr>
+        <w:t xml:space="preserve">[ADD OFFICIAL SHOPIFY ACCOUNT-CREATION LINK]</w:t>
+      </w:r>
+    </w:p>
+    <w:p>
+      <w:pPr>
+        <w:spacing w:after="140" w:line="276"/>
+      </w:pPr>
+      <w:r>
+        <w:rPr>
+          <w:i/>
+          <w:iCs/>
+          <w:color w:val="9A6A00"/>
+        </w:rPr>
+        <w:t xml:space="preserve">[ADD OFFICIAL SHOPIFY INITIAL-SETUP LINK]</w:t>
+      </w:r>
+    </w:p>
+    <w:p>
+      <w:pPr>
+        <w:spacing w:after="140" w:line="276"/>
+      </w:pPr>
+      <w:r>
+        <w:rPr>
+          <w:i/>
+          <w:iCs/>
+          <w:color w:val="9A6A00"/>
+        </w:rPr>
+        <w:t xml:space="preserve">[ADD OFFICIAL SHOPIFY GENERAL-SETTINGS LINK]</w:t>
+      </w:r>
+    </w:p>
+    <w:p>
+      <w:pPr>
+        <w:spacing w:after="140" w:line="276"/>
+      </w:pPr>
+      <w:r>
+        <w:rPr>
+          <w:i/>
+          <w:iCs/>
+          <w:color w:val="9A6A00"/>
+        </w:rPr>
+        <w:t xml:space="preserve">[ADD OFFICIAL SHOPIFY SECURITY LINK]</w:t>
+      </w:r>
+    </w:p>
+    <w:p>
+      <w:pPr>
+        <w:spacing w:after="140" w:line="276"/>
+      </w:pPr>
+      <w:r>
+        <w:rPr>
+          <w:i/>
+          <w:iCs/>
+          <w:color w:val="9A6A00"/>
+        </w:rPr>
+        <w:t xml:space="preserve">[ADD OFFICIAL SHOPIFY PRICING LINK]</w:t>
+      </w:r>
+    </w:p>
+    <w:p>
+      <w:r>
+        <w:br w:type="page"/>
+      </w:r>
+    </w:p>
+    <w:p>
+      <w:pPr>
+        <w:pStyle w:val="Heading1"/>
+        <w:spacing w:after="160" w:before="240"/>
+      </w:pPr>
+      <w:r>
+        <w:t xml:space="preserve">Worksheet: Initial Shopify Settings</w:t>
+      </w:r>
+    </w:p>
+    <w:p>
+      <w:pPr>
+        <w:spacing w:after="140" w:line="276"/>
+      </w:pPr>
+      <w:r>
+        <w:t xml:space="preserve">Use this worksheet to record your setup. It works printed or on a screen. Do not write account passwords, recovery codes, or other secrets on it, and do not publish it.</w:t>
+      </w:r>
+    </w:p>
+    <w:p>
+      <w:pPr>
+        <w:spacing w:after="40"/>
+      </w:pPr>
+      <w:r>
+        <w:rPr>
+          <w:b/>
+          <w:bCs/>
+        </w:rPr>
+        <w:t xml:space="preserve">Account and store</w:t>
+      </w:r>
+    </w:p>
+    <w:p>
+      <w:pPr>
+        <w:pStyle w:val="ListParagraph"/>
+        <w:numPr>
+          <w:ilvl w:val="0"/>
+          <w:numId w:val="1"/>
+        </w:numPr>
+        <w:spacing w:after="80" w:line="276"/>
+      </w:pPr>
+      <w:r>
+        <w:t xml:space="preserve">Shopify account created? Yes / No</w:t>
+      </w:r>
+    </w:p>
+    <w:p>
+      <w:pPr>
+        <w:pStyle w:val="ListParagraph"/>
+        <w:numPr>
+          <w:ilvl w:val="0"/>
+          <w:numId w:val="1"/>
+        </w:numPr>
+        <w:spacing w:after="80" w:line="276"/>
+      </w:pPr>
+      <w:r>
+        <w:t xml:space="preserve">Store created? Yes / No</w:t>
+      </w:r>
+    </w:p>
+    <w:p>
+      <w:pPr>
+        <w:pStyle w:val="ListParagraph"/>
+        <w:numPr>
+          <w:ilvl w:val="0"/>
+          <w:numId w:val="1"/>
+        </w:numPr>
+        <w:spacing w:after="80" w:line="276"/>
+      </w:pPr>
+      <w:r>
+        <w:t xml:space="preserve">Can I log in successfully? Yes / No</w:t>
+      </w:r>
+    </w:p>
+    <w:p>
+      <w:pPr>
+        <w:pStyle w:val="ListParagraph"/>
+        <w:numPr>
+          <w:ilvl w:val="0"/>
+          <w:numId w:val="1"/>
+        </w:numPr>
+        <w:spacing w:after="80" w:line="276"/>
+      </w:pPr>
+      <w:r>
+        <w:t xml:space="preserve">Can I reach the correct Shopify admin? Yes / No</w:t>
+      </w:r>
+    </w:p>
+    <w:p>
+      <w:pPr>
+        <w:pStyle w:val="ListParagraph"/>
+        <w:numPr>
+          <w:ilvl w:val="0"/>
+          <w:numId w:val="1"/>
+        </w:numPr>
+        <w:spacing w:after="80" w:line="276"/>
+      </w:pPr>
+      <w:r>
+        <w:t xml:space="preserve">Account email verified? Yes / No</w:t>
+      </w:r>
+    </w:p>
+    <w:p>
+      <w:pPr>
+        <w:spacing w:after="40" w:line="276"/>
+      </w:pPr>
+      <w:r>
+        <w:t xml:space="preserve">Preferred store name used:</w:t>
+      </w:r>
+    </w:p>
+    <w:p>
+      <w:pPr>
+        <w:pBdr>
+          <w:bottom w:val="single" w:color="999999" w:sz="6" w:space="1"/>
+        </w:pBdr>
+        <w:spacing w:after="220"/>
+      </w:pPr>
+      <w:r>
+        <w:t xml:space="preserve"/>
+      </w:r>
+    </w:p>
+    <w:p>
+      <w:pPr>
+        <w:spacing w:after="40" w:line="276"/>
+      </w:pPr>
+      <w:r>
+        <w:t xml:space="preserve">Backup name used (if any):</w:t>
+      </w:r>
+    </w:p>
+    <w:p>
+      <w:pPr>
+        <w:pBdr>
+          <w:bottom w:val="single" w:color="999999" w:sz="6" w:space="1"/>
+        </w:pBdr>
+        <w:spacing w:after="220"/>
+      </w:pPr>
+      <w:r>
+        <w:t xml:space="preserve"/>
+      </w:r>
+    </w:p>
+    <w:p>
+      <w:pPr>
+        <w:spacing w:after="40" w:line="276"/>
+      </w:pPr>
+      <w:r>
+        <w:t xml:space="preserve">Temporary myshopify.com address (record privately):</w:t>
+      </w:r>
+    </w:p>
+    <w:p>
+      <w:pPr>
+        <w:pBdr>
+          <w:bottom w:val="single" w:color="999999" w:sz="6" w:space="1"/>
+        </w:pBdr>
+        <w:spacing w:after="220"/>
+      </w:pPr>
+      <w:r>
+        <w:t xml:space="preserve"/>
+      </w:r>
+    </w:p>
+    <w:p>
+      <w:pPr>
+        <w:spacing w:after="140" w:line="276"/>
+      </w:pPr>
+      <w:r>
+        <w:rPr>
+          <w:b/>
+          <w:bCs/>
+        </w:rPr>
+        <w:t xml:space="preserve">⚠ Do not </w:t>
+      </w:r>
+      <w:r>
+        <w:t xml:space="preserve">publish account credentials, recovery codes, or sensitive store URLs anywhere.</w:t>
+      </w:r>
+    </w:p>
+    <w:p>
+      <w:pPr>
+        <w:spacing w:after="40"/>
+      </w:pPr>
+      <w:r>
+        <w:rPr>
+          <w:b/>
+          <w:bCs/>
+        </w:rPr>
+        <w:t xml:space="preserve">Core store defaults</w:t>
+      </w:r>
+    </w:p>
+    <w:tbl>
+      <w:tblPr>
+        <w:tblW w:type="dxa" w:w="9360"/>
+        <w:tblBorders>
+          <w:top w:val="single" w:color="auto" w:sz="4"/>
+          <w:left w:val="single" w:color="auto" w:sz="4"/>
+          <w:bottom w:val="single" w:color="auto" w:sz="4"/>
+          <w:right w:val="single" w:color="auto" w:sz="4"/>
+          <w:insideH w:val="single" w:color="auto" w:sz="4"/>
+          <w:insideV w:val="single" w:color="auto" w:sz="4"/>
+        </w:tblBorders>
+      </w:tblPr>
+      <w:tblGrid>
+        <w:gridCol w:w="2200"/>
+        <w:gridCol w:w="2600"/>
+        <w:gridCol w:w="1000"/>
+        <w:gridCol w:w="1400"/>
+        <w:gridCol w:w="2160"/>
+      </w:tblGrid>
+      <w:tr>
+        <w:trPr>
+          <w:tblHeader/>
+        </w:trPr>
+        <w:tc>
+          <w:tcPr>
+            <w:tcW w:type="dxa" w:w="2200"/>
+            <w:shd w:fill="EEEEEE" w:color="auto" w:val="clear"/>
+            <w:tcMar>
+              <w:top w:type="dxa" w:w="60"/>
+              <w:left w:type="dxa" w:w="80"/>
+              <w:bottom w:type="dxa" w:w="60"/>
+              <w:right w:type="dxa" w:w="80"/>
+            </w:tcMar>
+          </w:tcPr>
+          <w:p>
+            <w:r>
+              <w:rPr>
+                <w:b/>
+                <w:bCs/>
+                <w:sz w:val="17"/>
+                <w:szCs w:val="17"/>
+              </w:rPr>
+              <w:t xml:space="preserve">Setting</w:t>
+            </w:r>
+          </w:p>
+        </w:tc>
+        <w:tc>
+          <w:tcPr>
+            <w:tcW w:type="dxa" w:w="2600"/>
+            <w:shd w:fill="EEEEEE" w:color="auto" w:val="clear"/>
+            <w:tcMar>
+              <w:top w:type="dxa" w:w="60"/>
+              <w:left w:type="dxa" w:w="80"/>
+              <w:bottom w:type="dxa" w:w="60"/>
+              <w:right w:type="dxa" w:w="80"/>
+            </w:tcMar>
+          </w:tcPr>
+          <w:p>
+            <w:r>
+              <w:rPr>
+                <w:b/>
+                <w:bCs/>
+                <w:sz w:val="17"/>
+                <w:szCs w:val="17"/>
+              </w:rPr>
+              <w:t xml:space="preserve">Selected value</w:t>
+            </w:r>
+          </w:p>
+        </w:tc>
+        <w:tc>
+          <w:tcPr>
+            <w:tcW w:type="dxa" w:w="1000"/>
+            <w:shd w:fill="EEEEEE" w:color="auto" w:val="clear"/>
+            <w:tcMar>
+              <w:top w:type="dxa" w:w="60"/>
+              <w:left w:type="dxa" w:w="80"/>
+              <w:bottom w:type="dxa" w:w="60"/>
+              <w:right w:type="dxa" w:w="80"/>
+            </w:tcMar>
+          </w:tcPr>
+          <w:p>
+            <w:r>
+              <w:rPr>
+                <w:b/>
+                <w:bCs/>
+                <w:sz w:val="17"/>
+                <w:szCs w:val="17"/>
+              </w:rPr>
+              <w:t xml:space="preserve">Verified?</w:t>
+            </w:r>
+          </w:p>
+        </w:tc>
+        <w:tc>
+          <w:tcPr>
+            <w:tcW w:type="dxa" w:w="1400"/>
+            <w:shd w:fill="EEEEEE" w:color="auto" w:val="clear"/>
+            <w:tcMar>
+              <w:top w:type="dxa" w:w="60"/>
+              <w:left w:type="dxa" w:w="80"/>
+              <w:bottom w:type="dxa" w:w="60"/>
+              <w:right w:type="dxa" w:w="80"/>
+            </w:tcMar>
+          </w:tcPr>
+          <w:p>
+            <w:r>
+              <w:rPr>
+                <w:b/>
+                <w:bCs/>
+                <w:sz w:val="17"/>
+                <w:szCs w:val="17"/>
+              </w:rPr>
+              <w:t xml:space="preserve">Needs follow-up?</w:t>
+            </w:r>
+          </w:p>
+        </w:tc>
+        <w:tc>
+          <w:tcPr>
+            <w:tcW w:type="dxa" w:w="2160"/>
+            <w:shd w:fill="EEEEEE" w:color="auto" w:val="clear"/>
+            <w:tcMar>
+              <w:top w:type="dxa" w:w="60"/>
+              <w:left w:type="dxa" w:w="80"/>
+              <w:bottom w:type="dxa" w:w="60"/>
+              <w:right w:type="dxa" w:w="80"/>
+            </w:tcMar>
+          </w:tcPr>
+          <w:p>
+            <w:r>
+              <w:rPr>
+                <w:b/>
+                <w:bCs/>
+                <w:sz w:val="17"/>
+                <w:szCs w:val="17"/>
+              </w:rPr>
+              <w:t xml:space="preserve">Notes</w:t>
+            </w:r>
+          </w:p>
+        </w:tc>
+      </w:tr>
+      <w:tr>
+        <w:tc>
+          <w:tcPr>
+            <w:tcW w:type="dxa" w:w="2200"/>
+            <w:tcMar>
+              <w:top w:type="dxa" w:w="110"/>
+              <w:left w:type="dxa" w:w="80"/>
+              <w:bottom w:type="dxa" w:w="110"/>
+              <w:right w:type="dxa" w:w="80"/>
+            </w:tcMar>
+          </w:tcPr>
+          <w:p>
+            <w:r>
+              <w:rPr>
+                <w:sz w:val="17"/>
+                <w:szCs w:val="17"/>
+              </w:rPr>
+              <w:t xml:space="preserve">Store name</w:t>
+            </w:r>
+          </w:p>
+        </w:tc>
+        <w:tc>
+          <w:tcPr>
+            <w:tcW w:type="dxa" w:w="2600"/>
+            <w:tcMar>
+              <w:top w:type="dxa" w:w="110"/>
+              <w:left w:type="dxa" w:w="80"/>
+              <w:bottom w:type="dxa" w:w="110"/>
+              <w:right w:type="dxa" w:w="80"/>
+            </w:tcMar>
+          </w:tcPr>
+          <w:p>
+            <w:r>
+              <w:t xml:space="preserve"/>
+            </w:r>
+          </w:p>
+        </w:tc>
+        <w:tc>
+          <w:tcPr>
+            <w:tcW w:type="dxa" w:w="1000"/>
+            <w:tcMar>
+              <w:top w:type="dxa" w:w="110"/>
+              <w:left w:type="dxa" w:w="80"/>
+              <w:bottom w:type="dxa" w:w="110"/>
+              <w:right w:type="dxa" w:w="80"/>
+            </w:tcMar>
+          </w:tcPr>
+          <w:p>
+            <w:r>
+              <w:t xml:space="preserve"/>
+            </w:r>
+          </w:p>
+        </w:tc>
+        <w:tc>
+          <w:tcPr>
+            <w:tcW w:type="dxa" w:w="1400"/>
+            <w:tcMar>
+              <w:top w:type="dxa" w:w="110"/>
+              <w:left w:type="dxa" w:w="80"/>
+              <w:bottom w:type="dxa" w:w="110"/>
+              <w:right w:type="dxa" w:w="80"/>
+            </w:tcMar>
+          </w:tcPr>
+          <w:p>
+            <w:r>
+              <w:t xml:space="preserve"/>
+            </w:r>
+          </w:p>
+        </w:tc>
+        <w:tc>
+          <w:tcPr>
+            <w:tcW w:type="dxa" w:w="2160"/>
+            <w:tcMar>
+              <w:top w:type="dxa" w:w="110"/>
+              <w:left w:type="dxa" w:w="80"/>
+              <w:bottom w:type="dxa" w:w="110"/>
+              <w:right w:type="dxa" w:w="80"/>
+            </w:tcMar>
+          </w:tcPr>
+          <w:p>
+            <w:r>
+              <w:t xml:space="preserve"/>
+            </w:r>
+          </w:p>
+        </w:tc>
+      </w:tr>
+      <w:tr>
+        <w:tc>
+          <w:tcPr>
+            <w:tcW w:type="dxa" w:w="2200"/>
+            <w:tcMar>
+              <w:top w:type="dxa" w:w="110"/>
+              <w:left w:type="dxa" w:w="80"/>
+              <w:bottom w:type="dxa" w:w="110"/>
+              <w:right w:type="dxa" w:w="80"/>
+            </w:tcMar>
+          </w:tcPr>
+          <w:p>
+            <w:r>
+              <w:rPr>
+                <w:sz w:val="17"/>
+                <w:szCs w:val="17"/>
+              </w:rPr>
+              <w:t xml:space="preserve">Operating country or region</w:t>
+            </w:r>
+          </w:p>
+        </w:tc>
+        <w:tc>
+          <w:tcPr>
+            <w:tcW w:type="dxa" w:w="2600"/>
+            <w:tcMar>
+              <w:top w:type="dxa" w:w="110"/>
+              <w:left w:type="dxa" w:w="80"/>
+              <w:bottom w:type="dxa" w:w="110"/>
+              <w:right w:type="dxa" w:w="80"/>
+            </w:tcMar>
+          </w:tcPr>
+          <w:p>
+            <w:r>
+              <w:t xml:space="preserve"/>
+            </w:r>
+          </w:p>
+        </w:tc>
+        <w:tc>
+          <w:tcPr>
+            <w:tcW w:type="dxa" w:w="1000"/>
+            <w:tcMar>
+              <w:top w:type="dxa" w:w="110"/>
+              <w:left w:type="dxa" w:w="80"/>
+              <w:bottom w:type="dxa" w:w="110"/>
+              <w:right w:type="dxa" w:w="80"/>
+            </w:tcMar>
+          </w:tcPr>
+          <w:p>
+            <w:r>
+              <w:t xml:space="preserve"/>
+            </w:r>
+          </w:p>
+        </w:tc>
+        <w:tc>
+          <w:tcPr>
+            <w:tcW w:type="dxa" w:w="1400"/>
+            <w:tcMar>
+              <w:top w:type="dxa" w:w="110"/>
+              <w:left w:type="dxa" w:w="80"/>
+              <w:bottom w:type="dxa" w:w="110"/>
+              <w:right w:type="dxa" w:w="80"/>
+            </w:tcMar>
+          </w:tcPr>
+          <w:p>
+            <w:r>
+              <w:t xml:space="preserve"/>
+            </w:r>
+          </w:p>
+        </w:tc>
+        <w:tc>
+          <w:tcPr>
+            <w:tcW w:type="dxa" w:w="2160"/>
+            <w:tcMar>
+              <w:top w:type="dxa" w:w="110"/>
+              <w:left w:type="dxa" w:w="80"/>
+              <w:bottom w:type="dxa" w:w="110"/>
+              <w:right w:type="dxa" w:w="80"/>
+            </w:tcMar>
+          </w:tcPr>
+          <w:p>
+            <w:r>
+              <w:t xml:space="preserve"/>
+            </w:r>
+          </w:p>
+        </w:tc>
+      </w:tr>
+      <w:tr>
+        <w:tc>
+          <w:tcPr>
+            <w:tcW w:type="dxa" w:w="2200"/>
+            <w:tcMar>
+              <w:top w:type="dxa" w:w="110"/>
+              <w:left w:type="dxa" w:w="80"/>
+              <w:bottom w:type="dxa" w:w="110"/>
+              <w:right w:type="dxa" w:w="80"/>
+            </w:tcMar>
+          </w:tcPr>
+          <w:p>
+            <w:r>
+              <w:rPr>
+                <w:sz w:val="17"/>
+                <w:szCs w:val="17"/>
+              </w:rPr>
+              <w:t xml:space="preserve">Time zone</w:t>
+            </w:r>
+          </w:p>
+        </w:tc>
+        <w:tc>
+          <w:tcPr>
+            <w:tcW w:type="dxa" w:w="2600"/>
+            <w:tcMar>
+              <w:top w:type="dxa" w:w="110"/>
+              <w:left w:type="dxa" w:w="80"/>
+              <w:bottom w:type="dxa" w:w="110"/>
+              <w:right w:type="dxa" w:w="80"/>
+            </w:tcMar>
+          </w:tcPr>
+          <w:p>
+            <w:r>
+              <w:t xml:space="preserve"/>
+            </w:r>
+          </w:p>
+        </w:tc>
+        <w:tc>
+          <w:tcPr>
+            <w:tcW w:type="dxa" w:w="1000"/>
+            <w:tcMar>
+              <w:top w:type="dxa" w:w="110"/>
+              <w:left w:type="dxa" w:w="80"/>
+              <w:bottom w:type="dxa" w:w="110"/>
+              <w:right w:type="dxa" w:w="80"/>
+            </w:tcMar>
+          </w:tcPr>
+          <w:p>
+            <w:r>
+              <w:t xml:space="preserve"/>
+            </w:r>
+          </w:p>
+        </w:tc>
+        <w:tc>
+          <w:tcPr>
+            <w:tcW w:type="dxa" w:w="1400"/>
+            <w:tcMar>
+              <w:top w:type="dxa" w:w="110"/>
+              <w:left w:type="dxa" w:w="80"/>
+              <w:bottom w:type="dxa" w:w="110"/>
+              <w:right w:type="dxa" w:w="80"/>
+            </w:tcMar>
+          </w:tcPr>
+          <w:p>
+            <w:r>
+              <w:t xml:space="preserve"/>
+            </w:r>
+          </w:p>
+        </w:tc>
+        <w:tc>
+          <w:tcPr>
+            <w:tcW w:type="dxa" w:w="2160"/>
+            <w:tcMar>
+              <w:top w:type="dxa" w:w="110"/>
+              <w:left w:type="dxa" w:w="80"/>
+              <w:bottom w:type="dxa" w:w="110"/>
+              <w:right w:type="dxa" w:w="80"/>
+            </w:tcMar>
+          </w:tcPr>
+          <w:p>
+            <w:r>
+              <w:t xml:space="preserve"/>
+            </w:r>
+          </w:p>
+        </w:tc>
+      </w:tr>
+      <w:tr>
+        <w:tc>
+          <w:tcPr>
+            <w:tcW w:type="dxa" w:w="2200"/>
+            <w:tcMar>
+              <w:top w:type="dxa" w:w="110"/>
+              <w:left w:type="dxa" w:w="80"/>
+              <w:bottom w:type="dxa" w:w="110"/>
+              <w:right w:type="dxa" w:w="80"/>
+            </w:tcMar>
+          </w:tcPr>
+          <w:p>
+            <w:r>
+              <w:rPr>
+                <w:sz w:val="17"/>
+                <w:szCs w:val="17"/>
+              </w:rPr>
+              <w:t xml:space="preserve">Store currency</w:t>
+            </w:r>
+          </w:p>
+        </w:tc>
+        <w:tc>
+          <w:tcPr>
+            <w:tcW w:type="dxa" w:w="2600"/>
+            <w:tcMar>
+              <w:top w:type="dxa" w:w="110"/>
+              <w:left w:type="dxa" w:w="80"/>
+              <w:bottom w:type="dxa" w:w="110"/>
+              <w:right w:type="dxa" w:w="80"/>
+            </w:tcMar>
+          </w:tcPr>
+          <w:p>
+            <w:r>
+              <w:t xml:space="preserve"/>
+            </w:r>
+          </w:p>
+        </w:tc>
+        <w:tc>
+          <w:tcPr>
+            <w:tcW w:type="dxa" w:w="1000"/>
+            <w:tcMar>
+              <w:top w:type="dxa" w:w="110"/>
+              <w:left w:type="dxa" w:w="80"/>
+              <w:bottom w:type="dxa" w:w="110"/>
+              <w:right w:type="dxa" w:w="80"/>
+            </w:tcMar>
+          </w:tcPr>
+          <w:p>
+            <w:r>
+              <w:t xml:space="preserve"/>
+            </w:r>
+          </w:p>
+        </w:tc>
+        <w:tc>
+          <w:tcPr>
+            <w:tcW w:type="dxa" w:w="1400"/>
+            <w:tcMar>
+              <w:top w:type="dxa" w:w="110"/>
+              <w:left w:type="dxa" w:w="80"/>
+              <w:bottom w:type="dxa" w:w="110"/>
+              <w:right w:type="dxa" w:w="80"/>
+            </w:tcMar>
+          </w:tcPr>
+          <w:p>
+            <w:r>
+              <w:t xml:space="preserve"/>
+            </w:r>
+          </w:p>
+        </w:tc>
+        <w:tc>
+          <w:tcPr>
+            <w:tcW w:type="dxa" w:w="2160"/>
+            <w:tcMar>
+              <w:top w:type="dxa" w:w="110"/>
+              <w:left w:type="dxa" w:w="80"/>
+              <w:bottom w:type="dxa" w:w="110"/>
+              <w:right w:type="dxa" w:w="80"/>
+            </w:tcMar>
+          </w:tcPr>
+          <w:p>
+            <w:r>
+              <w:t xml:space="preserve"/>
+            </w:r>
+          </w:p>
+        </w:tc>
+      </w:tr>
+      <w:tr>
+        <w:tc>
+          <w:tcPr>
+            <w:tcW w:type="dxa" w:w="2200"/>
+            <w:tcMar>
+              <w:top w:type="dxa" w:w="110"/>
+              <w:left w:type="dxa" w:w="80"/>
+              <w:bottom w:type="dxa" w:w="110"/>
+              <w:right w:type="dxa" w:w="80"/>
+            </w:tcMar>
+          </w:tcPr>
+          <w:p>
+            <w:r>
+              <w:rPr>
+                <w:sz w:val="17"/>
+                <w:szCs w:val="17"/>
+              </w:rPr>
+              <w:t xml:space="preserve">Measurement system</w:t>
+            </w:r>
+          </w:p>
+        </w:tc>
+        <w:tc>
+          <w:tcPr>
+            <w:tcW w:type="dxa" w:w="2600"/>
+            <w:tcMar>
+              <w:top w:type="dxa" w:w="110"/>
+              <w:left w:type="dxa" w:w="80"/>
+              <w:bottom w:type="dxa" w:w="110"/>
+              <w:right w:type="dxa" w:w="80"/>
+            </w:tcMar>
+          </w:tcPr>
+          <w:p>
+            <w:r>
+              <w:t xml:space="preserve"/>
+            </w:r>
+          </w:p>
+        </w:tc>
+        <w:tc>
+          <w:tcPr>
+            <w:tcW w:type="dxa" w:w="1000"/>
+            <w:tcMar>
+              <w:top w:type="dxa" w:w="110"/>
+              <w:left w:type="dxa" w:w="80"/>
+              <w:bottom w:type="dxa" w:w="110"/>
+              <w:right w:type="dxa" w:w="80"/>
+            </w:tcMar>
+          </w:tcPr>
+          <w:p>
+            <w:r>
+              <w:t xml:space="preserve"/>
+            </w:r>
+          </w:p>
+        </w:tc>
+        <w:tc>
+          <w:tcPr>
+            <w:tcW w:type="dxa" w:w="1400"/>
+            <w:tcMar>
+              <w:top w:type="dxa" w:w="110"/>
+              <w:left w:type="dxa" w:w="80"/>
+              <w:bottom w:type="dxa" w:w="110"/>
+              <w:right w:type="dxa" w:w="80"/>
+            </w:tcMar>
+          </w:tcPr>
+          <w:p>
+            <w:r>
+              <w:t xml:space="preserve"/>
+            </w:r>
+          </w:p>
+        </w:tc>
+        <w:tc>
+          <w:tcPr>
+            <w:tcW w:type="dxa" w:w="2160"/>
+            <w:tcMar>
+              <w:top w:type="dxa" w:w="110"/>
+              <w:left w:type="dxa" w:w="80"/>
+              <w:bottom w:type="dxa" w:w="110"/>
+              <w:right w:type="dxa" w:w="80"/>
+            </w:tcMar>
+          </w:tcPr>
+          <w:p>
+            <w:r>
+              <w:t xml:space="preserve"/>
+            </w:r>
+          </w:p>
+        </w:tc>
+      </w:tr>
+      <w:tr>
+        <w:tc>
+          <w:tcPr>
+            <w:tcW w:type="dxa" w:w="2200"/>
+            <w:tcMar>
+              <w:top w:type="dxa" w:w="110"/>
+              <w:left w:type="dxa" w:w="80"/>
+              <w:bottom w:type="dxa" w:w="110"/>
+              <w:right w:type="dxa" w:w="80"/>
+            </w:tcMar>
+          </w:tcPr>
+          <w:p>
+            <w:r>
+              <w:rPr>
+                <w:sz w:val="17"/>
+                <w:szCs w:val="17"/>
+              </w:rPr>
+              <w:t xml:space="preserve">Default weight unit</w:t>
+            </w:r>
+          </w:p>
+        </w:tc>
+        <w:tc>
+          <w:tcPr>
+            <w:tcW w:type="dxa" w:w="2600"/>
+            <w:tcMar>
+              <w:top w:type="dxa" w:w="110"/>
+              <w:left w:type="dxa" w:w="80"/>
+              <w:bottom w:type="dxa" w:w="110"/>
+              <w:right w:type="dxa" w:w="80"/>
+            </w:tcMar>
+          </w:tcPr>
+          <w:p>
+            <w:r>
+              <w:t xml:space="preserve"/>
+            </w:r>
+          </w:p>
+        </w:tc>
+        <w:tc>
+          <w:tcPr>
+            <w:tcW w:type="dxa" w:w="1000"/>
+            <w:tcMar>
+              <w:top w:type="dxa" w:w="110"/>
+              <w:left w:type="dxa" w:w="80"/>
+              <w:bottom w:type="dxa" w:w="110"/>
+              <w:right w:type="dxa" w:w="80"/>
+            </w:tcMar>
+          </w:tcPr>
+          <w:p>
+            <w:r>
+              <w:t xml:space="preserve"/>
+            </w:r>
+          </w:p>
+        </w:tc>
+        <w:tc>
+          <w:tcPr>
+            <w:tcW w:type="dxa" w:w="1400"/>
+            <w:tcMar>
+              <w:top w:type="dxa" w:w="110"/>
+              <w:left w:type="dxa" w:w="80"/>
+              <w:bottom w:type="dxa" w:w="110"/>
+              <w:right w:type="dxa" w:w="80"/>
+            </w:tcMar>
+          </w:tcPr>
+          <w:p>
+            <w:r>
+              <w:t xml:space="preserve"/>
+            </w:r>
+          </w:p>
+        </w:tc>
+        <w:tc>
+          <w:tcPr>
+            <w:tcW w:type="dxa" w:w="2160"/>
+            <w:tcMar>
+              <w:top w:type="dxa" w:w="110"/>
+              <w:left w:type="dxa" w:w="80"/>
+              <w:bottom w:type="dxa" w:w="110"/>
+              <w:right w:type="dxa" w:w="80"/>
+            </w:tcMar>
+          </w:tcPr>
+          <w:p>
+            <w:r>
+              <w:t xml:space="preserve"/>
+            </w:r>
+          </w:p>
+        </w:tc>
+      </w:tr>
+      <w:tr>
+        <w:tc>
+          <w:tcPr>
+            <w:tcW w:type="dxa" w:w="2200"/>
+            <w:tcMar>
+              <w:top w:type="dxa" w:w="110"/>
+              <w:left w:type="dxa" w:w="80"/>
+              <w:bottom w:type="dxa" w:w="110"/>
+              <w:right w:type="dxa" w:w="80"/>
+            </w:tcMar>
+          </w:tcPr>
+          <w:p>
+            <w:r>
+              <w:rPr>
+                <w:sz w:val="17"/>
+                <w:szCs w:val="17"/>
+              </w:rPr>
+              <w:t xml:space="preserve">Admin language</w:t>
+            </w:r>
+          </w:p>
+        </w:tc>
+        <w:tc>
+          <w:tcPr>
+            <w:tcW w:type="dxa" w:w="2600"/>
+            <w:tcMar>
+              <w:top w:type="dxa" w:w="110"/>
+              <w:left w:type="dxa" w:w="80"/>
+              <w:bottom w:type="dxa" w:w="110"/>
+              <w:right w:type="dxa" w:w="80"/>
+            </w:tcMar>
+          </w:tcPr>
+          <w:p>
+            <w:r>
+              <w:t xml:space="preserve"/>
+            </w:r>
+          </w:p>
+        </w:tc>
+        <w:tc>
+          <w:tcPr>
+            <w:tcW w:type="dxa" w:w="1000"/>
+            <w:tcMar>
+              <w:top w:type="dxa" w:w="110"/>
+              <w:left w:type="dxa" w:w="80"/>
+              <w:bottom w:type="dxa" w:w="110"/>
+              <w:right w:type="dxa" w:w="80"/>
+            </w:tcMar>
+          </w:tcPr>
+          <w:p>
+            <w:r>
+              <w:t xml:space="preserve"/>
+            </w:r>
+          </w:p>
+        </w:tc>
+        <w:tc>
+          <w:tcPr>
+            <w:tcW w:type="dxa" w:w="1400"/>
+            <w:tcMar>
+              <w:top w:type="dxa" w:w="110"/>
+              <w:left w:type="dxa" w:w="80"/>
+              <w:bottom w:type="dxa" w:w="110"/>
+              <w:right w:type="dxa" w:w="80"/>
+            </w:tcMar>
+          </w:tcPr>
+          <w:p>
+            <w:r>
+              <w:t xml:space="preserve"/>
+            </w:r>
+          </w:p>
+        </w:tc>
+        <w:tc>
+          <w:tcPr>
+            <w:tcW w:type="dxa" w:w="2160"/>
+            <w:tcMar>
+              <w:top w:type="dxa" w:w="110"/>
+              <w:left w:type="dxa" w:w="80"/>
+              <w:bottom w:type="dxa" w:w="110"/>
+              <w:right w:type="dxa" w:w="80"/>
+            </w:tcMar>
+          </w:tcPr>
+          <w:p>
+            <w:r>
+              <w:t xml:space="preserve"/>
+            </w:r>
+          </w:p>
+        </w:tc>
+      </w:tr>
+      <w:tr>
+        <w:tc>
+          <w:tcPr>
+            <w:tcW w:type="dxa" w:w="2200"/>
+            <w:tcMar>
+              <w:top w:type="dxa" w:w="110"/>
+              <w:left w:type="dxa" w:w="80"/>
+              <w:bottom w:type="dxa" w:w="110"/>
+              <w:right w:type="dxa" w:w="80"/>
+            </w:tcMar>
+          </w:tcPr>
+          <w:p>
+            <w:r>
+              <w:rPr>
+                <w:sz w:val="17"/>
+                <w:szCs w:val="17"/>
+              </w:rPr>
+              <w:t xml:space="preserve">Storefront language</w:t>
+            </w:r>
+          </w:p>
+        </w:tc>
+        <w:tc>
+          <w:tcPr>
+            <w:tcW w:type="dxa" w:w="2600"/>
+            <w:tcMar>
+              <w:top w:type="dxa" w:w="110"/>
+              <w:left w:type="dxa" w:w="80"/>
+              <w:bottom w:type="dxa" w:w="110"/>
+              <w:right w:type="dxa" w:w="80"/>
+            </w:tcMar>
+          </w:tcPr>
+          <w:p>
+            <w:r>
+              <w:t xml:space="preserve"/>
+            </w:r>
+          </w:p>
+        </w:tc>
+        <w:tc>
+          <w:tcPr>
+            <w:tcW w:type="dxa" w:w="1000"/>
+            <w:tcMar>
+              <w:top w:type="dxa" w:w="110"/>
+              <w:left w:type="dxa" w:w="80"/>
+              <w:bottom w:type="dxa" w:w="110"/>
+              <w:right w:type="dxa" w:w="80"/>
+            </w:tcMar>
+          </w:tcPr>
+          <w:p>
+            <w:r>
+              <w:t xml:space="preserve"/>
+            </w:r>
+          </w:p>
+        </w:tc>
+        <w:tc>
+          <w:tcPr>
+            <w:tcW w:type="dxa" w:w="1400"/>
+            <w:tcMar>
+              <w:top w:type="dxa" w:w="110"/>
+              <w:left w:type="dxa" w:w="80"/>
+              <w:bottom w:type="dxa" w:w="110"/>
+              <w:right w:type="dxa" w:w="80"/>
+            </w:tcMar>
+          </w:tcPr>
+          <w:p>
+            <w:r>
+              <w:t xml:space="preserve"/>
+            </w:r>
+          </w:p>
+        </w:tc>
+        <w:tc>
+          <w:tcPr>
+            <w:tcW w:type="dxa" w:w="2160"/>
+            <w:tcMar>
+              <w:top w:type="dxa" w:w="110"/>
+              <w:left w:type="dxa" w:w="80"/>
+              <w:bottom w:type="dxa" w:w="110"/>
+              <w:right w:type="dxa" w:w="80"/>
+            </w:tcMar>
+          </w:tcPr>
+          <w:p>
+            <w:r>
+              <w:t xml:space="preserve"/>
+            </w:r>
+          </w:p>
+        </w:tc>
+      </w:tr>
+      <w:tr>
+        <w:tc>
+          <w:tcPr>
+            <w:tcW w:type="dxa" w:w="2200"/>
+            <w:tcMar>
+              <w:top w:type="dxa" w:w="110"/>
+              <w:left w:type="dxa" w:w="80"/>
+              <w:bottom w:type="dxa" w:w="110"/>
+              <w:right w:type="dxa" w:w="80"/>
+            </w:tcMar>
+          </w:tcPr>
+          <w:p>
+            <w:r>
+              <w:rPr>
+                <w:sz w:val="17"/>
+                <w:szCs w:val="17"/>
+              </w:rPr>
+              <w:t xml:space="preserve">Business or billing details reviewed</w:t>
+            </w:r>
+          </w:p>
+        </w:tc>
+        <w:tc>
+          <w:tcPr>
+            <w:tcW w:type="dxa" w:w="2600"/>
+            <w:tcMar>
+              <w:top w:type="dxa" w:w="110"/>
+              <w:left w:type="dxa" w:w="80"/>
+              <w:bottom w:type="dxa" w:w="110"/>
+              <w:right w:type="dxa" w:w="80"/>
+            </w:tcMar>
+          </w:tcPr>
+          <w:p>
+            <w:r>
+              <w:t xml:space="preserve"/>
+            </w:r>
+          </w:p>
+        </w:tc>
+        <w:tc>
+          <w:tcPr>
+            <w:tcW w:type="dxa" w:w="1000"/>
+            <w:tcMar>
+              <w:top w:type="dxa" w:w="110"/>
+              <w:left w:type="dxa" w:w="80"/>
+              <w:bottom w:type="dxa" w:w="110"/>
+              <w:right w:type="dxa" w:w="80"/>
+            </w:tcMar>
+          </w:tcPr>
+          <w:p>
+            <w:r>
+              <w:t xml:space="preserve"/>
+            </w:r>
+          </w:p>
+        </w:tc>
+        <w:tc>
+          <w:tcPr>
+            <w:tcW w:type="dxa" w:w="1400"/>
+            <w:tcMar>
+              <w:top w:type="dxa" w:w="110"/>
+              <w:left w:type="dxa" w:w="80"/>
+              <w:bottom w:type="dxa" w:w="110"/>
+              <w:right w:type="dxa" w:w="80"/>
+            </w:tcMar>
+          </w:tcPr>
+          <w:p>
+            <w:r>
+              <w:t xml:space="preserve"/>
+            </w:r>
+          </w:p>
+        </w:tc>
+        <w:tc>
+          <w:tcPr>
+            <w:tcW w:type="dxa" w:w="2160"/>
+            <w:tcMar>
+              <w:top w:type="dxa" w:w="110"/>
+              <w:left w:type="dxa" w:w="80"/>
+              <w:bottom w:type="dxa" w:w="110"/>
+              <w:right w:type="dxa" w:w="80"/>
+            </w:tcMar>
+          </w:tcPr>
+          <w:p>
+            <w:r>
+              <w:t xml:space="preserve"/>
+            </w:r>
+          </w:p>
+        </w:tc>
+      </w:tr>
+      <w:tr>
+        <w:tc>
+          <w:tcPr>
+            <w:tcW w:type="dxa" w:w="2200"/>
+            <w:tcMar>
+              <w:top w:type="dxa" w:w="110"/>
+              <w:left w:type="dxa" w:w="80"/>
+              <w:bottom w:type="dxa" w:w="110"/>
+              <w:right w:type="dxa" w:w="80"/>
+            </w:tcMar>
+          </w:tcPr>
+          <w:p>
+            <w:r>
+              <w:rPr>
+                <w:sz w:val="17"/>
+                <w:szCs w:val="17"/>
+              </w:rPr>
+              <w:t xml:space="preserve">Store contact details reviewed</w:t>
+            </w:r>
+          </w:p>
+        </w:tc>
+        <w:tc>
+          <w:tcPr>
+            <w:tcW w:type="dxa" w:w="2600"/>
+            <w:tcMar>
+              <w:top w:type="dxa" w:w="110"/>
+              <w:left w:type="dxa" w:w="80"/>
+              <w:bottom w:type="dxa" w:w="110"/>
+              <w:right w:type="dxa" w:w="80"/>
+            </w:tcMar>
+          </w:tcPr>
+          <w:p>
+            <w:r>
+              <w:t xml:space="preserve"/>
+            </w:r>
+          </w:p>
+        </w:tc>
+        <w:tc>
+          <w:tcPr>
+            <w:tcW w:type="dxa" w:w="1000"/>
+            <w:tcMar>
+              <w:top w:type="dxa" w:w="110"/>
+              <w:left w:type="dxa" w:w="80"/>
+              <w:bottom w:type="dxa" w:w="110"/>
+              <w:right w:type="dxa" w:w="80"/>
+            </w:tcMar>
+          </w:tcPr>
+          <w:p>
+            <w:r>
+              <w:t xml:space="preserve"/>
+            </w:r>
+          </w:p>
+        </w:tc>
+        <w:tc>
+          <w:tcPr>
+            <w:tcW w:type="dxa" w:w="1400"/>
+            <w:tcMar>
+              <w:top w:type="dxa" w:w="110"/>
+              <w:left w:type="dxa" w:w="80"/>
+              <w:bottom w:type="dxa" w:w="110"/>
+              <w:right w:type="dxa" w:w="80"/>
+            </w:tcMar>
+          </w:tcPr>
+          <w:p>
+            <w:r>
+              <w:t xml:space="preserve"/>
+            </w:r>
+          </w:p>
+        </w:tc>
+        <w:tc>
+          <w:tcPr>
+            <w:tcW w:type="dxa" w:w="2160"/>
+            <w:tcMar>
+              <w:top w:type="dxa" w:w="110"/>
+              <w:left w:type="dxa" w:w="80"/>
+              <w:bottom w:type="dxa" w:w="110"/>
+              <w:right w:type="dxa" w:w="80"/>
+            </w:tcMar>
+          </w:tcPr>
+          <w:p>
+            <w:r>
+              <w:t xml:space="preserve"/>
+            </w:r>
+          </w:p>
+        </w:tc>
+      </w:tr>
+    </w:tbl>
+    <w:p>
+      <w:pPr>
+        <w:spacing w:after="60" w:line="276"/>
+      </w:pPr>
+      <w:r>
+        <w:t xml:space="preserve"/>
+      </w:r>
+    </w:p>
+    <w:p>
+      <w:pPr>
+        <w:spacing w:after="40"/>
+      </w:pPr>
+      <w:r>
+        <w:rPr>
+          <w:b/>
+          <w:bCs/>
+        </w:rPr>
+        <w:t xml:space="preserve">Security</w:t>
+      </w:r>
+    </w:p>
+    <w:p>
+      <w:pPr>
+        <w:spacing w:after="70" w:line="276"/>
+        <w:ind w:left="200"/>
+      </w:pPr>
+      <w:r>
+        <w:t xml:space="preserve">☐  Unique password used</w:t>
+      </w:r>
+    </w:p>
+    <w:p>
+      <w:pPr>
+        <w:spacing w:after="70" w:line="276"/>
+        <w:ind w:left="200"/>
+      </w:pPr>
+      <w:r>
+        <w:t xml:space="preserve">☐  Two-step authentication or supported secure sign-in activated</w:t>
+      </w:r>
+    </w:p>
+    <w:p>
+      <w:pPr>
+        <w:spacing w:after="70" w:line="276"/>
+        <w:ind w:left="200"/>
+      </w:pPr>
+      <w:r>
+        <w:t xml:space="preserve">☐  Recovery codes saved securely</w:t>
+      </w:r>
+    </w:p>
+    <w:p>
+      <w:pPr>
+        <w:spacing w:after="70" w:line="276"/>
+        <w:ind w:left="200"/>
+      </w:pPr>
+      <w:r>
+        <w:t xml:space="preserve">☐  Account email access confirmed</w:t>
+      </w:r>
+    </w:p>
+    <w:p>
+      <w:pPr>
+        <w:spacing w:after="70" w:line="276"/>
+        <w:ind w:left="200"/>
+      </w:pPr>
+      <w:r>
+        <w:t xml:space="preserve">☐  Owner login not shared</w:t>
+      </w:r>
+    </w:p>
+    <w:p>
+      <w:pPr>
+        <w:spacing w:after="70" w:line="276"/>
+        <w:ind w:left="200"/>
+      </w:pPr>
+      <w:r>
+        <w:t xml:space="preserve">☐  No security information placed in screenshots or worksheets</w:t>
+      </w:r>
+    </w:p>
+    <w:p>
+      <w:pPr>
+        <w:spacing w:after="40"/>
+      </w:pPr>
+      <w:r>
+        <w:rPr>
+          <w:b/>
+          <w:bCs/>
+        </w:rPr>
+        <w:t xml:space="preserve">Plan and billing review</w:t>
+      </w:r>
+    </w:p>
+    <w:p>
+      <w:pPr>
+        <w:spacing w:after="40" w:line="276"/>
+      </w:pPr>
+      <w:r>
+        <w:t xml:space="preserve">Current setup, trial, or plan status:</w:t>
+      </w:r>
+    </w:p>
+    <w:p>
+      <w:pPr>
+        <w:pBdr>
+          <w:bottom w:val="single" w:color="999999" w:sz="6" w:space="1"/>
+        </w:pBdr>
+        <w:spacing w:after="220"/>
+      </w:pPr>
+      <w:r>
+        <w:t xml:space="preserve"/>
+      </w:r>
+    </w:p>
+    <w:p>
+      <w:pPr>
+        <w:spacing w:after="40" w:line="276"/>
+      </w:pPr>
+      <w:r>
+        <w:t xml:space="preserve">Date official pricing was checked:</w:t>
+      </w:r>
+    </w:p>
+    <w:p>
+      <w:pPr>
+        <w:pBdr>
+          <w:bottom w:val="single" w:color="999999" w:sz="6" w:space="1"/>
+        </w:pBdr>
+        <w:spacing w:after="220"/>
+      </w:pPr>
+      <w:r>
+        <w:t xml:space="preserve"/>
+      </w:r>
+    </w:p>
+    <w:p>
+      <w:pPr>
+        <w:spacing w:after="40" w:line="276"/>
+      </w:pPr>
+      <w:r>
+        <w:t xml:space="preserve">Plan currently being considered:</w:t>
+      </w:r>
+    </w:p>
+    <w:p>
+      <w:pPr>
+        <w:pBdr>
+          <w:bottom w:val="single" w:color="999999" w:sz="6" w:space="1"/>
+        </w:pBdr>
+        <w:spacing w:after="220"/>
+      </w:pPr>
+      <w:r>
+        <w:t xml:space="preserve"/>
+      </w:r>
+    </w:p>
+    <w:p>
+      <w:pPr>
+        <w:pStyle w:val="ListParagraph"/>
+        <w:numPr>
+          <w:ilvl w:val="0"/>
+          <w:numId w:val="1"/>
+        </w:numPr>
+        <w:spacing w:after="80" w:line="276"/>
+      </w:pPr>
+      <w:r>
+        <w:t xml:space="preserve">Billing method added? Yes / No</w:t>
+      </w:r>
+    </w:p>
+    <w:p>
+      <w:pPr>
+        <w:spacing w:after="40" w:line="276"/>
+      </w:pPr>
+      <w:r>
+        <w:t xml:space="preserve">Recurring Shopify cost recorded:</w:t>
+      </w:r>
+    </w:p>
+    <w:p>
+      <w:pPr>
+        <w:pBdr>
+          <w:bottom w:val="single" w:color="999999" w:sz="6" w:space="1"/>
+        </w:pBdr>
+        <w:spacing w:after="220"/>
+      </w:pPr>
+      <w:r>
+        <w:t xml:space="preserve"/>
+      </w:r>
+    </w:p>
+    <w:p>
+      <w:pPr>
+        <w:spacing w:after="40" w:line="276"/>
+      </w:pPr>
+      <w:r>
+        <w:t xml:space="preserve">App charges currently active:</w:t>
+      </w:r>
+    </w:p>
+    <w:p>
+      <w:pPr>
+        <w:pBdr>
+          <w:bottom w:val="single" w:color="999999" w:sz="6" w:space="1"/>
+        </w:pBdr>
+        <w:spacing w:after="220"/>
+      </w:pPr>
+      <w:r>
+        <w:t xml:space="preserve"/>
+      </w:r>
+    </w:p>
+    <w:p>
+      <w:pPr>
+        <w:spacing w:after="40" w:line="276"/>
+      </w:pPr>
+      <w:r>
+        <w:t xml:space="preserve">Questions requiring follow-up:</w:t>
+      </w:r>
+    </w:p>
+    <w:p>
+      <w:pPr>
+        <w:pBdr>
+          <w:bottom w:val="single" w:color="999999" w:sz="6" w:space="1"/>
+        </w:pBdr>
+        <w:spacing w:after="220"/>
+      </w:pPr>
+      <w:r>
+        <w:t xml:space="preserve"/>
+      </w:r>
+    </w:p>
+    <w:p>
+      <w:pPr>
+        <w:spacing w:after="140" w:line="276"/>
+      </w:pPr>
+      <w:r>
+        <w:rPr>
+          <w:i/>
+          <w:iCs/>
+          <w:color w:val="666666"/>
+          <w:sz w:val="20"/>
+          <w:szCs w:val="20"/>
+        </w:rPr>
+        <w:t xml:space="preserve">Plan prices, trial offers, limits, and fees change. Verify them directly with Shopify before making a purchase decision.</w:t>
+      </w:r>
+    </w:p>
+    <w:p>
+      <w:pPr>
+        <w:spacing w:after="40"/>
+      </w:pPr>
+      <w:r>
+        <w:rPr>
+          <w:b/>
+          <w:bCs/>
+        </w:rPr>
+        <w:t xml:space="preserve">App review</w:t>
+      </w:r>
+    </w:p>
+    <w:tbl>
+      <w:tblPr>
+        <w:tblW w:type="dxa" w:w="9360"/>
+        <w:tblBorders>
+          <w:top w:val="single" w:color="auto" w:sz="4"/>
+          <w:left w:val="single" w:color="auto" w:sz="4"/>
+          <w:bottom w:val="single" w:color="auto" w:sz="4"/>
+          <w:right w:val="single" w:color="auto" w:sz="4"/>
+          <w:insideH w:val="single" w:color="auto" w:sz="4"/>
+          <w:insideV w:val="single" w:color="auto" w:sz="4"/>
+        </w:tblBorders>
+      </w:tblPr>
+      <w:tblGrid>
+        <w:gridCol w:w="1500"/>
+        <w:gridCol w:w="2600"/>
+        <w:gridCol w:w="1100"/>
+        <w:gridCol w:w="1400"/>
+        <w:gridCol w:w="1200"/>
+        <w:gridCol w:w="1560"/>
+      </w:tblGrid>
+      <w:tr>
+        <w:trPr>
+          <w:tblHeader/>
+        </w:trPr>
+        <w:tc>
+          <w:tcPr>
+            <w:tcW w:type="dxa" w:w="1500"/>
+            <w:shd w:fill="EEEEEE" w:color="auto" w:val="clear"/>
+            <w:tcMar>
+              <w:top w:type="dxa" w:w="60"/>
+              <w:left w:type="dxa" w:w="70"/>
+              <w:bottom w:type="dxa" w:w="60"/>
+              <w:right w:type="dxa" w:w="70"/>
+            </w:tcMar>
+          </w:tcPr>
+          <w:p>
+            <w:r>
+              <w:rPr>
+                <w:b/>
+                <w:bCs/>
+                <w:sz w:val="15"/>
+                <w:szCs w:val="15"/>
+              </w:rPr>
+              <w:t xml:space="preserve">App</w:t>
+            </w:r>
+          </w:p>
+        </w:tc>
+        <w:tc>
+          <w:tcPr>
+            <w:tcW w:type="dxa" w:w="2600"/>
+            <w:shd w:fill="EEEEEE" w:color="auto" w:val="clear"/>
+            <w:tcMar>
+              <w:top w:type="dxa" w:w="60"/>
+              <w:left w:type="dxa" w:w="70"/>
+              <w:bottom w:type="dxa" w:w="60"/>
+              <w:right w:type="dxa" w:w="70"/>
+            </w:tcMar>
+          </w:tcPr>
+          <w:p>
+            <w:r>
+              <w:rPr>
+                <w:b/>
+                <w:bCs/>
+                <w:sz w:val="15"/>
+                <w:szCs w:val="15"/>
+              </w:rPr>
+              <w:t xml:space="preserve">Problem it solves</w:t>
+            </w:r>
+          </w:p>
+        </w:tc>
+        <w:tc>
+          <w:tcPr>
+            <w:tcW w:type="dxa" w:w="1100"/>
+            <w:shd w:fill="EEEEEE" w:color="auto" w:val="clear"/>
+            <w:tcMar>
+              <w:top w:type="dxa" w:w="60"/>
+              <w:left w:type="dxa" w:w="70"/>
+              <w:bottom w:type="dxa" w:w="60"/>
+              <w:right w:type="dxa" w:w="70"/>
+            </w:tcMar>
+          </w:tcPr>
+          <w:p>
+            <w:r>
+              <w:rPr>
+                <w:b/>
+                <w:bCs/>
+                <w:sz w:val="15"/>
+                <w:szCs w:val="15"/>
+              </w:rPr>
+              <w:t xml:space="preserve">Required now?</w:t>
+            </w:r>
+          </w:p>
+        </w:tc>
+        <w:tc>
+          <w:tcPr>
+            <w:tcW w:type="dxa" w:w="1400"/>
+            <w:shd w:fill="EEEEEE" w:color="auto" w:val="clear"/>
+            <w:tcMar>
+              <w:top w:type="dxa" w:w="60"/>
+              <w:left w:type="dxa" w:w="70"/>
+              <w:bottom w:type="dxa" w:w="60"/>
+              <w:right w:type="dxa" w:w="70"/>
+            </w:tcMar>
+          </w:tcPr>
+          <w:p>
+            <w:r>
+              <w:rPr>
+                <w:b/>
+                <w:bCs/>
+                <w:sz w:val="15"/>
+                <w:szCs w:val="15"/>
+              </w:rPr>
+              <w:t xml:space="preserve">Recurring cost</w:t>
+            </w:r>
+          </w:p>
+        </w:tc>
+        <w:tc>
+          <w:tcPr>
+            <w:tcW w:type="dxa" w:w="1200"/>
+            <w:shd w:fill="EEEEEE" w:color="auto" w:val="clear"/>
+            <w:tcMar>
+              <w:top w:type="dxa" w:w="60"/>
+              <w:left w:type="dxa" w:w="70"/>
+              <w:bottom w:type="dxa" w:w="60"/>
+              <w:right w:type="dxa" w:w="70"/>
+            </w:tcMar>
+          </w:tcPr>
+          <w:p>
+            <w:r>
+              <w:rPr>
+                <w:b/>
+                <w:bCs/>
+                <w:sz w:val="15"/>
+                <w:szCs w:val="15"/>
+              </w:rPr>
+              <w:t xml:space="preserve">Permissions reviewed?</w:t>
+            </w:r>
+          </w:p>
+        </w:tc>
+        <w:tc>
+          <w:tcPr>
+            <w:tcW w:type="dxa" w:w="1560"/>
+            <w:shd w:fill="EEEEEE" w:color="auto" w:val="clear"/>
+            <w:tcMar>
+              <w:top w:type="dxa" w:w="60"/>
+              <w:left w:type="dxa" w:w="70"/>
+              <w:bottom w:type="dxa" w:w="60"/>
+              <w:right w:type="dxa" w:w="70"/>
+            </w:tcMar>
+          </w:tcPr>
+          <w:p>
+            <w:r>
+              <w:rPr>
+                <w:b/>
+                <w:bCs/>
+                <w:sz w:val="15"/>
+                <w:szCs w:val="15"/>
+              </w:rPr>
+              <w:t xml:space="preserve">Keep, remove, or reconsider</w:t>
+            </w:r>
+          </w:p>
+        </w:tc>
+      </w:tr>
+      <w:tr>
+        <w:tc>
+          <w:tcPr>
+            <w:tcW w:type="dxa" w:w="1500"/>
+            <w:tcMar>
+              <w:top w:type="dxa" w:w="130"/>
+              <w:left w:type="dxa" w:w="70"/>
+              <w:bottom w:type="dxa" w:w="130"/>
+              <w:right w:type="dxa" w:w="70"/>
+            </w:tcMar>
+          </w:tcPr>
+          <w:p>
+            <w:r>
+              <w:t xml:space="preserve"/>
+            </w:r>
+          </w:p>
+        </w:tc>
+        <w:tc>
+          <w:tcPr>
+            <w:tcW w:type="dxa" w:w="2600"/>
+            <w:tcMar>
+              <w:top w:type="dxa" w:w="130"/>
+              <w:left w:type="dxa" w:w="70"/>
+              <w:bottom w:type="dxa" w:w="130"/>
+              <w:right w:type="dxa" w:w="70"/>
+            </w:tcMar>
+          </w:tcPr>
+          <w:p>
+            <w:r>
+              <w:t xml:space="preserve"/>
+            </w:r>
+          </w:p>
+        </w:tc>
+        <w:tc>
+          <w:tcPr>
+            <w:tcW w:type="dxa" w:w="1100"/>
+            <w:tcMar>
+              <w:top w:type="dxa" w:w="130"/>
+              <w:left w:type="dxa" w:w="70"/>
+              <w:bottom w:type="dxa" w:w="130"/>
+              <w:right w:type="dxa" w:w="70"/>
+            </w:tcMar>
+          </w:tcPr>
+          <w:p>
+            <w:r>
+              <w:t xml:space="preserve"/>
+            </w:r>
+          </w:p>
+        </w:tc>
+        <w:tc>
+          <w:tcPr>
+            <w:tcW w:type="dxa" w:w="1400"/>
+            <w:tcMar>
+              <w:top w:type="dxa" w:w="130"/>
+              <w:left w:type="dxa" w:w="70"/>
+              <w:bottom w:type="dxa" w:w="130"/>
+              <w:right w:type="dxa" w:w="70"/>
+            </w:tcMar>
+          </w:tcPr>
+          <w:p>
+            <w:r>
+              <w:t xml:space="preserve"/>
+            </w:r>
+          </w:p>
+        </w:tc>
+        <w:tc>
+          <w:tcPr>
+            <w:tcW w:type="dxa" w:w="1200"/>
+            <w:tcMar>
+              <w:top w:type="dxa" w:w="130"/>
+              <w:left w:type="dxa" w:w="70"/>
+              <w:bottom w:type="dxa" w:w="130"/>
+              <w:right w:type="dxa" w:w="70"/>
+            </w:tcMar>
+          </w:tcPr>
+          <w:p>
+            <w:r>
+              <w:t xml:space="preserve"/>
+            </w:r>
+          </w:p>
+        </w:tc>
+        <w:tc>
+          <w:tcPr>
+            <w:tcW w:type="dxa" w:w="1560"/>
+            <w:tcMar>
+              <w:top w:type="dxa" w:w="130"/>
+              <w:left w:type="dxa" w:w="70"/>
+              <w:bottom w:type="dxa" w:w="130"/>
+              <w:right w:type="dxa" w:w="70"/>
+            </w:tcMar>
+          </w:tcPr>
+          <w:p>
+            <w:r>
+              <w:t xml:space="preserve"/>
+            </w:r>
+          </w:p>
+        </w:tc>
+      </w:tr>
+      <w:tr>
+        <w:tc>
+          <w:tcPr>
+            <w:tcW w:type="dxa" w:w="1500"/>
+            <w:tcMar>
+              <w:top w:type="dxa" w:w="130"/>
+              <w:left w:type="dxa" w:w="70"/>
+              <w:bottom w:type="dxa" w:w="130"/>
+              <w:right w:type="dxa" w:w="70"/>
+            </w:tcMar>
+          </w:tcPr>
+          <w:p>
+            <w:r>
+              <w:t xml:space="preserve"/>
+            </w:r>
+          </w:p>
+        </w:tc>
+        <w:tc>
+          <w:tcPr>
+            <w:tcW w:type="dxa" w:w="2600"/>
+            <w:tcMar>
+              <w:top w:type="dxa" w:w="130"/>
+              <w:left w:type="dxa" w:w="70"/>
+              <w:bottom w:type="dxa" w:w="130"/>
+              <w:right w:type="dxa" w:w="70"/>
+            </w:tcMar>
+          </w:tcPr>
+          <w:p>
+            <w:r>
+              <w:t xml:space="preserve"/>
+            </w:r>
+          </w:p>
+        </w:tc>
+        <w:tc>
+          <w:tcPr>
+            <w:tcW w:type="dxa" w:w="1100"/>
+            <w:tcMar>
+              <w:top w:type="dxa" w:w="130"/>
+              <w:left w:type="dxa" w:w="70"/>
+              <w:bottom w:type="dxa" w:w="130"/>
+              <w:right w:type="dxa" w:w="70"/>
+            </w:tcMar>
+          </w:tcPr>
+          <w:p>
+            <w:r>
+              <w:t xml:space="preserve"/>
+            </w:r>
+          </w:p>
+        </w:tc>
+        <w:tc>
+          <w:tcPr>
+            <w:tcW w:type="dxa" w:w="1400"/>
+            <w:tcMar>
+              <w:top w:type="dxa" w:w="130"/>
+              <w:left w:type="dxa" w:w="70"/>
+              <w:bottom w:type="dxa" w:w="130"/>
+              <w:right w:type="dxa" w:w="70"/>
+            </w:tcMar>
+          </w:tcPr>
+          <w:p>
+            <w:r>
+              <w:t xml:space="preserve"/>
+            </w:r>
+          </w:p>
+        </w:tc>
+        <w:tc>
+          <w:tcPr>
+            <w:tcW w:type="dxa" w:w="1200"/>
+            <w:tcMar>
+              <w:top w:type="dxa" w:w="130"/>
+              <w:left w:type="dxa" w:w="70"/>
+              <w:bottom w:type="dxa" w:w="130"/>
+              <w:right w:type="dxa" w:w="70"/>
+            </w:tcMar>
+          </w:tcPr>
+          <w:p>
+            <w:r>
+              <w:t xml:space="preserve"/>
+            </w:r>
+          </w:p>
+        </w:tc>
+        <w:tc>
+          <w:tcPr>
+            <w:tcW w:type="dxa" w:w="1560"/>
+            <w:tcMar>
+              <w:top w:type="dxa" w:w="130"/>
+              <w:left w:type="dxa" w:w="70"/>
+              <w:bottom w:type="dxa" w:w="130"/>
+              <w:right w:type="dxa" w:w="70"/>
+            </w:tcMar>
+          </w:tcPr>
+          <w:p>
+            <w:r>
+              <w:t xml:space="preserve"/>
+            </w:r>
+          </w:p>
+        </w:tc>
+      </w:tr>
+      <w:tr>
+        <w:tc>
+          <w:tcPr>
+            <w:tcW w:type="dxa" w:w="1500"/>
+            <w:tcMar>
+              <w:top w:type="dxa" w:w="130"/>
+              <w:left w:type="dxa" w:w="70"/>
+              <w:bottom w:type="dxa" w:w="130"/>
+              <w:right w:type="dxa" w:w="70"/>
+            </w:tcMar>
+          </w:tcPr>
+          <w:p>
+            <w:r>
+              <w:t xml:space="preserve"/>
+            </w:r>
+          </w:p>
+        </w:tc>
+        <w:tc>
+          <w:tcPr>
+            <w:tcW w:type="dxa" w:w="2600"/>
+            <w:tcMar>
+              <w:top w:type="dxa" w:w="130"/>
+              <w:left w:type="dxa" w:w="70"/>
+              <w:bottom w:type="dxa" w:w="130"/>
+              <w:right w:type="dxa" w:w="70"/>
+            </w:tcMar>
+          </w:tcPr>
+          <w:p>
+            <w:r>
+              <w:t xml:space="preserve"/>
+            </w:r>
+          </w:p>
+        </w:tc>
+        <w:tc>
+          <w:tcPr>
+            <w:tcW w:type="dxa" w:w="1100"/>
+            <w:tcMar>
+              <w:top w:type="dxa" w:w="130"/>
+              <w:left w:type="dxa" w:w="70"/>
+              <w:bottom w:type="dxa" w:w="130"/>
+              <w:right w:type="dxa" w:w="70"/>
+            </w:tcMar>
+          </w:tcPr>
+          <w:p>
+            <w:r>
+              <w:t xml:space="preserve"/>
+            </w:r>
+          </w:p>
+        </w:tc>
+        <w:tc>
+          <w:tcPr>
+            <w:tcW w:type="dxa" w:w="1400"/>
+            <w:tcMar>
+              <w:top w:type="dxa" w:w="130"/>
+              <w:left w:type="dxa" w:w="70"/>
+              <w:bottom w:type="dxa" w:w="130"/>
+              <w:right w:type="dxa" w:w="70"/>
+            </w:tcMar>
+          </w:tcPr>
+          <w:p>
+            <w:r>
+              <w:t xml:space="preserve"/>
+            </w:r>
+          </w:p>
+        </w:tc>
+        <w:tc>
+          <w:tcPr>
+            <w:tcW w:type="dxa" w:w="1200"/>
+            <w:tcMar>
+              <w:top w:type="dxa" w:w="130"/>
+              <w:left w:type="dxa" w:w="70"/>
+              <w:bottom w:type="dxa" w:w="130"/>
+              <w:right w:type="dxa" w:w="70"/>
+            </w:tcMar>
+          </w:tcPr>
+          <w:p>
+            <w:r>
+              <w:t xml:space="preserve"/>
+            </w:r>
+          </w:p>
+        </w:tc>
+        <w:tc>
+          <w:tcPr>
+            <w:tcW w:type="dxa" w:w="1560"/>
+            <w:tcMar>
+              <w:top w:type="dxa" w:w="130"/>
+              <w:left w:type="dxa" w:w="70"/>
+              <w:bottom w:type="dxa" w:w="130"/>
+              <w:right w:type="dxa" w:w="70"/>
+            </w:tcMar>
+          </w:tcPr>
+          <w:p>
+            <w:r>
+              <w:t xml:space="preserve"/>
+            </w:r>
+          </w:p>
+        </w:tc>
+      </w:tr>
+      <w:tr>
+        <w:tc>
+          <w:tcPr>
+            <w:tcW w:type="dxa" w:w="1500"/>
+            <w:tcMar>
+              <w:top w:type="dxa" w:w="130"/>
+              <w:left w:type="dxa" w:w="70"/>
+              <w:bottom w:type="dxa" w:w="130"/>
+              <w:right w:type="dxa" w:w="70"/>
+            </w:tcMar>
+          </w:tcPr>
+          <w:p>
+            <w:r>
+              <w:t xml:space="preserve"/>
+            </w:r>
+          </w:p>
+        </w:tc>
+        <w:tc>
+          <w:tcPr>
+            <w:tcW w:type="dxa" w:w="2600"/>
+            <w:tcMar>
+              <w:top w:type="dxa" w:w="130"/>
+              <w:left w:type="dxa" w:w="70"/>
+              <w:bottom w:type="dxa" w:w="130"/>
+              <w:right w:type="dxa" w:w="70"/>
+            </w:tcMar>
+          </w:tcPr>
+          <w:p>
+            <w:r>
+              <w:t xml:space="preserve"/>
+            </w:r>
+          </w:p>
+        </w:tc>
+        <w:tc>
+          <w:tcPr>
+            <w:tcW w:type="dxa" w:w="1100"/>
+            <w:tcMar>
+              <w:top w:type="dxa" w:w="130"/>
+              <w:left w:type="dxa" w:w="70"/>
+              <w:bottom w:type="dxa" w:w="130"/>
+              <w:right w:type="dxa" w:w="70"/>
+            </w:tcMar>
+          </w:tcPr>
+          <w:p>
+            <w:r>
+              <w:t xml:space="preserve"/>
+            </w:r>
+          </w:p>
+        </w:tc>
+        <w:tc>
+          <w:tcPr>
+            <w:tcW w:type="dxa" w:w="1400"/>
+            <w:tcMar>
+              <w:top w:type="dxa" w:w="130"/>
+              <w:left w:type="dxa" w:w="70"/>
+              <w:bottom w:type="dxa" w:w="130"/>
+              <w:right w:type="dxa" w:w="70"/>
+            </w:tcMar>
+          </w:tcPr>
+          <w:p>
+            <w:r>
+              <w:t xml:space="preserve"/>
+            </w:r>
+          </w:p>
+        </w:tc>
+        <w:tc>
+          <w:tcPr>
+            <w:tcW w:type="dxa" w:w="1200"/>
+            <w:tcMar>
+              <w:top w:type="dxa" w:w="130"/>
+              <w:left w:type="dxa" w:w="70"/>
+              <w:bottom w:type="dxa" w:w="130"/>
+              <w:right w:type="dxa" w:w="70"/>
+            </w:tcMar>
+          </w:tcPr>
+          <w:p>
+            <w:r>
+              <w:t xml:space="preserve"/>
+            </w:r>
+          </w:p>
+        </w:tc>
+        <w:tc>
+          <w:tcPr>
+            <w:tcW w:type="dxa" w:w="1560"/>
+            <w:tcMar>
+              <w:top w:type="dxa" w:w="130"/>
+              <w:left w:type="dxa" w:w="70"/>
+              <w:bottom w:type="dxa" w:w="130"/>
+              <w:right w:type="dxa" w:w="70"/>
+            </w:tcMar>
+          </w:tcPr>
+          <w:p>
+            <w:r>
+              <w:t xml:space="preserve"/>
+            </w:r>
+          </w:p>
+        </w:tc>
+      </w:tr>
+      <w:tr>
+        <w:tc>
+          <w:tcPr>
+            <w:tcW w:type="dxa" w:w="1500"/>
+            <w:tcMar>
+              <w:top w:type="dxa" w:w="130"/>
+              <w:left w:type="dxa" w:w="70"/>
+              <w:bottom w:type="dxa" w:w="130"/>
+              <w:right w:type="dxa" w:w="70"/>
+            </w:tcMar>
+          </w:tcPr>
+          <w:p>
+            <w:r>
+              <w:t xml:space="preserve"/>
+            </w:r>
+          </w:p>
+        </w:tc>
+        <w:tc>
+          <w:tcPr>
+            <w:tcW w:type="dxa" w:w="2600"/>
+            <w:tcMar>
+              <w:top w:type="dxa" w:w="130"/>
+              <w:left w:type="dxa" w:w="70"/>
+              <w:bottom w:type="dxa" w:w="130"/>
+              <w:right w:type="dxa" w:w="70"/>
+            </w:tcMar>
+          </w:tcPr>
+          <w:p>
+            <w:r>
+              <w:t xml:space="preserve"/>
+            </w:r>
+          </w:p>
+        </w:tc>
+        <w:tc>
+          <w:tcPr>
+            <w:tcW w:type="dxa" w:w="1100"/>
+            <w:tcMar>
+              <w:top w:type="dxa" w:w="130"/>
+              <w:left w:type="dxa" w:w="70"/>
+              <w:bottom w:type="dxa" w:w="130"/>
+              <w:right w:type="dxa" w:w="70"/>
+            </w:tcMar>
+          </w:tcPr>
+          <w:p>
+            <w:r>
+              <w:t xml:space="preserve"/>
+            </w:r>
+          </w:p>
+        </w:tc>
+        <w:tc>
+          <w:tcPr>
+            <w:tcW w:type="dxa" w:w="1400"/>
+            <w:tcMar>
+              <w:top w:type="dxa" w:w="130"/>
+              <w:left w:type="dxa" w:w="70"/>
+              <w:bottom w:type="dxa" w:w="130"/>
+              <w:right w:type="dxa" w:w="70"/>
+            </w:tcMar>
+          </w:tcPr>
+          <w:p>
+            <w:r>
+              <w:t xml:space="preserve"/>
+            </w:r>
+          </w:p>
+        </w:tc>
+        <w:tc>
+          <w:tcPr>
+            <w:tcW w:type="dxa" w:w="1200"/>
+            <w:tcMar>
+              <w:top w:type="dxa" w:w="130"/>
+              <w:left w:type="dxa" w:w="70"/>
+              <w:bottom w:type="dxa" w:w="130"/>
+              <w:right w:type="dxa" w:w="70"/>
+            </w:tcMar>
+          </w:tcPr>
+          <w:p>
+            <w:r>
+              <w:t xml:space="preserve"/>
+            </w:r>
+          </w:p>
+        </w:tc>
+        <w:tc>
+          <w:tcPr>
+            <w:tcW w:type="dxa" w:w="1560"/>
+            <w:tcMar>
+              <w:top w:type="dxa" w:w="130"/>
+              <w:left w:type="dxa" w:w="70"/>
+              <w:bottom w:type="dxa" w:w="130"/>
+              <w:right w:type="dxa" w:w="70"/>
+            </w:tcMar>
+          </w:tcPr>
+          <w:p>
+            <w:r>
+              <w:t xml:space="preserve"/>
+            </w:r>
+          </w:p>
+        </w:tc>
+      </w:tr>
+    </w:tbl>
+    <w:p>
+      <w:pPr>
+        <w:spacing w:after="60" w:line="276"/>
+      </w:pPr>
+      <w:r>
+        <w:t xml:space="preserve"/>
+      </w:r>
+    </w:p>
+    <w:p>
+      <w:pPr>
+        <w:spacing w:after="40"/>
+      </w:pPr>
+      <w:r>
+        <w:rPr>
+          <w:b/>
+          <w:bCs/>
+        </w:rPr>
+        <w:t xml:space="preserve">Later-chapter list (record, do not complete)</w:t>
+      </w:r>
+    </w:p>
+    <w:p>
+      <w:pPr>
+        <w:spacing w:after="70" w:line="276"/>
+        <w:ind w:left="200"/>
+      </w:pPr>
+      <w:r>
+        <w:t xml:space="preserve">☐  Contact information (Chapter 5)</w:t>
+      </w:r>
+    </w:p>
+    <w:p>
+      <w:pPr>
+        <w:spacing w:after="70" w:line="276"/>
+        <w:ind w:left="200"/>
+      </w:pPr>
+      <w:r>
+        <w:t xml:space="preserve">☐  Payments (Chapter 6)</w:t>
+      </w:r>
+    </w:p>
+    <w:p>
+      <w:pPr>
+        <w:spacing w:after="70" w:line="276"/>
+        <w:ind w:left="200"/>
+      </w:pPr>
+      <w:r>
+        <w:t xml:space="preserve">☐  Checkout (Chapter 6)</w:t>
+      </w:r>
+    </w:p>
+    <w:p>
+      <w:pPr>
+        <w:spacing w:after="70" w:line="276"/>
+        <w:ind w:left="200"/>
+      </w:pPr>
+      <w:r>
+        <w:t xml:space="preserve">☐  Fulfillment (Chapter 7)</w:t>
+      </w:r>
+    </w:p>
+    <w:p>
+      <w:pPr>
+        <w:spacing w:after="70" w:line="276"/>
+        <w:ind w:left="200"/>
+      </w:pPr>
+      <w:r>
+        <w:t xml:space="preserve">☐  Shipping (Chapter 7)</w:t>
+      </w:r>
+    </w:p>
+    <w:p>
+      <w:pPr>
+        <w:spacing w:after="70" w:line="276"/>
+        <w:ind w:left="200"/>
+      </w:pPr>
+      <w:r>
+        <w:t xml:space="preserve">☐  Products (Chapter 8)</w:t>
+      </w:r>
+    </w:p>
+    <w:p>
+      <w:pPr>
+        <w:spacing w:after="70" w:line="276"/>
+        <w:ind w:left="200"/>
+      </w:pPr>
+      <w:r>
+        <w:t xml:space="preserve">☐  Collections (Chapter 9)</w:t>
+      </w:r>
+    </w:p>
+    <w:p>
+      <w:pPr>
+        <w:spacing w:after="70" w:line="276"/>
+        <w:ind w:left="200"/>
+      </w:pPr>
+      <w:r>
+        <w:t xml:space="preserve">☐  Navigation (Chapter 9)</w:t>
+      </w:r>
+    </w:p>
+    <w:p>
+      <w:pPr>
+        <w:spacing w:after="70" w:line="276"/>
+        <w:ind w:left="200"/>
+      </w:pPr>
+      <w:r>
+        <w:t xml:space="preserve">☐  Policies (Chapter 10)</w:t>
+      </w:r>
+    </w:p>
+    <w:p>
+      <w:pPr>
+        <w:spacing w:after="70" w:line="276"/>
+        <w:ind w:left="200"/>
+      </w:pPr>
+      <w:r>
+        <w:t xml:space="preserve">☐  Testing (Chapter 11)</w:t>
+      </w:r>
+    </w:p>
+    <w:p>
+      <w:pPr>
+        <w:spacing w:after="70" w:line="276"/>
+        <w:ind w:left="200"/>
+      </w:pPr>
+      <w:r>
+        <w:t xml:space="preserve">☐  Domain (Chapter 12)</w:t>
+      </w:r>
+    </w:p>
+    <w:p>
+      <w:pPr>
+        <w:spacing w:after="70" w:line="276"/>
+        <w:ind w:left="200"/>
+      </w:pPr>
+      <w:r>
+        <w:t xml:space="preserve">☐  Launch (Chapter 12)</w:t>
+      </w:r>
+    </w:p>
+    <w:p>
+      <w:pPr>
+        <w:spacing w:after="40"/>
+      </w:pPr>
+      <w:r>
+        <w:rPr>
+          <w:b/>
+          <w:bCs/>
+        </w:rPr>
+        <w:t xml:space="preserve">Final foundation decision</w:t>
+      </w:r>
+    </w:p>
+    <w:p>
+      <w:pPr>
+        <w:pStyle w:val="ListParagraph"/>
+        <w:numPr>
+          <w:ilvl w:val="0"/>
+          <w:numId w:val="1"/>
+        </w:numPr>
+        <w:spacing w:after="80" w:line="276"/>
+      </w:pPr>
+      <w:r>
+        <w:t xml:space="preserve">My Shopify foundation is ready for the next chapter: Yes / No</w:t>
+      </w:r>
+    </w:p>
+    <w:p>
+      <w:pPr>
+        <w:spacing w:after="40" w:line="276"/>
+      </w:pPr>
+      <w:r>
+        <w:t xml:space="preserve">If no, the blocking issue is:</w:t>
+      </w:r>
+    </w:p>
+    <w:p>
+      <w:pPr>
+        <w:pBdr>
+          <w:bottom w:val="single" w:color="999999" w:sz="6" w:space="1"/>
+        </w:pBdr>
+        <w:spacing w:after="220"/>
+      </w:pPr>
+      <w:r>
+        <w:t xml:space="preserve"/>
+      </w:r>
+    </w:p>
+    <w:p>
+      <w:r>
+        <w:br w:type="page"/>
+      </w:r>
+    </w:p>
+    <w:p>
+      <w:pPr>
+        <w:pStyle w:val="Heading1"/>
+        <w:spacing w:after="160" w:before="240"/>
+      </w:pPr>
+      <w:r>
+        <w:t xml:space="preserve">Internal Reviewer Note (remove before publishing)</w:t>
+      </w:r>
+    </w:p>
+    <w:p>
+      <w:pPr>
+        <w:spacing w:after="140" w:line="276"/>
+      </w:pPr>
+      <w:r>
+        <w:t xml:space="preserve">This note lists what the draft assumes and what it still needs. It is for the internal review process, not for the buyer.</w:t>
+      </w:r>
+    </w:p>
+    <w:p>
+      <w:pPr>
+        <w:pStyle w:val="Heading2"/>
+        <w:spacing w:after="100" w:before="200"/>
+      </w:pPr>
+      <w:r>
+        <w:t xml:space="preserve">Assumptions made</w:t>
+      </w:r>
+    </w:p>
+    <w:p>
+      <w:pPr>
+        <w:pStyle w:val="ListParagraph"/>
+        <w:numPr>
+          <w:ilvl w:val="0"/>
+          <w:numId w:val="1"/>
+        </w:numPr>
+        <w:spacing w:after="80" w:line="276"/>
+      </w:pPr>
+      <w:r>
+        <w:t xml:space="preserve">The guide is sold as a digital product (PDF) to individual buyers.</w:t>
+      </w:r>
+    </w:p>
+    <w:p>
+      <w:pPr>
+        <w:pStyle w:val="ListParagraph"/>
+        <w:numPr>
+          <w:ilvl w:val="0"/>
+          <w:numId w:val="1"/>
+        </w:numPr>
+        <w:spacing w:after="80" w:line="276"/>
+      </w:pPr>
+      <w:r>
+        <w:t xml:space="preserve">Lucid Creations is an active Shopify store under Auralis Digital selling print-on-demand products; handmade products and commissions may be added later.</w:t>
+      </w:r>
+    </w:p>
+    <w:p>
+      <w:pPr>
+        <w:pStyle w:val="ListParagraph"/>
+        <w:numPr>
+          <w:ilvl w:val="0"/>
+          <w:numId w:val="1"/>
+        </w:numPr>
+        <w:spacing w:after="80" w:line="276"/>
+      </w:pPr>
+      <w:r>
+        <w:t xml:space="preserve">The reader has a computer and can sign up for Shopify on their own.</w:t>
+      </w:r>
+    </w:p>
+    <w:p>
+      <w:pPr>
+        <w:pStyle w:val="ListParagraph"/>
+        <w:numPr>
+          <w:ilvl w:val="0"/>
+          <w:numId w:val="1"/>
+        </w:numPr>
+        <w:spacing w:after="80" w:line="276"/>
+      </w:pPr>
+      <w:r>
+        <w:t xml:space="preserve">Front matter, the table of contents, Chapters 1 through 4, and their worksheets are the only drafted sections. Chapters 5–12 and the remaining worksheets are pending approval to continue.</w:t>
+      </w:r>
+    </w:p>
+    <w:p>
+      <w:pPr>
+        <w:pStyle w:val="Heading2"/>
+        <w:spacing w:after="100" w:before="200"/>
+      </w:pPr>
+      <w:r>
+        <w:t xml:space="preserve">Missing information</w:t>
+      </w:r>
+    </w:p>
+    <w:p>
+      <w:pPr>
+        <w:pStyle w:val="ListParagraph"/>
+        <w:numPr>
+          <w:ilvl w:val="0"/>
+          <w:numId w:val="1"/>
+        </w:numPr>
+        <w:spacing w:after="80" w:line="276"/>
+      </w:pPr>
+      <w:r>
+        <w:t xml:space="preserve">The last-updated date and copyright year (left as [INSERT DATE] and [INSERT YEAR]).</w:t>
+      </w:r>
+    </w:p>
+    <w:p>
+      <w:pPr>
+        <w:pStyle w:val="ListParagraph"/>
+        <w:numPr>
+          <w:ilvl w:val="0"/>
+          <w:numId w:val="1"/>
+        </w:numPr>
+        <w:spacing w:after="80" w:line="276"/>
+      </w:pPr>
+      <w:r>
+        <w:t xml:space="preserve">The Auralis Digital service link for the final conversion page ([INSERT AURALIS DIGITAL SERVICE LINK]).</w:t>
+      </w:r>
+    </w:p>
+    <w:p>
+      <w:pPr>
+        <w:pStyle w:val="ListParagraph"/>
+        <w:numPr>
+          <w:ilvl w:val="0"/>
+          <w:numId w:val="1"/>
+        </w:numPr>
+        <w:spacing w:after="80" w:line="276"/>
+      </w:pPr>
+      <w:r>
+        <w:t xml:space="preserve">Official Shopify URLs (left as [ADD OFFICIAL SHOPIFY LINK] rather than invented).</w:t>
+      </w:r>
+    </w:p>
+    <w:p>
+      <w:pPr>
+        <w:pStyle w:val="ListParagraph"/>
+        <w:numPr>
+          <w:ilvl w:val="0"/>
+          <w:numId w:val="1"/>
+        </w:numPr>
+        <w:spacing w:after="80" w:line="276"/>
+      </w:pPr>
+      <w:r>
+        <w:t xml:space="preserve">Official search links for Chapter 3, left as placeholders rather than invented: [ADD OFFICIAL STATE BUSINESS SEARCH LINK], [ADD OFFICIAL USPTO SEARCH LINK], [ADD OFFICIAL DOMAIN SEARCH LINK].</w:t>
+      </w:r>
+    </w:p>
+    <w:p>
+      <w:pPr>
+        <w:pStyle w:val="ListParagraph"/>
+        <w:numPr>
+          <w:ilvl w:val="0"/>
+          <w:numId w:val="1"/>
+        </w:numPr>
+        <w:spacing w:after="80" w:line="276"/>
+      </w:pPr>
+      <w:r>
+        <w:t xml:space="preserve">Official Shopify links for Chapter 4, left as placeholders rather than invented: [ADD OFFICIAL SHOPIFY ACCOUNT-CREATION LINK], [ADD OFFICIAL SHOPIFY INITIAL-SETUP LINK], [ADD OFFICIAL SHOPIFY GENERAL-SETTINGS LINK], [ADD OFFICIAL SHOPIFY SECURITY LINK], [ADD OFFICIAL SHOPIFY PRICING LINK].</w:t>
+      </w:r>
+    </w:p>
+    <w:p>
+      <w:pPr>
+        <w:pStyle w:val="Heading2"/>
+        <w:spacing w:after="100" w:before="200"/>
+      </w:pPr>
+      <w:r>
+        <w:t xml:space="preserve">Lucid Creations examples needed</w:t>
+      </w:r>
+    </w:p>
+    <w:p>
+      <w:pPr>
+        <w:pStyle w:val="ListParagraph"/>
+        <w:numPr>
+          <w:ilvl w:val="0"/>
+          <w:numId w:val="1"/>
+        </w:numPr>
+        <w:spacing w:after="80" w:line="276"/>
+      </w:pPr>
+      <w:r>
+        <w:t xml:space="preserve">Chapter 1: which products Lucid Creations launched with, why they were chosen, and what you would change today (no sales or performance figures).</w:t>
+      </w:r>
+    </w:p>
+    <w:p>
+      <w:pPr>
+        <w:pStyle w:val="ListParagraph"/>
+        <w:numPr>
+          <w:ilvl w:val="0"/>
+          <w:numId w:val="1"/>
+        </w:numPr>
+        <w:spacing w:after="80" w:line="276"/>
+      </w:pPr>
+      <w:r>
+        <w:t xml:space="preserve">Chapter 2: Christopher’s own wording for Lucid Creations’ starting customer and offer statement (placeholder [INSERT LUCID CREATIONS CUSTOMER AND OFFER EXAMPLE]). The offer statement currently shown in Chapter 2 is a working example for review, not approved brand language.</w:t>
+      </w:r>
+    </w:p>
+    <w:p>
+      <w:pPr>
+        <w:pStyle w:val="ListParagraph"/>
+        <w:numPr>
+          <w:ilvl w:val="0"/>
+          <w:numId w:val="1"/>
+        </w:numPr>
+        <w:spacing w:after="80" w:line="276"/>
+      </w:pPr>
+      <w:r>
+        <w:t xml:space="preserve">Chapter 3: why “Lucid Creations” was chosen, other names considered, whether the name ever caused confusion, and what would be done differently today (placeholder [INSERT LUCID CREATIONS NAMING EXAMPLE]). Do not claim the name is trademarked or legally protected.</w:t>
+      </w:r>
+    </w:p>
+    <w:p>
+      <w:pPr>
+        <w:pStyle w:val="ListParagraph"/>
+        <w:numPr>
+          <w:ilvl w:val="0"/>
+          <w:numId w:val="1"/>
+        </w:numPr>
+        <w:spacing w:after="80" w:line="276"/>
+      </w:pPr>
+      <w:r>
+        <w:t xml:space="preserve">Chapter 4: which initial Shopify settings were selected, which setup decisions caused confusion, which apps (if any) were installed too early, what would be configured differently today, and which private details must be excluded from the published guide (placeholder [INSERT LUCID CREATIONS INITIAL SHOPIFY SETUP EXAMPLE]). Do not invent the plan, billing cost, trial terms, currency, time zone, address, security method, app list, account email, or internal Shopify URLs.</w:t>
+      </w:r>
+    </w:p>
+    <w:p>
+      <w:pPr>
+        <w:pStyle w:val="Heading2"/>
+        <w:spacing w:after="100" w:before="200"/>
+      </w:pPr>
+      <w:r>
+        <w:t xml:space="preserve">Screenshots needed</w:t>
+      </w:r>
+    </w:p>
+    <w:p>
+      <w:pPr>
+        <w:pStyle w:val="ListParagraph"/>
+        <w:numPr>
+          <w:ilvl w:val="0"/>
+          <w:numId w:val="1"/>
+        </w:numPr>
+        <w:spacing w:after="80" w:line="276"/>
+      </w:pPr>
+      <w:r>
+        <w:t xml:space="preserve">Chapters 1 through 3 do not require screenshots. Chapter 4 is the first chapter that needs them. Required Chapter 4 screenshots (each caption must state what to locate, the capture date, and that the interface may change):</w:t>
+      </w:r>
+    </w:p>
+    <w:p>
+      <w:pPr>
+        <w:pStyle w:val="ListParagraph"/>
+        <w:numPr>
+          <w:ilvl w:val="1"/>
+          <w:numId w:val="1"/>
+        </w:numPr>
+        <w:spacing w:after="60" w:line="276"/>
+      </w:pPr>
+      <w:r>
+        <w:t xml:space="preserve">[INSERT SCREENSHOT — Shopify account creation or initial admin screen]</w:t>
+      </w:r>
+    </w:p>
+    <w:p>
+      <w:pPr>
+        <w:pStyle w:val="ListParagraph"/>
+        <w:numPr>
+          <w:ilvl w:val="1"/>
+          <w:numId w:val="1"/>
+        </w:numPr>
+        <w:spacing w:after="60" w:line="276"/>
+      </w:pPr>
+      <w:r>
+        <w:t xml:space="preserve">[INSERT SCREENSHOT — Shopify admin navigation with sensitive information removed]</w:t>
+      </w:r>
+    </w:p>
+    <w:p>
+      <w:pPr>
+        <w:pStyle w:val="ListParagraph"/>
+        <w:numPr>
+          <w:ilvl w:val="1"/>
+          <w:numId w:val="1"/>
+        </w:numPr>
+        <w:spacing w:after="60" w:line="276"/>
+      </w:pPr>
+      <w:r>
+        <w:t xml:space="preserve">[INSERT SCREENSHOT — Settings area used for core store defaults]</w:t>
+      </w:r>
+    </w:p>
+    <w:p>
+      <w:pPr>
+        <w:pStyle w:val="ListParagraph"/>
+        <w:numPr>
+          <w:ilvl w:val="1"/>
+          <w:numId w:val="1"/>
+        </w:numPr>
+        <w:spacing w:after="60" w:line="276"/>
+      </w:pPr>
+      <w:r>
+        <w:t xml:space="preserve">[INSERT SCREENSHOT — time-zone, currency, and measurement settings]</w:t>
+      </w:r>
+    </w:p>
+    <w:p>
+      <w:pPr>
+        <w:pStyle w:val="ListParagraph"/>
+        <w:numPr>
+          <w:ilvl w:val="1"/>
+          <w:numId w:val="1"/>
+        </w:numPr>
+        <w:spacing w:after="60" w:line="276"/>
+      </w:pPr>
+      <w:r>
+        <w:t xml:space="preserve">[INSERT SCREENSHOT — account security page with all private details removed]</w:t>
+      </w:r>
+    </w:p>
+    <w:p>
+      <w:pPr>
+        <w:pStyle w:val="ListParagraph"/>
+        <w:numPr>
+          <w:ilvl w:val="0"/>
+          <w:numId w:val="1"/>
+        </w:numPr>
+        <w:spacing w:after="80" w:line="276"/>
+      </w:pPr>
+      <w:r>
+        <w:t xml:space="preserve">Sensitive information that must be removed from every Chapter 4 screenshot: account and contact email addresses, personal names, phone numbers, full business address, the store’s myshopify.com URL and any admin URLs, order and customer data, recovery codes, QR codes, and any authentication secrets.</w:t>
+      </w:r>
+    </w:p>
+    <w:p>
+      <w:pPr>
+        <w:pStyle w:val="Heading2"/>
+        <w:spacing w:after="100" w:before="200"/>
+      </w:pPr>
+      <w:r>
+        <w:t xml:space="preserve">Claims and links to verify</w:t>
+      </w:r>
+    </w:p>
+    <w:p>
+      <w:pPr>
+        <w:pStyle w:val="ListParagraph"/>
+        <w:numPr>
+          <w:ilvl w:val="0"/>
+          <w:numId w:val="1"/>
+        </w:numPr>
+        <w:spacing w:after="80" w:line="276"/>
+      </w:pPr>
+      <w:r>
+        <w:t xml:space="preserve">Confirm the list of product types Shopify supports matches how you want to present it.</w:t>
+      </w:r>
+    </w:p>
+    <w:p>
+      <w:pPr>
+        <w:pStyle w:val="ListParagraph"/>
+        <w:numPr>
+          <w:ilvl w:val="0"/>
+          <w:numId w:val="1"/>
+        </w:numPr>
+        <w:spacing w:after="80" w:line="276"/>
+      </w:pPr>
+      <w:r>
+        <w:t xml:space="preserve">Confirm the Lucid Creations positioning summary in Chapter 2 (psychedelic art, electronic music, festival culture, sacred geometry, alternative design; apparel, blankets, tapestries, wall art, accessories) matches how you want Lucid described.</w:t>
+      </w:r>
+    </w:p>
+    <w:p>
+      <w:pPr>
+        <w:pStyle w:val="ListParagraph"/>
+        <w:numPr>
+          <w:ilvl w:val="0"/>
+          <w:numId w:val="1"/>
+        </w:numPr>
+        <w:spacing w:after="80" w:line="276"/>
+      </w:pPr>
+      <w:r>
+        <w:t xml:space="preserve">Verify any Shopify-specific setting names against the current interface before publishing (flagged with [VERIFY CURRENT SHOPIFY SETTING] in later chapters).</w:t>
+      </w:r>
+    </w:p>
+    <w:p>
+      <w:pPr>
+        <w:pStyle w:val="ListParagraph"/>
+        <w:numPr>
+          <w:ilvl w:val="0"/>
+          <w:numId w:val="1"/>
+        </w:numPr>
+        <w:spacing w:after="80" w:line="276"/>
+      </w:pPr>
+      <w:r>
+        <w:t xml:space="preserve">Before publishing, replace the Chapter 3 official-search placeholders with verified current URLs (Shopify, state business search, USPTO trademark search, domain search). Do not hard-code any of these links until confirmed.</w:t>
+      </w:r>
+    </w:p>
+    <w:p>
+      <w:pPr>
+        <w:pStyle w:val="ListParagraph"/>
+        <w:numPr>
+          <w:ilvl w:val="0"/>
+          <w:numId w:val="1"/>
+        </w:numPr>
+        <w:spacing w:after="80" w:line="276"/>
+      </w:pPr>
+      <w:r>
+        <w:t xml:space="preserve">Chapter 4 states two interface facts as current: core store defaults (store details, currency, measurement units, time zone) are under Settings → General, and two-step authentication is required to use Shopify Payments. Re-verify both — plus every exact field name and menu path — against the Shopify Help Center immediately before publication.</w:t>
+      </w:r>
+    </w:p>
+    <w:p>
+      <w:pPr>
+        <w:pStyle w:val="ListParagraph"/>
+        <w:numPr>
+          <w:ilvl w:val="0"/>
+          <w:numId w:val="1"/>
+        </w:numPr>
+        <w:spacing w:after="80" w:line="276"/>
+      </w:pPr>
+      <w:r>
+        <w:t xml:space="preserve">Do not publish Shopify plan names, prices, trial durations, promotional rates, staff-account limits, or transaction fees in Chapter 4 unless each item is verified immediately before publication (all currently left as placeholders).</w:t>
+      </w:r>
+    </w:p>
+    <w:p>
+      <w:pPr>
+        <w:pStyle w:val="Heading2"/>
+        <w:spacing w:after="100" w:before="200"/>
+      </w:pPr>
+      <w:r>
+        <w:t xml:space="preserve">Interface verification</w:t>
+      </w:r>
+    </w:p>
+    <w:p>
+      <w:pPr>
+        <w:pStyle w:val="ListParagraph"/>
+        <w:numPr>
+          <w:ilvl w:val="0"/>
+          <w:numId w:val="1"/>
+        </w:numPr>
+        <w:spacing w:after="80" w:line="276"/>
+      </w:pPr>
+      <w:r>
+        <w:t xml:space="preserve">Chapter 4 interface details were checked against the Shopify Help Center on 2026-07-16 (source: Shopify Help Center, “Set up your business settings,” help.shopify.com/en/manual/intro-to-shopify/initial-setup/setup-business-settings). Shopify’s interface and requirements can change; re-verify before publishing and update this date. All other exact paths, field names, plan details, and links in Chapter 4 remain placeholders pending verification.</w:t>
+      </w:r>
+    </w:p>
+    <w:p>
+      <w:pPr>
+        <w:pStyle w:val="Heading2"/>
+        <w:spacing w:after="100" w:before="200"/>
+      </w:pPr>
+      <w:r>
         <w:t xml:space="preserve">Scope check</w:t>
       </w:r>
     </w:p>
@@ -5562,7 +8724,7 @@
         <w:spacing w:after="140" w:line="276"/>
       </w:pPr>
       <w:r>
-        <w:t xml:space="preserve">This draft stays within the locked scope. Chapter 1 decides what to sell; Chapter 2 defines one starting customer and a one-sentence offer; Chapter 3 chooses a usable store name with a preliminary availability check — without drifting into branding, logos, trademark applications, LLC or assumed-name filings, EIN, domain DNS or connection, email setup, or SEO. Printify is mentioned only as one future fulfillment option and is not taught. No chapters beyond Chapter 3 were added. Recommended status for this pass: review Chapter 3, then approve to continue to Chapter 4.</w:t>
+        <w:t xml:space="preserve">This draft stays within the locked scope. Chapter 1 decides what to sell; Chapter 2 defines one starting customer and a one-sentence offer; Chapter 3 chooses a usable store name with a preliminary availability check; Chapter 4 creates the store, configures core defaults (currency, time zone, units), secures the account, reviews the plan/billing boundary, and records later tasks — without drifting into theme or storefront design, products, collections, navigation, customer-facing pages, payments, checkout, taxes, shipping, fulfillment, Printify, domain or DNS, email setup, policies, testing, launch, or staff-permission administration. Printify is mentioned only as one future fulfillment option and is not taught. No chapters beyond Chapter 4 were added. Recommended status for this pass: review Chapter 4, then approve to continue to Chapter 5.</w:t>
       </w:r>
     </w:p>
     <w:sectPr>
@@ -5809,6 +8971,18 @@
       </w:pPr>
     </w:lvl>
   </w:abstractNum>
+  <w:abstractNum w:abstractNumId="5" w15:restartNumberingAfterBreak="0">
+    <w:multiLevelType w:val="hybridMultilevel"/>
+    <w:lvl w:ilvl="0" w15:tentative="1">
+      <w:start w:val="1"/>
+      <w:numFmt w:val="decimal"/>
+      <w:lvlText w:val="%1."/>
+      <w:lvlJc w:val="start"/>
+      <w:pPr>
+        <w:ind w:left="460" w:hanging="300"/>
+      </w:pPr>
+    </w:lvl>
+  </w:abstractNum>
   <w:num w:numId="1">
     <w:abstractNumId w:val="1"/>
     <w:lvlOverride w:ilvl="0">
@@ -5829,6 +9003,12 @@
   </w:num>
   <w:num w:numId="4">
     <w:abstractNumId w:val="4"/>
+    <w:lvlOverride w:ilvl="0">
+      <w:startOverride w:val="1"/>
+    </w:lvlOverride>
+  </w:num>
+  <w:num w:numId="5">
+    <w:abstractNumId w:val="5"/>
     <w:lvlOverride w:ilvl="0">
       <w:startOverride w:val="1"/>
     </w:lvlOverride>

</xml_diff>

<commit_message>
docs: clarify Chapter 6 checkout claims
Co-Authored-By: Claude Opus 4.8 <noreply@anthropic.com>
</commit_message>
<xml_diff>
--- a/docs/guides/shopify/Build-Your-First-Shopify-Store-DRAFT.docx
+++ b/docs/guides/shopify/Build-Your-First-Shopify-Store-DRAFT.docx
@@ -13135,7 +13135,7 @@
         <w:t xml:space="preserve">Review customer-account requirements.</w:t>
       </w:r>
       <w:r>
-        <w:t xml:space="preserve"> Checkout may permit guest checkout, offer optional customer accounts, or require sign-in in some configurations. Requiring an account adds friction and should serve a clear operational purpose. This guide does not teach account customization or B2B accounts, and does not require customer accounts unless necessary. Why it matters: forcing accounts can cost you sales. Done when: you have made a deliberate guest/account decision. [VERIFY CURRENT SHOPIFY SETTING]</w:t>
+        <w:t xml:space="preserve"> Checkout may permit guest checkout, offer optional customer accounts, or require sign-in in some configurations. Requiring an account adds friction and should serve a clear operational purpose. This guide does not teach account customization or B2B accounts, and does not require customer accounts unless necessary. Why it matters: requiring an account adds another step that customers must complete before placing an order. Done when: you have made a deliberate guest/account decision. [VERIFY CURRENT SHOPIFY SETTING]</w:t>
       </w:r>
     </w:p>
     <w:p>
@@ -13254,7 +13254,7 @@
         <w:t xml:space="preserve">Run one successful simulated payment.</w:t>
       </w:r>
       <w:r>
-        <w:t xml:space="preserve"> Open the storefront as a customer, add a test product to the cart, proceed to checkout, use fictional customer information, use only the official test-payment details for your selected provider, and complete checkout. Confirm the order appears in Shopify, the payment status indicates a test or simulated transaction, and no real payment was captured; review the confirmation page and the order notification email. Do not fulfill the test order or purchase a shipping label. Why it matters: this proves checkout works end to end without risk. Done when: a successful simulated order is recorded without a real charge.</w:t>
+        <w:t xml:space="preserve"> Open the storefront as a customer, add a test product to the cart, proceed to checkout, use fictional customer information, use only the official test-payment details for your selected provider, and complete checkout. Confirm the order appears in Shopify, the payment status indicates a test or simulated transaction, and no real payment was captured; review the confirmation page and the order notification email. Do not fulfill the test order or purchase a shipping label. Why it matters: this confirms that the payment portion of checkout can complete successfully without a real charge. Done when: a successful simulated order is recorded without a real charge.</w:t>
       </w:r>
     </w:p>
     <w:p>

</xml_diff>

<commit_message>
docs: remove unsupported Chapter 7 outcome claims
Co-Authored-By: Claude Opus 4.8 <noreply@anthropic.com>
</commit_message>
<xml_diff>
--- a/docs/guides/shopify/Build-Your-First-Shopify-Store-DRAFT.docx
+++ b/docs/guides/shopify/Build-Your-First-Shopify-Store-DRAFT.docx
@@ -17945,7 +17945,7 @@
         <w:spacing w:after="140" w:line="276"/>
       </w:pPr>
       <w:r>
-        <w:t xml:space="preserve">Customers judge a store by whether the right item arrives, on a reasonable timeline, with clear updates. Fulfillment is where that promise is kept or broken. Deciding now who produces, packs, ships, and communicates for each product — before orders start arriving — prevents the most common early failures: unfunded production charges, orders shipped by mistake, missing tracking, and confusing split deliveries. Connecting a fulfillment app does not remove your responsibility; it changes who does which part.</w:t>
+        <w:t xml:space="preserve">Customers judge a store by whether the right item arrives, on a reasonable timeline, with clear updates. Fulfillment is where that promise is kept or broken. Deciding now who produces, packs, ships, and communicates for each product helps the merchant identify risks such as unfunded production charges, incorrect fulfillment actions, missing tracking, and unclear split deliveries before live orders arrive. Connecting a fulfillment app does not remove your responsibility; it changes who does which part.</w:t>
       </w:r>
     </w:p>
     <w:p>
@@ -18304,7 +18304,7 @@
         <w:t xml:space="preserve">Plan digital-product delivery.</w:t>
       </w:r>
       <w:r>
-        <w:t xml:space="preserve"> Define the file or access delivered; the delivery method; whether delivery is automatic or manual; when access is sent; how access is tested; what happens if the link fails; whether updates are included; and how unauthorized sharing is handled operationally. Physical shipping should be disabled for a digital-only product, Shopify generally requires an app or delivery mechanism to provide download access, and the exact app choice is outside this chapter. Why it matters: a broken download becomes an instant refund. Done when: you have a defined digital-delivery path.</w:t>
+        <w:t xml:space="preserve"> Define the file or access delivered; the delivery method; whether delivery is automatic or manual; when access is sent; how access is tested; what happens if the link fails; whether updates are included; and how unauthorized sharing is handled operationally. Physical shipping should be disabled for a digital-only product, Shopify generally requires an app or delivery mechanism to provide download access, and the exact app choice is outside this chapter. Why it matters: a failed download prevents the customer from receiving the product they purchased. Done when: you have a defined digital-delivery path.</w:t>
       </w:r>
     </w:p>
     <w:p>
@@ -18350,7 +18350,7 @@
         <w:t xml:space="preserve">Plan service and commission delivery.</w:t>
       </w:r>
       <w:r>
-        <w:t xml:space="preserve"> Document what starts the work; what information the customer must provide; whether approval is required; how revisions are handled operationally; how completed work is delivered; when the order is marked complete; how long you realistically need; and what happens when the customer does not respond. Do not draft legal terms, contracts, refund rules, or detailed commission policies. Why it matters: services fail from unclear steps, not bad work. Done when: the service or commission has a clear delivery sequence.</w:t>
+        <w:t xml:space="preserve"> Document what starts the work; what information the customer must provide; whether approval is required; how revisions are handled operationally; how completed work is delivered; when the order is marked complete; how long you realistically need; and what happens when the customer does not respond. Do not draft legal terms, contracts, refund rules, or detailed commission policies. Why it matters: unclear steps can create confusion about what happens next and when the work is complete. Done when: the service or commission has a clear delivery sequence.</w:t>
       </w:r>
     </w:p>
     <w:p>
@@ -18403,7 +18403,7 @@
         <w:t xml:space="preserve">Define the customer-update process.</w:t>
       </w:r>
       <w:r>
-        <w:t xml:space="preserve"> For each fulfillment method, determine when the order confirmation is sent; when production begins; when the order is delayed; when tracking is sent; when part of an order ships; when the order is delivered digitally; when a commission needs customer approval; who answers status questions; and which system is the source of truth. Do not write complete notification templates. Why it matters: silence during fulfillment generates support tickets and disputes. Done when: each delivery path has a defined customer-update sequence.</w:t>
+        <w:t xml:space="preserve"> For each fulfillment method, determine when the order confirmation is sent; when production begins; when the order is delayed; when tracking is sent; when part of an order ships; when the order is delivered digitally; when a commission needs customer approval; who answers status questions; and which system is the source of truth. Do not write complete notification templates. Why it matters: customers need clear updates when fulfillment status changes or an order is delayed. Done when: each delivery path has a defined customer-update sequence.</w:t>
       </w:r>
     </w:p>
     <w:p>
@@ -18423,7 +18423,7 @@
         <w:t xml:space="preserve">Define the exception process.</w:t>
       </w:r>
       <w:r>
-        <w:t xml:space="preserve"> Create a basic response path for: an invalid or incomplete address; a product unavailable; a variant unavailable; a production payment failure; a provider rejection; a production delay; a lost package; a damaged product; an incorrect product; missing tracking; a split shipment; a digital-link failure; a customer who failed to provide commission details; an order routed to the wrong location; a duplicate fulfillment action; and other. Do not promise a particular refund, reprint, or replacement outcome — policies governing refunds, returns, replacements, and cancellations are handled in Chapter 10. Why it matters: exceptions handled ad hoc become angry customers. Done when: you know what to check first and who must act when fulfillment fails.</w:t>
+        <w:t xml:space="preserve"> Create a basic response path for: an invalid or incomplete address; a product unavailable; a variant unavailable; a production payment failure; a provider rejection; a production delay; a lost package; a damaged product; an incorrect product; missing tracking; a split shipment; a digital-link failure; a customer who failed to provide commission details; an order routed to the wrong location; a duplicate fulfillment action; and other. Do not promise a particular refund, reprint, or replacement outcome — policies governing refunds, returns, replacements, and cancellations are handled in Chapter 10. Why it matters: a defined exception process helps the merchant respond consistently when fulfillment problems occur. Done when: you know what to check first and who must act when fulfillment fails.</w:t>
       </w:r>
     </w:p>
     <w:p>

</xml_diff>

<commit_message>
docs: neutralize remaining Chapter 7 outcome claims
Co-Authored-By: Claude Opus 4.8 <noreply@anthropic.com>
</commit_message>
<xml_diff>
--- a/docs/guides/shopify/Build-Your-First-Shopify-Store-DRAFT.docx
+++ b/docs/guides/shopify/Build-Your-First-Shopify-Store-DRAFT.docx
@@ -18014,7 +18014,7 @@
         <w:t xml:space="preserve">Map responsibility before configuring anything.</w:t>
       </w:r>
       <w:r>
-        <w:t xml:space="preserve"> For each product, identify who is responsible for: production; inventory; quality control; packaging; shipping; digital delivery; scheduling; tracking; customer notification; delays; damage; reprints or replacements; refund decisions; return handling; and customer support. “The app handles it” is not a complete responsibility plan. Why it matters: unowned responsibilities become failed orders. Done when: every major fulfillment responsibility has an owner.</w:t>
+        <w:t xml:space="preserve"> For each product, identify who is responsible for: production; inventory; quality control; packaging; shipping; digital delivery; scheduling; tracking; customer notification; delays; damage; reprints or replacements; refund decisions; return handling; and customer support. “The app handles it” is not a complete responsibility plan. Why it matters: assigning an owner makes it clear who must act at each stage of fulfillment. Done when: every major fulfillment responsibility has an owner.</w:t>
       </w:r>
     </w:p>
     <w:p>
@@ -18080,7 +18080,7 @@
         <w:t xml:space="preserve">Decide how inventory will be tracked.</w:t>
       </w:r>
       <w:r>
-        <w:t xml:space="preserve"> Understand the difference between inventory physically owned and counted by you; inventory managed by a warehouse; inventory represented through a fulfillment app; print-on-demand products produced after purchase; and digital or service products that do not use physical stock the same way. Decide whether Shopify should track quantity, which location owns the quantity, whether selling after stock reaches zero is allowed, who updates inventory when stock changes, how handmade one-of-one items are handled, and how unavailable POD variants are handled. Do not configure product-level inventory yet — that is Chapter 8. Why it matters: the wrong inventory rule oversells or blocks sales. Done when: the inventory rule for each fulfillment path is documented.</w:t>
+        <w:t xml:space="preserve"> Understand the difference between inventory physically owned and counted by you; inventory managed by a warehouse; inventory represented through a fulfillment app; print-on-demand products produced after purchase; and digital or service products that do not use physical stock the same way. Decide whether Shopify should track quantity, which location owns the quantity, whether selling after stock reaches zero is allowed, who updates inventory when stock changes, how handmade one-of-one items are handled, and how unavailable POD variants are handled. Do not configure product-level inventory yet — that is Chapter 8. Why it matters: inventory rules affect whether products appear available and how quantities are updated. Done when: the inventory rule for each fulfillment path is documented.</w:t>
       </w:r>
     </w:p>
     <w:p>
@@ -18146,7 +18146,7 @@
         <w:t xml:space="preserve">Understand the Printify money flow.</w:t>
       </w:r>
       <w:r>
-        <w:t xml:space="preserve"> In order: (1) the customer pays your Shopify store; (2) Shopify and your payment provider process the customer payment; (3) the Shopify order is imported into Printify when the integration is operating correctly; (4) Printify submits the order per your approval settings; (5) Printify charges your linked payment method or Printify balance for production and shipping; (6) the Print Provider produces and ships the item; (7) tracking can sync back to Shopify when available. Shopify revenue does not automatically become Printify production funding; you need enough available funding to cover production; a customer payment and a Printify charge are separate transactions; a delayed or failed Printify payment can prevent production; and the exact timing and behavior must be reverified before publication. Do not quote production or shipping prices. Why it matters: running out of production funding stops orders. Done when: you can explain who charges whom and when.</w:t>
+        <w:t xml:space="preserve"> In order: (1) the customer pays your Shopify store; (2) Shopify and your payment provider process the customer payment; (3) the Shopify order is imported into Printify when the integration is operating correctly; (4) Printify submits the order per your approval settings; (5) Printify charges your linked payment method or Printify balance for production and shipping; (6) the Print Provider produces and ships the item; (7) tracking can sync back to Shopify when available. Shopify revenue does not automatically become Printify production funding; you need enough available funding to cover production; a customer payment and a Printify charge are separate transactions; a delayed or failed Printify payment can prevent production; and the exact timing and behavior must be reverified before publication. Do not quote production or shipping prices. Why it matters: insufficient production funding can prevent an order from being submitted or produced. Done when: you can explain who charges whom and when.</w:t>
       </w:r>
     </w:p>
     <w:p>
@@ -18179,7 +18179,7 @@
         <w:t xml:space="preserve">Choose Printify order-approval timing.</w:t>
       </w:r>
       <w:r>
-        <w:t xml:space="preserve"> Printify can provide manual or automatic order-submission behavior. Manual review is useful when products are customized, addresses need review, orders are high value, product availability changes, you want a correction window, or the workflow is new. Automatic submission is useful when products are standardized, the integration has been tested, funding is reliable, product and address data are stable, and you actively monitor exceptions. Once production begins, changes or cancellations might not be possible; exact approval choices and timing options can change; a Shopify fulfillment action can sometimes bypass or accelerate the expected Printify workflow; and you must understand the current integration behavior before enabling automation. Do not treat any default delay as a permanent fact. Why it matters: the wrong automation can send bad orders to production. Done when: you chose Manual or Automatic and recorded the reason.</w:t>
+        <w:t xml:space="preserve"> Printify can provide manual or automatic order-submission behavior. Manual review is useful when products are customized, addresses need review, orders are high value, product availability changes, you want a correction window, or the workflow is new. Automatic submission is useful when products are standardized, the integration has been tested, funding is reliable, product and address data are stable, and you actively monitor exceptions. Once production begins, changes or cancellations might not be possible; exact approval choices and timing options can change; a Shopify fulfillment action can sometimes bypass or accelerate the expected Printify workflow; and you must understand the current integration behavior before enabling automation. Do not treat any default delay as a permanent fact. Why it matters: automatic submission can send an order to production before the merchant has reviewed it. Done when: you chose Manual or Automatic and recorded the reason.</w:t>
       </w:r>
     </w:p>
     <w:p>
@@ -18225,7 +18225,7 @@
         <w:t xml:space="preserve">Review Printify order and tracking behavior.</w:t>
       </w:r>
       <w:r>
-        <w:t xml:space="preserve"> Monitor orders in both Shopify and Printify. Printify statuses can indicate waiting, production, issues, shipment, and delivery progress; tracking generally appears after shipment when the selected method supports it; multiple providers can create multiple shipments; some shipments may not include tracking; and a sync failure, canceled fulfillment request, product issue, address problem, payment problem, or stock issue can require manual action. Do not quote a guaranteed production or delivery time. Why it matters: unmonitored POD orders can fail silently. Done when: you know where to monitor a POD order and what requires attention.</w:t>
+        <w:t xml:space="preserve"> Monitor orders in both Shopify and Printify. Printify statuses can indicate waiting, production, issues, shipment, and delivery progress; tracking generally appears after shipment when the selected method supports it; multiple providers can create multiple shipments; some shipments may not include tracking; and a sync failure, canceled fulfillment request, product issue, address problem, payment problem, or stock issue can require manual action. Do not quote a guaranteed production or delivery time. Why it matters: monitoring helps the merchant identify payment, address, product, provider, or synchronization issues that require action. Done when: you know where to monitor a POD order and what requires attention.</w:t>
       </w:r>
     </w:p>
     <w:p>
@@ -18271,7 +18271,7 @@
         <w:t xml:space="preserve">Plan self-fulfilled physical orders.</w:t>
       </w:r>
       <w:r>
-        <w:t xml:space="preserve"> For products you make or stock, use a basic process: review the paid order; confirm item and quantity; check inventory; make or pick the item; perform quality control; package it; purchase or prepare the shipping label; ship or arrange pickup; add tracking where available; notify the customer; and record the order as fulfilled only when appropriate. Marking an order fulfilled does not physically ship it; tracking should correspond to the correct package; split shipments must be recorded accurately; and a product should not be marked fulfilled before the relevant fulfillment step is actually complete. Do not teach detailed label purchasing or carrier-rate selection. Why it matters: a consistent sequence prevents shipping mistakes. Done when: you have a written self-fulfillment sequence.</w:t>
+        <w:t xml:space="preserve"> For products you make or stock, use a basic process: review the paid order; confirm item and quantity; check inventory; make or pick the item; perform quality control; package it; purchase or prepare the shipping label; ship or arrange pickup; add tracking where available; notify the customer; and record the order as fulfilled only when appropriate. Marking an order fulfilled does not physically ship it; tracking should correspond to the correct package; split shipments must be recorded accurately; and a product should not be marked fulfilled before the relevant fulfillment step is actually complete. Do not teach detailed label purchasing or carrier-rate selection. Why it matters: a consistent sequence gives the merchant a repeatable way to review, prepare, ship, and record each order. Done when: you have a written self-fulfillment sequence.</w:t>
       </w:r>
     </w:p>
     <w:p>

</xml_diff>

<commit_message>
docs: clarify Chapter 8 review outcomes
Co-Authored-By: Claude Opus 4.8 <noreply@anthropic.com>
</commit_message>
<xml_diff>
--- a/docs/guides/shopify/Build-Your-First-Shopify-Store-DRAFT.docx
+++ b/docs/guides/shopify/Build-Your-First-Shopify-Store-DRAFT.docx
@@ -27014,7 +27014,7 @@
         <w:t xml:space="preserve">Review every variant individually.</w:t>
       </w:r>
       <w:r>
-        <w:t xml:space="preserve"> For each variant, review option values, price, compare-at price (if used), cost per item, SKU, barcode (if applicable), inventory tracking, quantity by location, continue-selling behavior, weight, physical-shipping requirement, country/region of origin (if relevant), HS code (if relevant and verified), fulfillment location or app, variant media, and sales-channel availability where supported. Do not enter invented customs information. Why it matters: reviewing each variant confirms it is correct rather than relying on copied defaults. Done when: every variant has been reviewed instead of relying blindly on copied defaults.</w:t>
+        <w:t xml:space="preserve"> For each variant, review option values, price, compare-at price (if used), cost per item, SKU, barcode (if applicable), inventory tracking, quantity by location, continue-selling behavior, weight, physical-shipping requirement, country/region of origin (if relevant), HS code (if relevant and verified), fulfillment location or app, variant media, and sales-channel availability where supported. Do not enter invented customs information. Why it matters: reviewing each variant helps identify copied defaults, inconsistent values, and fields that still need verification. Done when: every variant has been reviewed instead of relying blindly on copied defaults.</w:t>
       </w:r>
     </w:p>
     <w:p>
@@ -27370,7 +27370,7 @@
         <w:t xml:space="preserve">Choose product status.</w:t>
       </w:r>
       <w:r>
-        <w:t xml:space="preserve"> Current product-status options can include states such as Draft, Active, Archived, or other availability controls depending on Shopify’s current interface and workflow. New products should normally remain Draft while incomplete; Archived is for products retained in the admin but no longer offered; Active should be selected only after you have reviewed the product record and channel availability; an app-created product should not be made Active solely because the app created it; and a product status is not the same as complete launch readiness. Why it matters: status determines whether and where the product can appear. Done when: each product has a deliberate status.</w:t>
+        <w:t xml:space="preserve"> Current product-status options can include states such as Draft, Active, Archived, or other availability controls depending on Shopify’s current interface and workflow. New products should normally remain Draft while incomplete; Archived is for products retained in the admin but no longer offered; Active should be selected only after you have reviewed the product record and channel availability; an app-created product should not be made Active solely because the app created it; and a product status is not the same as complete launch readiness. Why it matters: product status is one control that affects whether the product can appear, while channel availability affects where it can appear. Done when: each product has a deliberate status.</w:t>
       </w:r>
     </w:p>
     <w:p>
@@ -27449,7 +27449,7 @@
         <w:t xml:space="preserve">Save and review the product record.</w:t>
       </w:r>
       <w:r>
-        <w:t xml:space="preserve"> Save and inspect the product in the Shopify admin, checking title, description, media order, alt text, price, cost, compare-at price, variants, SKU, barcode, inventory, location, shipping requirement, weight, origin/HS information, fulfillment assignment, category, product type, vendor, tags, search listing, status, and channel availability. Saved changes can affect storefront display and reporting. Why it matters: this confirms the admin record is internally consistent. Done when: the admin record contains no obvious blanks, copied errors, contradictory settings, or unsupported claims.</w:t>
+        <w:t xml:space="preserve"> Save and inspect the product in the Shopify admin, checking title, description, media order, alt text, price, cost, compare-at price, variants, SKU, barcode, inventory, location, shipping requirement, weight, origin/HS information, fulfillment assignment, category, product type, vendor, tags, search listing, status, and channel availability. Saved changes can affect storefront display and reporting. Why it matters: reviewing the saved record helps identify blanks, copied errors, contradictory settings, and unsupported claims. Done when: the admin record contains no obvious blanks, copied errors, contradictory settings, or unsupported claims.</w:t>
       </w:r>
     </w:p>
     <w:p>
@@ -27535,7 +27535,7 @@
         <w:t xml:space="preserve">Record blockers instead of publishing incomplete products.</w:t>
       </w:r>
       <w:r>
-        <w:t xml:space="preserve"> Create a blocker list for issues such as a missing product photograph, an unreviewed mockup, missing alt text, unverified description facts, unknown material/dimensions, an undecided price, unknown cost, an incomplete variant, a SKU conflict, a barcode question, an unknown inventory quantity, an uncertain location assignment, an unknown weight, an unknown origin, a pending HS code, an unconnected fulfillment app, an unsynchronized POD product, a missing digital-delivery app, missing commission instructions, an uncertain status, uncertain channel availability, and other. A product with a material blocker should remain Draft; Draft status is an appropriate working state; and do not invent missing facts merely to complete the record. Why it matters: recording blockers keeps incomplete products in Draft and records what remains. Done when: every unresolved issue has an owner or next action.</w:t>
+        <w:t xml:space="preserve"> Create a blocker list for issues such as a missing product photograph, an unreviewed mockup, missing alt text, unverified description facts, unknown material/dimensions, an undecided price, unknown cost, an incomplete variant, a SKU conflict, a barcode question, an unknown inventory quantity, an uncertain location assignment, an unknown weight, an unknown origin, a pending HS code, an unconnected fulfillment app, an unsynchronized POD product, a missing digital-delivery app, missing commission instructions, an uncertain status, uncertain channel availability, and other. A product with a material blocker should remain Draft; Draft status is an appropriate working state; and do not invent missing facts merely to complete the record. Why it matters: recording blockers identifies which products should remain in Draft and what action is still required. Done when: every unresolved issue has an owner or next action.</w:t>
       </w:r>
     </w:p>
     <w:p>

</xml_diff>

<commit_message>
docs: clarify Chapter 9 organization outcomes
Co-Authored-By: Claude Opus 4.8 <noreply@anthropic.com>
</commit_message>
<xml_diff>
--- a/docs/guides/shopify/Build-Your-First-Shopify-Store-DRAFT.docx
+++ b/docs/guides/shopify/Build-Your-First-Shopify-Store-DRAFT.docx
@@ -35944,7 +35944,7 @@
         <w:spacing w:after="140" w:line="276"/>
       </w:pPr>
       <w:r>
-        <w:t xml:space="preserve">Chapter 8 created accurate product records; this chapter organizes them so a customer can find them. Collections group products for browsing, and menus connect those groups to the storefront. Doing this in a small, deliberate way — rather than creating many collections and links first — helps the merchant present a catalog a customer can understand.</w:t>
+        <w:t xml:space="preserve">Chapter 8 created reviewed product records; this chapter organizes them into browseable groups and connects those groups to storefront navigation. Collections group products, while menus provide links to those groups and other destinations. Building a small, deliberate structure helps the merchant reduce duplicate, vague, and unnecessary collection or navigation choices.</w:t>
       </w:r>
     </w:p>
     <w:p>
@@ -35973,7 +35973,7 @@
         <w:t xml:space="preserve">Review the starting product set.</w:t>
       </w:r>
       <w:r>
-        <w:t xml:space="preserve"> Return to Chapter 8 and list the one-to-five starting products, recording for each: product title, product type, fulfillment method, intended customer, whether it belongs with other products, whether it needs a direct menu link, and whether it should remain Draft. Do not organize products that contain unresolved material blockers as though they are ready for public navigation. Why it matters: this helps the merchant work only with products that are ready to organize. Done when: you have a current list of products eligible for organization.</w:t>
+        <w:t xml:space="preserve"> Return to Chapter 8 and list the one-to-five starting products, recording for each: product title, product type, fulfillment method, intended customer, whether it belongs with other products, whether it needs a direct menu link, and whether it should remain Draft. Do not organize products that contain unresolved material blockers as though they are ready for public navigation. Why it matters: this helps identify which products are eligible for organization and which products still have material blockers. Done when: you have a current list of products eligible for organization.</w:t>
       </w:r>
     </w:p>
     <w:p>
@@ -36297,7 +36297,7 @@
         <w:t xml:space="preserve">Review whole-product versus variant behavior.</w:t>
       </w:r>
       <w:r>
-        <w:t xml:space="preserve"> Collections contain products, not separately selected variants; a condition that matches one variant can cause the entire product to appear; collection cards might show the product generally rather than the exact matching variant; the theme might select featured product media rather than matching-variant media; and inventory conditions can behave according to whether any supported variant matches. Why it matters: this makes clear what a customer sees when a variant causes product inclusion. Done when: you understand what the customer will see when a variant causes product inclusion.</w:t>
+        <w:t xml:space="preserve"> Collections contain products, not separately selected variants; a condition that matches one variant can cause the entire product to appear; collection cards might show the product generally rather than the exact matching variant; the theme might select featured product media rather than matching-variant media; and inventory conditions can behave according to whether any supported variant matches. Why it matters: this helps identify how variant-based matching and theme behavior can affect what appears in a collection. Done when: you have reviewed how a matching variant affects whole-product inclusion and recorded any uncertainty about collection-card media or theme display.</w:t>
       </w:r>
     </w:p>
     <w:p>

</xml_diff>